<commit_message>
PatternRender complete without GUI
Start Indicator
</commit_message>
<xml_diff>
--- a/Experts/Anhnt/Document/Indicator/Indicator Strategy.docx
+++ b/Experts/Anhnt/Document/Indicator/Indicator Strategy.docx
@@ -1388,24 +1388,1404 @@
         <w:pStyle w:val="Heading1"/>
       </w:pPr>
       <w:r>
+        <w:lastRenderedPageBreak/>
         <w:t>ATR</w:t>
       </w:r>
     </w:p>
     <w:p>
       <w:pPr>
-        <w:rPr>
-          <w:rFonts w:ascii="Times New Roman" w:hAnsi="Times New Roman" w:cs="Times New Roman"/>
-          <w:sz w:val="28"/>
-          <w:szCs w:val="28"/>
-        </w:rPr>
-      </w:pPr>
-    </w:p>
-    <w:p>
-      <w:pPr>
         <w:pStyle w:val="Heading2"/>
       </w:pPr>
       <w:r>
-        <w:lastRenderedPageBreak/>
+        <w:t>The Average True Range (ATR) Formula</w:t>
+      </w:r>
+    </w:p>
+    <w:p>
+      <w:r>
+        <w:t>The formula to calculate ATR for an investment with a previous ATR calculation is:</w:t>
+      </w:r>
+    </w:p>
+    <w:p>
+      <m:oMathPara>
+        <m:oMath>
+          <m:m>
+            <m:mPr>
+              <m:plcHide m:val="1"/>
+              <m:mcs>
+                <m:mc>
+                  <m:mcPr>
+                    <m:count m:val="2"/>
+                    <m:mcJc m:val="center"/>
+                  </m:mcPr>
+                </m:mc>
+              </m:mcs>
+              <m:ctrlPr>
+                <w:rPr>
+                  <w:rFonts w:ascii="Cambria Math" w:hAnsi="Cambria Math"/>
+                </w:rPr>
+              </m:ctrlPr>
+            </m:mPr>
+            <m:mr>
+              <m:e/>
+              <m:e>
+                <m:f>
+                  <m:fPr>
+                    <m:ctrlPr>
+                      <w:rPr>
+                        <w:rFonts w:ascii="Cambria Math" w:hAnsi="Cambria Math"/>
+                      </w:rPr>
+                    </m:ctrlPr>
+                  </m:fPr>
+                  <m:num>
+                    <m:r>
+                      <m:rPr>
+                        <m:nor/>
+                      </m:rPr>
+                      <m:t>Previous ATR</m:t>
+                    </m:r>
+                    <m:r>
+                      <w:rPr>
+                        <w:rFonts w:ascii="Cambria Math" w:hAnsi="Cambria Math"/>
+                      </w:rPr>
+                      <m:t>(n-1)+</m:t>
+                    </m:r>
+                    <m:r>
+                      <m:rPr>
+                        <m:nor/>
+                      </m:rPr>
+                      <m:t>TR</m:t>
+                    </m:r>
+                  </m:num>
+                  <m:den>
+                    <m:r>
+                      <w:rPr>
+                        <w:rFonts w:ascii="Cambria Math" w:hAnsi="Cambria Math"/>
+                      </w:rPr>
+                      <m:t>n</m:t>
+                    </m:r>
+                  </m:den>
+                </m:f>
+              </m:e>
+            </m:mr>
+            <m:mr>
+              <m:e/>
+              <m:e>
+                <m:r>
+                  <m:rPr>
+                    <m:nor/>
+                  </m:rPr>
+                  <m:t>where:</m:t>
+                </m:r>
+              </m:e>
+            </m:mr>
+            <m:mr>
+              <m:e/>
+              <m:e>
+                <m:r>
+                  <w:rPr>
+                    <w:rFonts w:ascii="Cambria Math" w:hAnsi="Cambria Math"/>
+                  </w:rPr>
+                  <m:t>n=</m:t>
+                </m:r>
+                <m:r>
+                  <m:rPr>
+                    <m:nor/>
+                  </m:rPr>
+                  <m:t>Number of periods</m:t>
+                </m:r>
+              </m:e>
+            </m:mr>
+            <m:mr>
+              <m:e/>
+              <m:e>
+                <m:r>
+                  <m:rPr>
+                    <m:nor/>
+                  </m:rPr>
+                  <m:t>TR</m:t>
+                </m:r>
+                <m:r>
+                  <w:rPr>
+                    <w:rFonts w:ascii="Cambria Math" w:hAnsi="Cambria Math"/>
+                  </w:rPr>
+                  <m:t>=</m:t>
+                </m:r>
+                <m:r>
+                  <m:rPr>
+                    <m:nor/>
+                  </m:rPr>
+                  <m:t>True range</m:t>
+                </m:r>
+              </m:e>
+            </m:mr>
+          </m:m>
+        </m:oMath>
+      </m:oMathPara>
+    </w:p>
+    <w:p>
+      <w:r>
+        <w:t>If there is not a previous ATR calculated, you must use:</w:t>
+      </w:r>
+    </w:p>
+    <w:p>
+      <m:oMathPara>
+        <m:oMath>
+          <m:m>
+            <m:mPr>
+              <m:plcHide m:val="1"/>
+              <m:mcs>
+                <m:mc>
+                  <m:mcPr>
+                    <m:count m:val="2"/>
+                    <m:mcJc m:val="center"/>
+                  </m:mcPr>
+                </m:mc>
+              </m:mcs>
+              <m:ctrlPr>
+                <w:rPr>
+                  <w:rFonts w:ascii="Cambria Math" w:hAnsi="Cambria Math"/>
+                </w:rPr>
+              </m:ctrlPr>
+            </m:mPr>
+            <m:mr>
+              <m:e/>
+              <m:e>
+                <m:r>
+                  <w:rPr>
+                    <w:rFonts w:ascii="Cambria Math" w:hAnsi="Cambria Math"/>
+                  </w:rPr>
+                  <m:t>(</m:t>
+                </m:r>
+                <m:f>
+                  <m:fPr>
+                    <m:ctrlPr>
+                      <w:rPr>
+                        <w:rFonts w:ascii="Cambria Math" w:hAnsi="Cambria Math"/>
+                      </w:rPr>
+                    </m:ctrlPr>
+                  </m:fPr>
+                  <m:num>
+                    <m:r>
+                      <w:rPr>
+                        <w:rFonts w:ascii="Cambria Math" w:hAnsi="Cambria Math"/>
+                      </w:rPr>
+                      <m:t>1</m:t>
+                    </m:r>
+                  </m:num>
+                  <m:den>
+                    <m:r>
+                      <w:rPr>
+                        <w:rFonts w:ascii="Cambria Math" w:hAnsi="Cambria Math"/>
+                      </w:rPr>
+                      <m:t>n</m:t>
+                    </m:r>
+                  </m:den>
+                </m:f>
+                <m:r>
+                  <w:rPr>
+                    <w:rFonts w:ascii="Cambria Math" w:hAnsi="Cambria Math"/>
+                  </w:rPr>
+                  <m:t>)</m:t>
+                </m:r>
+                <m:nary>
+                  <m:naryPr>
+                    <m:chr m:val="∑"/>
+                    <m:limLoc m:val="undOvr"/>
+                    <m:grow m:val="1"/>
+                    <m:ctrlPr>
+                      <w:rPr>
+                        <w:rFonts w:ascii="Cambria Math" w:hAnsi="Cambria Math"/>
+                      </w:rPr>
+                    </m:ctrlPr>
+                  </m:naryPr>
+                  <m:sub>
+                    <m:r>
+                      <w:rPr>
+                        <w:rFonts w:ascii="Cambria Math" w:hAnsi="Cambria Math"/>
+                      </w:rPr>
+                      <m:t>i</m:t>
+                    </m:r>
+                  </m:sub>
+                  <m:sup>
+                    <m:r>
+                      <w:rPr>
+                        <w:rFonts w:ascii="Cambria Math" w:hAnsi="Cambria Math"/>
+                      </w:rPr>
+                      <m:t>n</m:t>
+                    </m:r>
+                  </m:sup>
+                  <m:e>
+                    <m:sSub>
+                      <m:sSubPr>
+                        <m:ctrlPr>
+                          <w:rPr>
+                            <w:rFonts w:ascii="Cambria Math" w:hAnsi="Cambria Math"/>
+                          </w:rPr>
+                        </m:ctrlPr>
+                      </m:sSubPr>
+                      <m:e>
+                        <m:r>
+                          <m:rPr>
+                            <m:nor/>
+                          </m:rPr>
+                          <m:t>TR</m:t>
+                        </m:r>
+                      </m:e>
+                      <m:sub>
+                        <m:r>
+                          <w:rPr>
+                            <w:rFonts w:ascii="Cambria Math" w:hAnsi="Cambria Math"/>
+                          </w:rPr>
+                          <m:t>i</m:t>
+                        </m:r>
+                      </m:sub>
+                    </m:sSub>
+                  </m:e>
+                </m:nary>
+              </m:e>
+            </m:mr>
+            <m:mr>
+              <m:e/>
+              <m:e>
+                <m:r>
+                  <m:rPr>
+                    <m:nor/>
+                  </m:rPr>
+                  <m:t>where:</m:t>
+                </m:r>
+              </m:e>
+            </m:mr>
+            <m:mr>
+              <m:e/>
+              <m:e>
+                <m:sSub>
+                  <m:sSubPr>
+                    <m:ctrlPr>
+                      <w:rPr>
+                        <w:rFonts w:ascii="Cambria Math" w:hAnsi="Cambria Math"/>
+                      </w:rPr>
+                    </m:ctrlPr>
+                  </m:sSubPr>
+                  <m:e>
+                    <m:r>
+                      <m:rPr>
+                        <m:nor/>
+                      </m:rPr>
+                      <m:t>TR</m:t>
+                    </m:r>
+                  </m:e>
+                  <m:sub>
+                    <m:r>
+                      <w:rPr>
+                        <w:rFonts w:ascii="Cambria Math" w:hAnsi="Cambria Math"/>
+                      </w:rPr>
+                      <m:t>i</m:t>
+                    </m:r>
+                  </m:sub>
+                </m:sSub>
+                <m:r>
+                  <w:rPr>
+                    <w:rFonts w:ascii="Cambria Math" w:hAnsi="Cambria Math"/>
+                  </w:rPr>
+                  <m:t>=</m:t>
+                </m:r>
+                <m:r>
+                  <m:rPr>
+                    <m:nor/>
+                  </m:rPr>
+                  <m:t>Particular true range, such as first day’s TR,</m:t>
+                </m:r>
+              </m:e>
+            </m:mr>
+            <m:mr>
+              <m:e/>
+              <m:e>
+                <m:r>
+                  <m:rPr>
+                    <m:nor/>
+                  </m:rPr>
+                  <m:t>then second, then third</m:t>
+                </m:r>
+              </m:e>
+            </m:mr>
+            <m:mr>
+              <m:e/>
+              <m:e>
+                <m:r>
+                  <w:rPr>
+                    <w:rFonts w:ascii="Cambria Math" w:hAnsi="Cambria Math"/>
+                  </w:rPr>
+                  <m:t>n=</m:t>
+                </m:r>
+                <m:r>
+                  <m:rPr>
+                    <m:nor/>
+                  </m:rPr>
+                  <m:t>Number of periods</m:t>
+                </m:r>
+              </m:e>
+            </m:mr>
+          </m:m>
+        </m:oMath>
+      </m:oMathPara>
+    </w:p>
+    <w:p/>
+    <w:p>
+      <w:pPr>
+        <w:rPr>
+          <w:rFonts w:ascii="Times New Roman" w:hAnsi="Times New Roman" w:cs="Times New Roman"/>
+          <w:sz w:val="28"/>
+          <w:szCs w:val="28"/>
+        </w:rPr>
+      </w:pPr>
+      <w:r>
+        <w:rPr>
+          <w:rFonts w:ascii="Times New Roman" w:hAnsi="Times New Roman" w:cs="Times New Roman"/>
+          <w:sz w:val="28"/>
+          <w:szCs w:val="28"/>
+        </w:rPr>
+        <w:t>You must first use the following formula to calculate the true range:</w:t>
+      </w:r>
+      <w:r>
+        <w:rPr>
+          <w:rFonts w:ascii="Times New Roman" w:hAnsi="Times New Roman" w:cs="Times New Roman"/>
+          <w:sz w:val="28"/>
+          <w:szCs w:val="28"/>
+          <w:vertAlign w:val="superscript"/>
+        </w:rPr>
+        <w:t>2</w:t>
+      </w:r>
+    </w:p>
+    <w:p>
+      <w:pPr>
+        <w:rPr>
+          <w:rFonts w:ascii="Times New Roman" w:hAnsi="Times New Roman" w:cs="Times New Roman"/>
+          <w:sz w:val="28"/>
+          <w:szCs w:val="28"/>
+        </w:rPr>
+      </w:pPr>
+      <m:oMathPara>
+        <m:oMath>
+          <m:m>
+            <m:mPr>
+              <m:plcHide m:val="1"/>
+              <m:mcs>
+                <m:mc>
+                  <m:mcPr>
+                    <m:count m:val="2"/>
+                    <m:mcJc m:val="center"/>
+                  </m:mcPr>
+                </m:mc>
+              </m:mcs>
+              <m:ctrlPr>
+                <w:rPr>
+                  <w:rFonts w:ascii="Cambria Math" w:hAnsi="Cambria Math" w:cs="Times New Roman"/>
+                  <w:sz w:val="28"/>
+                  <w:szCs w:val="28"/>
+                </w:rPr>
+              </m:ctrlPr>
+            </m:mPr>
+            <m:mr>
+              <m:e/>
+              <m:e>
+                <m:r>
+                  <m:rPr>
+                    <m:nor/>
+                  </m:rPr>
+                  <w:rPr>
+                    <w:rFonts w:ascii="Times New Roman" w:hAnsi="Times New Roman" w:cs="Times New Roman"/>
+                    <w:sz w:val="28"/>
+                    <w:szCs w:val="28"/>
+                  </w:rPr>
+                  <m:t> TR </m:t>
+                </m:r>
+                <m:r>
+                  <w:rPr>
+                    <w:rFonts w:ascii="Cambria Math" w:hAnsi="Cambria Math" w:cs="Times New Roman"/>
+                    <w:sz w:val="28"/>
+                    <w:szCs w:val="28"/>
+                  </w:rPr>
+                  <m:t>=</m:t>
+                </m:r>
+                <m:r>
+                  <m:rPr>
+                    <m:nor/>
+                  </m:rPr>
+                  <w:rPr>
+                    <w:rFonts w:ascii="Times New Roman" w:hAnsi="Times New Roman" w:cs="Times New Roman"/>
+                    <w:sz w:val="28"/>
+                    <w:szCs w:val="28"/>
+                  </w:rPr>
+                  <m:t> Max </m:t>
+                </m:r>
+                <m:r>
+                  <w:rPr>
+                    <w:rFonts w:ascii="Cambria Math" w:hAnsi="Cambria Math" w:cs="Times New Roman"/>
+                    <w:sz w:val="28"/>
+                    <w:szCs w:val="28"/>
+                  </w:rPr>
+                  <m:t>[(</m:t>
+                </m:r>
+                <m:r>
+                  <m:rPr>
+                    <m:nor/>
+                  </m:rPr>
+                  <w:rPr>
+                    <w:rFonts w:ascii="Times New Roman" w:hAnsi="Times New Roman" w:cs="Times New Roman"/>
+                    <w:sz w:val="28"/>
+                    <w:szCs w:val="28"/>
+                  </w:rPr>
+                  <m:t>H</m:t>
+                </m:r>
+                <m:r>
+                  <w:rPr>
+                    <w:rFonts w:ascii="Cambria Math" w:hAnsi="Cambria Math" w:cs="Times New Roman"/>
+                    <w:sz w:val="28"/>
+                    <w:szCs w:val="28"/>
+                  </w:rPr>
+                  <m:t>-</m:t>
+                </m:r>
+                <m:r>
+                  <m:rPr>
+                    <m:nor/>
+                  </m:rPr>
+                  <w:rPr>
+                    <w:rFonts w:ascii="Times New Roman" w:hAnsi="Times New Roman" w:cs="Times New Roman"/>
+                    <w:sz w:val="28"/>
+                    <w:szCs w:val="28"/>
+                  </w:rPr>
+                  <m:t>L</m:t>
+                </m:r>
+                <m:r>
+                  <w:rPr>
+                    <w:rFonts w:ascii="Cambria Math" w:hAnsi="Cambria Math" w:cs="Times New Roman"/>
+                    <w:sz w:val="28"/>
+                    <w:szCs w:val="28"/>
+                  </w:rPr>
+                  <m:t>),</m:t>
+                </m:r>
+                <m:r>
+                  <m:rPr>
+                    <m:sty m:val="p"/>
+                  </m:rPr>
+                  <w:rPr>
+                    <w:rFonts w:ascii="Cambria Math" w:hAnsi="Cambria Math" w:cs="Times New Roman"/>
+                    <w:sz w:val="28"/>
+                    <w:szCs w:val="28"/>
+                  </w:rPr>
+                  <m:t>∣</m:t>
+                </m:r>
+                <m:r>
+                  <m:rPr>
+                    <m:nor/>
+                  </m:rPr>
+                  <w:rPr>
+                    <w:rFonts w:ascii="Times New Roman" w:hAnsi="Times New Roman" w:cs="Times New Roman"/>
+                    <w:sz w:val="28"/>
+                    <w:szCs w:val="28"/>
+                  </w:rPr>
+                  <m:t>H</m:t>
+                </m:r>
+                <m:r>
+                  <w:rPr>
+                    <w:rFonts w:ascii="Cambria Math" w:hAnsi="Cambria Math" w:cs="Times New Roman"/>
+                    <w:sz w:val="28"/>
+                    <w:szCs w:val="28"/>
+                  </w:rPr>
+                  <m:t>-</m:t>
+                </m:r>
+                <m:sSub>
+                  <m:sSubPr>
+                    <m:ctrlPr>
+                      <w:rPr>
+                        <w:rFonts w:ascii="Cambria Math" w:hAnsi="Cambria Math" w:cs="Times New Roman"/>
+                        <w:sz w:val="28"/>
+                        <w:szCs w:val="28"/>
+                      </w:rPr>
+                    </m:ctrlPr>
+                  </m:sSubPr>
+                  <m:e>
+                    <m:r>
+                      <m:rPr>
+                        <m:nor/>
+                      </m:rPr>
+                      <w:rPr>
+                        <w:rFonts w:ascii="Times New Roman" w:hAnsi="Times New Roman" w:cs="Times New Roman"/>
+                        <w:sz w:val="28"/>
+                        <w:szCs w:val="28"/>
+                      </w:rPr>
+                      <m:t>C</m:t>
+                    </m:r>
+                  </m:e>
+                  <m:sub>
+                    <m:r>
+                      <w:rPr>
+                        <w:rFonts w:ascii="Cambria Math" w:hAnsi="Cambria Math" w:cs="Times New Roman"/>
+                        <w:sz w:val="28"/>
+                        <w:szCs w:val="28"/>
+                      </w:rPr>
+                      <m:t>p</m:t>
+                    </m:r>
+                  </m:sub>
+                </m:sSub>
+                <m:r>
+                  <m:rPr>
+                    <m:sty m:val="p"/>
+                  </m:rPr>
+                  <w:rPr>
+                    <w:rFonts w:ascii="Cambria Math" w:hAnsi="Cambria Math" w:cs="Times New Roman"/>
+                    <w:sz w:val="28"/>
+                    <w:szCs w:val="28"/>
+                  </w:rPr>
+                  <m:t>∣</m:t>
+                </m:r>
+                <m:r>
+                  <w:rPr>
+                    <w:rFonts w:ascii="Cambria Math" w:hAnsi="Cambria Math" w:cs="Times New Roman"/>
+                    <w:sz w:val="28"/>
+                    <w:szCs w:val="28"/>
+                  </w:rPr>
+                  <m:t>,</m:t>
+                </m:r>
+                <m:r>
+                  <m:rPr>
+                    <m:sty m:val="p"/>
+                  </m:rPr>
+                  <w:rPr>
+                    <w:rFonts w:ascii="Cambria Math" w:hAnsi="Cambria Math" w:cs="Times New Roman"/>
+                    <w:sz w:val="28"/>
+                    <w:szCs w:val="28"/>
+                  </w:rPr>
+                  <m:t>∣</m:t>
+                </m:r>
+                <m:r>
+                  <m:rPr>
+                    <m:nor/>
+                  </m:rPr>
+                  <w:rPr>
+                    <w:rFonts w:ascii="Times New Roman" w:hAnsi="Times New Roman" w:cs="Times New Roman"/>
+                    <w:sz w:val="28"/>
+                    <w:szCs w:val="28"/>
+                  </w:rPr>
+                  <m:t>L</m:t>
+                </m:r>
+                <m:r>
+                  <w:rPr>
+                    <w:rFonts w:ascii="Cambria Math" w:hAnsi="Cambria Math" w:cs="Times New Roman"/>
+                    <w:sz w:val="28"/>
+                    <w:szCs w:val="28"/>
+                  </w:rPr>
+                  <m:t>-</m:t>
+                </m:r>
+                <m:sSub>
+                  <m:sSubPr>
+                    <m:ctrlPr>
+                      <w:rPr>
+                        <w:rFonts w:ascii="Cambria Math" w:hAnsi="Cambria Math" w:cs="Times New Roman"/>
+                        <w:sz w:val="28"/>
+                        <w:szCs w:val="28"/>
+                      </w:rPr>
+                    </m:ctrlPr>
+                  </m:sSubPr>
+                  <m:e>
+                    <m:r>
+                      <m:rPr>
+                        <m:nor/>
+                      </m:rPr>
+                      <w:rPr>
+                        <w:rFonts w:ascii="Times New Roman" w:hAnsi="Times New Roman" w:cs="Times New Roman"/>
+                        <w:sz w:val="28"/>
+                        <w:szCs w:val="28"/>
+                      </w:rPr>
+                      <m:t>C</m:t>
+                    </m:r>
+                  </m:e>
+                  <m:sub>
+                    <m:r>
+                      <w:rPr>
+                        <w:rFonts w:ascii="Cambria Math" w:hAnsi="Cambria Math" w:cs="Times New Roman"/>
+                        <w:sz w:val="28"/>
+                        <w:szCs w:val="28"/>
+                      </w:rPr>
+                      <m:t>p</m:t>
+                    </m:r>
+                  </m:sub>
+                </m:sSub>
+                <m:r>
+                  <m:rPr>
+                    <m:sty m:val="p"/>
+                  </m:rPr>
+                  <w:rPr>
+                    <w:rFonts w:ascii="Cambria Math" w:hAnsi="Cambria Math" w:cs="Times New Roman"/>
+                    <w:sz w:val="28"/>
+                    <w:szCs w:val="28"/>
+                  </w:rPr>
+                  <m:t>∣</m:t>
+                </m:r>
+                <m:r>
+                  <w:rPr>
+                    <w:rFonts w:ascii="Cambria Math" w:hAnsi="Cambria Math" w:cs="Times New Roman"/>
+                    <w:sz w:val="28"/>
+                    <w:szCs w:val="28"/>
+                  </w:rPr>
+                  <m:t>]</m:t>
+                </m:r>
+              </m:e>
+            </m:mr>
+            <m:mr>
+              <m:e/>
+              <m:e>
+                <m:r>
+                  <m:rPr>
+                    <m:nor/>
+                  </m:rPr>
+                  <w:rPr>
+                    <w:rFonts w:ascii="Times New Roman" w:hAnsi="Times New Roman" w:cs="Times New Roman"/>
+                    <w:sz w:val="28"/>
+                    <w:szCs w:val="28"/>
+                  </w:rPr>
+                  <m:t>where:</m:t>
+                </m:r>
+              </m:e>
+            </m:mr>
+            <m:mr>
+              <m:e/>
+              <m:e>
+                <m:r>
+                  <m:rPr>
+                    <m:nor/>
+                  </m:rPr>
+                  <w:rPr>
+                    <w:rFonts w:ascii="Times New Roman" w:hAnsi="Times New Roman" w:cs="Times New Roman"/>
+                    <w:sz w:val="28"/>
+                    <w:szCs w:val="28"/>
+                  </w:rPr>
+                  <m:t>H</m:t>
+                </m:r>
+                <m:r>
+                  <w:rPr>
+                    <w:rFonts w:ascii="Cambria Math" w:hAnsi="Cambria Math" w:cs="Times New Roman"/>
+                    <w:sz w:val="28"/>
+                    <w:szCs w:val="28"/>
+                  </w:rPr>
+                  <m:t>=</m:t>
+                </m:r>
+                <m:r>
+                  <m:rPr>
+                    <m:nor/>
+                  </m:rPr>
+                  <w:rPr>
+                    <w:rFonts w:ascii="Times New Roman" w:hAnsi="Times New Roman" w:cs="Times New Roman"/>
+                    <w:sz w:val="28"/>
+                    <w:szCs w:val="28"/>
+                  </w:rPr>
+                  <m:t>Today’s high</m:t>
+                </m:r>
+              </m:e>
+            </m:mr>
+            <m:mr>
+              <m:e/>
+              <m:e>
+                <m:r>
+                  <m:rPr>
+                    <m:nor/>
+                  </m:rPr>
+                  <w:rPr>
+                    <w:rFonts w:ascii="Times New Roman" w:hAnsi="Times New Roman" w:cs="Times New Roman"/>
+                    <w:sz w:val="28"/>
+                    <w:szCs w:val="28"/>
+                  </w:rPr>
+                  <m:t>L</m:t>
+                </m:r>
+                <m:r>
+                  <w:rPr>
+                    <w:rFonts w:ascii="Cambria Math" w:hAnsi="Cambria Math" w:cs="Times New Roman"/>
+                    <w:sz w:val="28"/>
+                    <w:szCs w:val="28"/>
+                  </w:rPr>
+                  <m:t>=</m:t>
+                </m:r>
+                <m:r>
+                  <m:rPr>
+                    <m:nor/>
+                  </m:rPr>
+                  <w:rPr>
+                    <w:rFonts w:ascii="Times New Roman" w:hAnsi="Times New Roman" w:cs="Times New Roman"/>
+                    <w:sz w:val="28"/>
+                    <w:szCs w:val="28"/>
+                  </w:rPr>
+                  <m:t>Today’s low</m:t>
+                </m:r>
+              </m:e>
+            </m:mr>
+            <m:mr>
+              <m:e/>
+              <m:e>
+                <m:sSub>
+                  <m:sSubPr>
+                    <m:ctrlPr>
+                      <w:rPr>
+                        <w:rFonts w:ascii="Cambria Math" w:hAnsi="Cambria Math" w:cs="Times New Roman"/>
+                        <w:sz w:val="28"/>
+                        <w:szCs w:val="28"/>
+                      </w:rPr>
+                    </m:ctrlPr>
+                  </m:sSubPr>
+                  <m:e>
+                    <m:r>
+                      <m:rPr>
+                        <m:nor/>
+                      </m:rPr>
+                      <w:rPr>
+                        <w:rFonts w:ascii="Times New Roman" w:hAnsi="Times New Roman" w:cs="Times New Roman"/>
+                        <w:sz w:val="28"/>
+                        <w:szCs w:val="28"/>
+                      </w:rPr>
+                      <m:t>C</m:t>
+                    </m:r>
+                  </m:e>
+                  <m:sub>
+                    <m:r>
+                      <w:rPr>
+                        <w:rFonts w:ascii="Cambria Math" w:hAnsi="Cambria Math" w:cs="Times New Roman"/>
+                        <w:sz w:val="28"/>
+                        <w:szCs w:val="28"/>
+                      </w:rPr>
+                      <m:t>p</m:t>
+                    </m:r>
+                  </m:sub>
+                </m:sSub>
+                <m:r>
+                  <w:rPr>
+                    <w:rFonts w:ascii="Cambria Math" w:hAnsi="Cambria Math" w:cs="Times New Roman"/>
+                    <w:sz w:val="28"/>
+                    <w:szCs w:val="28"/>
+                  </w:rPr>
+                  <m:t>=</m:t>
+                </m:r>
+                <m:r>
+                  <m:rPr>
+                    <m:nor/>
+                  </m:rPr>
+                  <w:rPr>
+                    <w:rFonts w:ascii="Times New Roman" w:hAnsi="Times New Roman" w:cs="Times New Roman"/>
+                    <w:sz w:val="28"/>
+                    <w:szCs w:val="28"/>
+                  </w:rPr>
+                  <m:t>Yesterday’s closing price</m:t>
+                </m:r>
+              </m:e>
+            </m:mr>
+            <m:mr>
+              <m:e/>
+              <m:e>
+                <m:r>
+                  <m:rPr>
+                    <m:nor/>
+                  </m:rPr>
+                  <w:rPr>
+                    <w:rFonts w:ascii="Times New Roman" w:hAnsi="Times New Roman" w:cs="Times New Roman"/>
+                    <w:sz w:val="28"/>
+                    <w:szCs w:val="28"/>
+                  </w:rPr>
+                  <m:t>Max</m:t>
+                </m:r>
+                <m:r>
+                  <w:rPr>
+                    <w:rFonts w:ascii="Cambria Math" w:hAnsi="Cambria Math" w:cs="Times New Roman"/>
+                    <w:sz w:val="28"/>
+                    <w:szCs w:val="28"/>
+                  </w:rPr>
+                  <m:t>=</m:t>
+                </m:r>
+                <m:r>
+                  <m:rPr>
+                    <m:nor/>
+                  </m:rPr>
+                  <w:rPr>
+                    <w:rFonts w:ascii="Times New Roman" w:hAnsi="Times New Roman" w:cs="Times New Roman"/>
+                    <w:sz w:val="28"/>
+                    <w:szCs w:val="28"/>
+                  </w:rPr>
+                  <m:t>Highest value of the three terms</m:t>
+                </m:r>
+              </m:e>
+            </m:mr>
+            <m:mr>
+              <m:e/>
+              <m:e>
+                <m:r>
+                  <m:rPr>
+                    <m:nor/>
+                  </m:rPr>
+                  <w:rPr>
+                    <w:rFonts w:ascii="Times New Roman" w:hAnsi="Times New Roman" w:cs="Times New Roman"/>
+                    <w:sz w:val="28"/>
+                    <w:szCs w:val="28"/>
+                  </w:rPr>
+                  <m:t>so that:</m:t>
+                </m:r>
+              </m:e>
+            </m:mr>
+            <m:mr>
+              <m:e/>
+              <m:e>
+                <m:r>
+                  <w:rPr>
+                    <w:rFonts w:ascii="Cambria Math" w:hAnsi="Cambria Math" w:cs="Times New Roman"/>
+                    <w:sz w:val="28"/>
+                    <w:szCs w:val="28"/>
+                  </w:rPr>
+                  <m:t>(</m:t>
+                </m:r>
+                <m:r>
+                  <m:rPr>
+                    <m:nor/>
+                  </m:rPr>
+                  <w:rPr>
+                    <w:rFonts w:ascii="Times New Roman" w:hAnsi="Times New Roman" w:cs="Times New Roman"/>
+                    <w:sz w:val="28"/>
+                    <w:szCs w:val="28"/>
+                  </w:rPr>
+                  <m:t>H</m:t>
+                </m:r>
+                <m:r>
+                  <w:rPr>
+                    <w:rFonts w:ascii="Cambria Math" w:hAnsi="Cambria Math" w:cs="Times New Roman"/>
+                    <w:sz w:val="28"/>
+                    <w:szCs w:val="28"/>
+                  </w:rPr>
+                  <m:t>-</m:t>
+                </m:r>
+                <m:r>
+                  <m:rPr>
+                    <m:nor/>
+                  </m:rPr>
+                  <w:rPr>
+                    <w:rFonts w:ascii="Times New Roman" w:hAnsi="Times New Roman" w:cs="Times New Roman"/>
+                    <w:sz w:val="28"/>
+                    <w:szCs w:val="28"/>
+                  </w:rPr>
+                  <m:t>L</m:t>
+                </m:r>
+                <m:r>
+                  <w:rPr>
+                    <w:rFonts w:ascii="Cambria Math" w:hAnsi="Cambria Math" w:cs="Times New Roman"/>
+                    <w:sz w:val="28"/>
+                    <w:szCs w:val="28"/>
+                  </w:rPr>
+                  <m:t>)=</m:t>
+                </m:r>
+                <m:r>
+                  <m:rPr>
+                    <m:nor/>
+                  </m:rPr>
+                  <w:rPr>
+                    <w:rFonts w:ascii="Times New Roman" w:hAnsi="Times New Roman" w:cs="Times New Roman"/>
+                    <w:sz w:val="28"/>
+                    <w:szCs w:val="28"/>
+                  </w:rPr>
+                  <m:t>Today’s high minus the low</m:t>
+                </m:r>
+              </m:e>
+            </m:mr>
+            <m:mr>
+              <m:e/>
+              <m:e>
+                <m:r>
+                  <m:rPr>
+                    <m:sty m:val="p"/>
+                  </m:rPr>
+                  <w:rPr>
+                    <w:rFonts w:ascii="Cambria Math" w:hAnsi="Cambria Math" w:cs="Times New Roman"/>
+                    <w:sz w:val="28"/>
+                    <w:szCs w:val="28"/>
+                  </w:rPr>
+                  <m:t>∣</m:t>
+                </m:r>
+                <m:r>
+                  <m:rPr>
+                    <m:nor/>
+                  </m:rPr>
+                  <w:rPr>
+                    <w:rFonts w:ascii="Times New Roman" w:hAnsi="Times New Roman" w:cs="Times New Roman"/>
+                    <w:sz w:val="28"/>
+                    <w:szCs w:val="28"/>
+                  </w:rPr>
+                  <m:t>H</m:t>
+                </m:r>
+                <m:r>
+                  <w:rPr>
+                    <w:rFonts w:ascii="Cambria Math" w:hAnsi="Cambria Math" w:cs="Times New Roman"/>
+                    <w:sz w:val="28"/>
+                    <w:szCs w:val="28"/>
+                  </w:rPr>
+                  <m:t>-</m:t>
+                </m:r>
+                <m:sSub>
+                  <m:sSubPr>
+                    <m:ctrlPr>
+                      <w:rPr>
+                        <w:rFonts w:ascii="Cambria Math" w:hAnsi="Cambria Math" w:cs="Times New Roman"/>
+                        <w:sz w:val="28"/>
+                        <w:szCs w:val="28"/>
+                      </w:rPr>
+                    </m:ctrlPr>
+                  </m:sSubPr>
+                  <m:e>
+                    <m:r>
+                      <m:rPr>
+                        <m:nor/>
+                      </m:rPr>
+                      <w:rPr>
+                        <w:rFonts w:ascii="Times New Roman" w:hAnsi="Times New Roman" w:cs="Times New Roman"/>
+                        <w:sz w:val="28"/>
+                        <w:szCs w:val="28"/>
+                      </w:rPr>
+                      <m:t>C</m:t>
+                    </m:r>
+                  </m:e>
+                  <m:sub>
+                    <m:r>
+                      <w:rPr>
+                        <w:rFonts w:ascii="Cambria Math" w:hAnsi="Cambria Math" w:cs="Times New Roman"/>
+                        <w:sz w:val="28"/>
+                        <w:szCs w:val="28"/>
+                      </w:rPr>
+                      <m:t>p</m:t>
+                    </m:r>
+                  </m:sub>
+                </m:sSub>
+                <m:r>
+                  <m:rPr>
+                    <m:sty m:val="p"/>
+                  </m:rPr>
+                  <w:rPr>
+                    <w:rFonts w:ascii="Cambria Math" w:hAnsi="Cambria Math" w:cs="Times New Roman"/>
+                    <w:sz w:val="28"/>
+                    <w:szCs w:val="28"/>
+                  </w:rPr>
+                  <m:t>∣</m:t>
+                </m:r>
+                <m:r>
+                  <w:rPr>
+                    <w:rFonts w:ascii="Cambria Math" w:hAnsi="Cambria Math" w:cs="Times New Roman"/>
+                    <w:sz w:val="28"/>
+                    <w:szCs w:val="28"/>
+                  </w:rPr>
+                  <m:t>=</m:t>
+                </m:r>
+                <m:r>
+                  <m:rPr>
+                    <m:nor/>
+                  </m:rPr>
+                  <w:rPr>
+                    <w:rFonts w:ascii="Times New Roman" w:hAnsi="Times New Roman" w:cs="Times New Roman"/>
+                    <w:sz w:val="28"/>
+                    <w:szCs w:val="28"/>
+                  </w:rPr>
+                  <m:t>Absolute value of today’s high minus</m:t>
+                </m:r>
+              </m:e>
+            </m:mr>
+            <m:mr>
+              <m:e/>
+              <m:e>
+                <m:r>
+                  <m:rPr>
+                    <m:nor/>
+                  </m:rPr>
+                  <w:rPr>
+                    <w:rFonts w:ascii="Times New Roman" w:hAnsi="Times New Roman" w:cs="Times New Roman"/>
+                    <w:sz w:val="28"/>
+                    <w:szCs w:val="28"/>
+                  </w:rPr>
+                  <m:t>yesterday’s closing price</m:t>
+                </m:r>
+              </m:e>
+            </m:mr>
+            <m:mr>
+              <m:e/>
+              <m:e>
+                <m:r>
+                  <m:rPr>
+                    <m:sty m:val="p"/>
+                  </m:rPr>
+                  <w:rPr>
+                    <w:rFonts w:ascii="Cambria Math" w:hAnsi="Cambria Math" w:cs="Times New Roman"/>
+                    <w:sz w:val="28"/>
+                    <w:szCs w:val="28"/>
+                  </w:rPr>
+                  <m:t>∣</m:t>
+                </m:r>
+                <m:r>
+                  <m:rPr>
+                    <m:nor/>
+                  </m:rPr>
+                  <w:rPr>
+                    <w:rFonts w:ascii="Times New Roman" w:hAnsi="Times New Roman" w:cs="Times New Roman"/>
+                    <w:sz w:val="28"/>
+                    <w:szCs w:val="28"/>
+                  </w:rPr>
+                  <m:t>L</m:t>
+                </m:r>
+                <m:r>
+                  <w:rPr>
+                    <w:rFonts w:ascii="Cambria Math" w:hAnsi="Cambria Math" w:cs="Times New Roman"/>
+                    <w:sz w:val="28"/>
+                    <w:szCs w:val="28"/>
+                  </w:rPr>
+                  <m:t>-</m:t>
+                </m:r>
+                <m:sSub>
+                  <m:sSubPr>
+                    <m:ctrlPr>
+                      <w:rPr>
+                        <w:rFonts w:ascii="Cambria Math" w:hAnsi="Cambria Math" w:cs="Times New Roman"/>
+                        <w:sz w:val="28"/>
+                        <w:szCs w:val="28"/>
+                      </w:rPr>
+                    </m:ctrlPr>
+                  </m:sSubPr>
+                  <m:e>
+                    <m:r>
+                      <m:rPr>
+                        <m:nor/>
+                      </m:rPr>
+                      <w:rPr>
+                        <w:rFonts w:ascii="Times New Roman" w:hAnsi="Times New Roman" w:cs="Times New Roman"/>
+                        <w:sz w:val="28"/>
+                        <w:szCs w:val="28"/>
+                      </w:rPr>
+                      <m:t>C</m:t>
+                    </m:r>
+                  </m:e>
+                  <m:sub>
+                    <m:r>
+                      <w:rPr>
+                        <w:rFonts w:ascii="Cambria Math" w:hAnsi="Cambria Math" w:cs="Times New Roman"/>
+                        <w:sz w:val="28"/>
+                        <w:szCs w:val="28"/>
+                      </w:rPr>
+                      <m:t>p</m:t>
+                    </m:r>
+                  </m:sub>
+                </m:sSub>
+                <m:r>
+                  <m:rPr>
+                    <m:sty m:val="p"/>
+                  </m:rPr>
+                  <w:rPr>
+                    <w:rFonts w:ascii="Cambria Math" w:hAnsi="Cambria Math" w:cs="Times New Roman"/>
+                    <w:sz w:val="28"/>
+                    <w:szCs w:val="28"/>
+                  </w:rPr>
+                  <m:t>∣</m:t>
+                </m:r>
+                <m:r>
+                  <w:rPr>
+                    <w:rFonts w:ascii="Cambria Math" w:hAnsi="Cambria Math" w:cs="Times New Roman"/>
+                    <w:sz w:val="28"/>
+                    <w:szCs w:val="28"/>
+                  </w:rPr>
+                  <m:t>=</m:t>
+                </m:r>
+                <m:r>
+                  <m:rPr>
+                    <m:nor/>
+                  </m:rPr>
+                  <w:rPr>
+                    <w:rFonts w:ascii="Times New Roman" w:hAnsi="Times New Roman" w:cs="Times New Roman"/>
+                    <w:sz w:val="28"/>
+                    <w:szCs w:val="28"/>
+                  </w:rPr>
+                  <m:t>Absolute value of today’s low minus</m:t>
+                </m:r>
+              </m:e>
+            </m:mr>
+            <m:mr>
+              <m:e/>
+              <m:e>
+                <m:r>
+                  <m:rPr>
+                    <m:nor/>
+                  </m:rPr>
+                  <w:rPr>
+                    <w:rFonts w:ascii="Times New Roman" w:hAnsi="Times New Roman" w:cs="Times New Roman"/>
+                    <w:sz w:val="28"/>
+                    <w:szCs w:val="28"/>
+                  </w:rPr>
+                  <m:t>yesterday’s closing price</m:t>
+                </m:r>
+              </m:e>
+            </m:mr>
+          </m:m>
+        </m:oMath>
+      </m:oMathPara>
+    </w:p>
+    <w:p>
+      <w:pPr>
+        <w:rPr>
+          <w:rFonts w:ascii="Times New Roman" w:hAnsi="Times New Roman" w:cs="Times New Roman"/>
+          <w:sz w:val="28"/>
+          <w:szCs w:val="28"/>
+        </w:rPr>
+      </w:pPr>
+      <w:r>
+        <w:rPr>
+          <w:rFonts w:ascii="Times New Roman" w:hAnsi="Times New Roman" w:cs="Times New Roman"/>
+          <w:sz w:val="28"/>
+          <w:szCs w:val="28"/>
+        </w:rPr>
+        <w:drawing>
+          <wp:anchor distT="0" distB="0" distL="114300" distR="114300" simplePos="0" relativeHeight="251672576" behindDoc="0" locked="0" layoutInCell="1" allowOverlap="1" wp14:anchorId="2D6DAC9B" wp14:editId="27BF41AB">
+            <wp:simplePos x="0" y="0"/>
+            <wp:positionH relativeFrom="column">
+              <wp:posOffset>223520</wp:posOffset>
+            </wp:positionH>
+            <wp:positionV relativeFrom="paragraph">
+              <wp:posOffset>98425</wp:posOffset>
+            </wp:positionV>
+            <wp:extent cx="5943600" cy="2126615"/>
+            <wp:effectExtent l="0" t="0" r="0" b="6985"/>
+            <wp:wrapNone/>
+            <wp:docPr id="147480630" name="Picture 1"/>
+            <wp:cNvGraphicFramePr>
+              <a:graphicFrameLocks xmlns:a="http://schemas.openxmlformats.org/drawingml/2006/main" noChangeAspect="1"/>
+            </wp:cNvGraphicFramePr>
+            <a:graphic xmlns:a="http://schemas.openxmlformats.org/drawingml/2006/main">
+              <a:graphicData uri="http://schemas.openxmlformats.org/drawingml/2006/picture">
+                <pic:pic xmlns:pic="http://schemas.openxmlformats.org/drawingml/2006/picture">
+                  <pic:nvPicPr>
+                    <pic:cNvPr id="147480630" name=""/>
+                    <pic:cNvPicPr/>
+                  </pic:nvPicPr>
+                  <pic:blipFill>
+                    <a:blip r:embed="rId15">
+                      <a:extLst>
+                        <a:ext uri="{28A0092B-C50C-407E-A947-70E740481C1C}">
+                          <a14:useLocalDpi xmlns:a14="http://schemas.microsoft.com/office/drawing/2010/main" val="0"/>
+                        </a:ext>
+                      </a:extLst>
+                    </a:blip>
+                    <a:stretch>
+                      <a:fillRect/>
+                    </a:stretch>
+                  </pic:blipFill>
+                  <pic:spPr>
+                    <a:xfrm>
+                      <a:off x="0" y="0"/>
+                      <a:ext cx="5943600" cy="2126615"/>
+                    </a:xfrm>
+                    <a:prstGeom prst="rect">
+                      <a:avLst/>
+                    </a:prstGeom>
+                  </pic:spPr>
+                </pic:pic>
+              </a:graphicData>
+            </a:graphic>
+          </wp:anchor>
+        </w:drawing>
+      </w:r>
+    </w:p>
+    <w:p>
+      <w:pPr>
+        <w:rPr>
+          <w:rFonts w:ascii="Times New Roman" w:hAnsi="Times New Roman" w:cs="Times New Roman"/>
+          <w:sz w:val="28"/>
+          <w:szCs w:val="28"/>
+        </w:rPr>
+      </w:pPr>
+    </w:p>
+    <w:p>
+      <w:pPr>
+        <w:rPr>
+          <w:rFonts w:ascii="Times New Roman" w:hAnsi="Times New Roman" w:cs="Times New Roman"/>
+          <w:sz w:val="28"/>
+          <w:szCs w:val="28"/>
+        </w:rPr>
+      </w:pPr>
+    </w:p>
+    <w:p>
+      <w:pPr>
+        <w:rPr>
+          <w:rFonts w:ascii="Times New Roman" w:hAnsi="Times New Roman" w:cs="Times New Roman"/>
+          <w:sz w:val="28"/>
+          <w:szCs w:val="28"/>
+        </w:rPr>
+      </w:pPr>
+    </w:p>
+    <w:p>
+      <w:pPr>
+        <w:rPr>
+          <w:rFonts w:ascii="Times New Roman" w:hAnsi="Times New Roman" w:cs="Times New Roman"/>
+          <w:sz w:val="28"/>
+          <w:szCs w:val="28"/>
+        </w:rPr>
+      </w:pPr>
+    </w:p>
+    <w:p>
+      <w:pPr>
+        <w:pStyle w:val="Heading2"/>
+      </w:pPr>
+      <w:r>
+        <w:t>ATR vs EMA</w:t>
+      </w:r>
+    </w:p>
+    <w:p>
+      <w:pPr>
+        <w:rPr>
+          <w:rFonts w:ascii="Times New Roman" w:hAnsi="Times New Roman" w:cs="Times New Roman"/>
+          <w:sz w:val="28"/>
+          <w:szCs w:val="28"/>
+        </w:rPr>
+      </w:pPr>
+      <w:r>
+        <w:rPr>
+          <w:rFonts w:ascii="Times New Roman" w:hAnsi="Times New Roman" w:cs="Times New Roman"/>
+          <w:sz w:val="28"/>
+          <w:szCs w:val="28"/>
+        </w:rPr>
+        <w:t>Dù bản chất là EMA, nhưng có một cái "bẫy" về mặt chu kỳ ($n$) giữa ATR và EMA chuẩn của MetaTrader 5 (hoặc các nền tảng khác) mà dân làm hệ thống rất dễ dính phải:</w:t>
+      </w:r>
+    </w:p>
+    <w:p>
+      <w:pPr>
+        <w:numPr>
+          <w:ilvl w:val="0"/>
+          <w:numId w:val="5"/>
+        </w:numPr>
+        <w:rPr>
+          <w:rFonts w:ascii="Times New Roman" w:hAnsi="Times New Roman" w:cs="Times New Roman"/>
+          <w:sz w:val="28"/>
+          <w:szCs w:val="28"/>
+        </w:rPr>
+      </w:pPr>
+      <w:r>
+        <w:rPr>
+          <w:rFonts w:ascii="Times New Roman" w:hAnsi="Times New Roman" w:cs="Times New Roman"/>
+          <w:sz w:val="28"/>
+          <w:szCs w:val="28"/>
+        </w:rPr>
+        <w:t xml:space="preserve">Trong </w:t>
+      </w:r>
+      <w:r>
+        <w:rPr>
+          <w:rFonts w:ascii="Times New Roman" w:hAnsi="Times New Roman" w:cs="Times New Roman"/>
+          <w:b/>
+          <w:bCs/>
+          <w:sz w:val="28"/>
+          <w:szCs w:val="28"/>
+        </w:rPr>
+        <w:t>EMA truyền thống</w:t>
+      </w:r>
+      <w:r>
+        <w:rPr>
+          <w:rFonts w:ascii="Times New Roman" w:hAnsi="Times New Roman" w:cs="Times New Roman"/>
+          <w:sz w:val="28"/>
+          <w:szCs w:val="28"/>
+        </w:rPr>
+        <w:t>, hệ số $\alpha$ được tính bằng: $\alpha = \frac{2}{n + 1}$</w:t>
+      </w:r>
+    </w:p>
+    <w:p>
+      <w:pPr>
+        <w:numPr>
+          <w:ilvl w:val="0"/>
+          <w:numId w:val="5"/>
+        </w:numPr>
+        <w:rPr>
+          <w:rFonts w:ascii="Times New Roman" w:hAnsi="Times New Roman" w:cs="Times New Roman"/>
+          <w:sz w:val="28"/>
+          <w:szCs w:val="28"/>
+        </w:rPr>
+      </w:pPr>
+      <w:r>
+        <w:rPr>
+          <w:rFonts w:ascii="Times New Roman" w:hAnsi="Times New Roman" w:cs="Times New Roman"/>
+          <w:sz w:val="28"/>
+          <w:szCs w:val="28"/>
+        </w:rPr>
+        <w:t xml:space="preserve">Trong </w:t>
+      </w:r>
+      <w:r>
+        <w:rPr>
+          <w:rFonts w:ascii="Times New Roman" w:hAnsi="Times New Roman" w:cs="Times New Roman"/>
+          <w:b/>
+          <w:bCs/>
+          <w:sz w:val="28"/>
+          <w:szCs w:val="28"/>
+        </w:rPr>
+        <w:t>ATR (Wilder's Smoothing)</w:t>
+      </w:r>
+      <w:r>
+        <w:rPr>
+          <w:rFonts w:ascii="Times New Roman" w:hAnsi="Times New Roman" w:cs="Times New Roman"/>
+          <w:sz w:val="28"/>
+          <w:szCs w:val="28"/>
+        </w:rPr>
+        <w:t>, hệ số $\alpha$ được tính bằng: $\alpha = \frac{1}{n}$</w:t>
+      </w:r>
+    </w:p>
+    <w:p>
+      <w:pPr>
+        <w:rPr>
+          <w:rFonts w:ascii="Times New Roman" w:hAnsi="Times New Roman" w:cs="Times New Roman"/>
+          <w:sz w:val="28"/>
+          <w:szCs w:val="28"/>
+        </w:rPr>
+      </w:pPr>
+      <w:r>
+        <w:rPr>
+          <w:rFonts w:ascii="Times New Roman" w:hAnsi="Times New Roman" w:cs="Times New Roman"/>
+          <w:b/>
+          <w:bCs/>
+          <w:sz w:val="28"/>
+          <w:szCs w:val="28"/>
+        </w:rPr>
+        <w:t>Hệ quả là gì?</w:t>
+      </w:r>
+      <w:r>
+        <w:rPr>
+          <w:rFonts w:ascii="Times New Roman" w:hAnsi="Times New Roman" w:cs="Times New Roman"/>
+          <w:sz w:val="28"/>
+          <w:szCs w:val="28"/>
+        </w:rPr>
+        <w:t xml:space="preserve"> Một đường ATR chu kỳ $n = 14$ thực chất sẽ cho ra kết quả trùng khớp hoàn toàn với một đường EMA chu kỳ </w:t>
+      </w:r>
+      <w:r>
+        <w:rPr>
+          <w:rFonts w:ascii="Times New Roman" w:hAnsi="Times New Roman" w:cs="Times New Roman"/>
+          <w:b/>
+          <w:bCs/>
+          <w:sz w:val="28"/>
+          <w:szCs w:val="28"/>
+        </w:rPr>
+        <w:t>$27$</w:t>
+      </w:r>
+      <w:r>
+        <w:rPr>
+          <w:rFonts w:ascii="Times New Roman" w:hAnsi="Times New Roman" w:cs="Times New Roman"/>
+          <w:sz w:val="28"/>
+          <w:szCs w:val="28"/>
+        </w:rPr>
+        <w:t xml:space="preserve"> (vì $\frac{2}{27 + 1} = \frac{2}{28} = \frac{1}{14}$) áp dụng lên chuỗi dữ liệu TR.</w:t>
+      </w:r>
+    </w:p>
+    <w:p>
+      <w:pPr>
+        <w:rPr>
+          <w:rFonts w:ascii="Times New Roman" w:hAnsi="Times New Roman" w:cs="Times New Roman"/>
+          <w:sz w:val="28"/>
+          <w:szCs w:val="28"/>
+        </w:rPr>
+      </w:pPr>
+    </w:p>
+    <w:p>
+      <w:pPr>
+        <w:pStyle w:val="Heading2"/>
+      </w:pPr>
+      <w:r>
         <w:t>Uses</w:t>
       </w:r>
     </w:p>
@@ -1448,7 +2828,7 @@
                     <pic:cNvPicPr/>
                   </pic:nvPicPr>
                   <pic:blipFill>
-                    <a:blip r:embed="rId15">
+                    <a:blip r:embed="rId16">
                       <a:extLst>
                         <a:ext uri="{28A0092B-C50C-407E-A947-70E740481C1C}">
                           <a14:useLocalDpi xmlns:a14="http://schemas.microsoft.com/office/drawing/2010/main" val="0"/>
@@ -1677,7 +3057,7 @@
         </w:rPr>
         <w:t xml:space="preserve">1. </w:t>
       </w:r>
-      <w:hyperlink r:id="rId16" w:history="1">
+      <w:hyperlink r:id="rId17" w:history="1">
         <w:r>
           <w:rPr>
             <w:rStyle w:val="Hyperlink"/>
@@ -1704,7 +3084,6 @@
         <w:pStyle w:val="Heading1"/>
       </w:pPr>
       <w:r>
-        <w:lastRenderedPageBreak/>
         <w:t>Parabolic SAR</w:t>
       </w:r>
     </w:p>
@@ -1758,7 +3137,7 @@
                     <pic:cNvPicPr/>
                   </pic:nvPicPr>
                   <pic:blipFill>
-                    <a:blip r:embed="rId17">
+                    <a:blip r:embed="rId18">
                       <a:extLst>
                         <a:ext uri="{28A0092B-C50C-407E-A947-70E740481C1C}">
                           <a14:useLocalDpi xmlns:a14="http://schemas.microsoft.com/office/drawing/2010/main" val="0"/>
@@ -1862,6 +3241,7 @@
         <w:pStyle w:val="Heading2"/>
       </w:pPr>
       <w:r>
+        <w:lastRenderedPageBreak/>
         <w:t xml:space="preserve">Parabolic SAR </w:t>
       </w:r>
       <w:commentRangeStart w:id="0"/>
@@ -1911,7 +3291,7 @@
                     <pic:cNvPicPr/>
                   </pic:nvPicPr>
                   <pic:blipFill>
-                    <a:blip r:embed="rId22">
+                    <a:blip r:embed="rId23">
                       <a:extLst>
                         <a:ext uri="{28A0092B-C50C-407E-A947-70E740481C1C}">
                           <a14:useLocalDpi xmlns:a14="http://schemas.microsoft.com/office/drawing/2010/main" val="0"/>
@@ -2008,7 +3388,7 @@
                     <pic:cNvPicPr/>
                   </pic:nvPicPr>
                   <pic:blipFill>
-                    <a:blip r:embed="rId23">
+                    <a:blip r:embed="rId24">
                       <a:extLst>
                         <a:ext uri="{28A0092B-C50C-407E-A947-70E740481C1C}">
                           <a14:useLocalDpi xmlns:a14="http://schemas.microsoft.com/office/drawing/2010/main" val="0"/>
@@ -2116,7 +3496,6 @@
         <w:pStyle w:val="Heading3"/>
       </w:pPr>
       <w:r>
-        <w:lastRenderedPageBreak/>
         <w:t>Falling SAR</w:t>
       </w:r>
     </w:p>
@@ -2159,7 +3538,7 @@
                     <pic:cNvPicPr/>
                   </pic:nvPicPr>
                   <pic:blipFill>
-                    <a:blip r:embed="rId24">
+                    <a:blip r:embed="rId25">
                       <a:extLst>
                         <a:ext uri="{28A0092B-C50C-407E-A947-70E740481C1C}">
                           <a14:useLocalDpi xmlns:a14="http://schemas.microsoft.com/office/drawing/2010/main" val="0"/>
@@ -2275,7 +3654,7 @@
           <w:szCs w:val="28"/>
         </w:rPr>
         <w:drawing>
-          <wp:anchor distT="0" distB="0" distL="114300" distR="114300" simplePos="0" relativeHeight="251665408" behindDoc="1" locked="0" layoutInCell="1" allowOverlap="1" wp14:anchorId="10B02EAA" wp14:editId="72D4E8FC">
+          <wp:anchor distT="0" distB="0" distL="114300" distR="114300" simplePos="0" relativeHeight="251665408" behindDoc="1" locked="0" layoutInCell="1" allowOverlap="1" wp14:anchorId="10B02EAA" wp14:editId="5974B84C">
             <wp:simplePos x="0" y="0"/>
             <wp:positionH relativeFrom="column">
               <wp:posOffset>10160</wp:posOffset>
@@ -2298,7 +3677,7 @@
                     <pic:cNvPicPr/>
                   </pic:nvPicPr>
                   <pic:blipFill>
-                    <a:blip r:embed="rId25" cstate="print">
+                    <a:blip r:embed="rId26" cstate="print">
                       <a:extLst>
                         <a:ext uri="{28A0092B-C50C-407E-A947-70E740481C1C}">
                           <a14:useLocalDpi xmlns:a14="http://schemas.microsoft.com/office/drawing/2010/main" val="0"/>
@@ -2422,7 +3801,7 @@
           <w:szCs w:val="28"/>
         </w:rPr>
         <w:drawing>
-          <wp:anchor distT="0" distB="0" distL="114300" distR="114300" simplePos="0" relativeHeight="251666432" behindDoc="1" locked="0" layoutInCell="1" allowOverlap="1" wp14:anchorId="72C51BA0" wp14:editId="05B10336">
+          <wp:anchor distT="0" distB="0" distL="114300" distR="114300" simplePos="0" relativeHeight="251666432" behindDoc="1" locked="0" layoutInCell="1" allowOverlap="1" wp14:anchorId="72C51BA0" wp14:editId="106A4F66">
             <wp:simplePos x="0" y="0"/>
             <wp:positionH relativeFrom="column">
               <wp:posOffset>-40640</wp:posOffset>
@@ -2445,7 +3824,7 @@
                     <pic:cNvPicPr/>
                   </pic:nvPicPr>
                   <pic:blipFill>
-                    <a:blip r:embed="rId26" cstate="print">
+                    <a:blip r:embed="rId27" cstate="print">
                       <a:extLst>
                         <a:ext uri="{28A0092B-C50C-407E-A947-70E740481C1C}">
                           <a14:useLocalDpi xmlns:a14="http://schemas.microsoft.com/office/drawing/2010/main" val="0"/>
@@ -2610,7 +3989,6 @@
           <w:sz w:val="28"/>
           <w:szCs w:val="28"/>
         </w:rPr>
-        <w:lastRenderedPageBreak/>
         <w:t>Đ</w:t>
       </w:r>
       <w:r>
@@ -2691,7 +4069,7 @@
         </w:rPr>
         <w:t xml:space="preserve">1. </w:t>
       </w:r>
-      <w:hyperlink r:id="rId27" w:history="1">
+      <w:hyperlink r:id="rId28" w:history="1">
         <w:r>
           <w:rPr>
             <w:rStyle w:val="Hyperlink"/>
@@ -2720,7 +4098,7 @@
         </w:rPr>
         <w:t xml:space="preserve">2. </w:t>
       </w:r>
-      <w:hyperlink r:id="rId28" w:history="1">
+      <w:hyperlink r:id="rId29" w:history="1">
         <w:r>
           <w:rPr>
             <w:rStyle w:val="Hyperlink"/>
@@ -2749,7 +4127,7 @@
         </w:rPr>
         <w:t xml:space="preserve">3. </w:t>
       </w:r>
-      <w:hyperlink r:id="rId29" w:history="1">
+      <w:hyperlink r:id="rId30" w:history="1">
         <w:r>
           <w:rPr>
             <w:rStyle w:val="Hyperlink"/>
@@ -2774,7 +4152,7 @@
         <w:pStyle w:val="Heading1"/>
       </w:pPr>
       <w:r>
-        <w:t>ADX</w:t>
+        <w:t>ADX (Average Directional Index)</w:t>
       </w:r>
     </w:p>
     <w:p>
@@ -2857,7 +4235,7 @@
         </w:rPr>
         <w:t xml:space="preserve">1. </w:t>
       </w:r>
-      <w:hyperlink r:id="rId30" w:history="1">
+      <w:hyperlink r:id="rId31" w:history="1">
         <w:r>
           <w:rPr>
             <w:rStyle w:val="Hyperlink"/>
@@ -2886,7 +4264,7 @@
         </w:rPr>
         <w:t xml:space="preserve">2. </w:t>
       </w:r>
-      <w:hyperlink r:id="rId31" w:history="1">
+      <w:hyperlink r:id="rId32" w:history="1">
         <w:r>
           <w:rPr>
             <w:rStyle w:val="Hyperlink"/>
@@ -2901,8 +4279,381 @@
     </w:p>
     <w:p>
       <w:pPr>
-        <w:rPr>
-          <w:rFonts w:ascii="Times New Roman" w:hAnsi="Times New Roman" w:cs="Times New Roman"/>
+        <w:pStyle w:val="Heading1"/>
+      </w:pPr>
+      <w:r>
+        <w:t>DMI</w:t>
+      </w:r>
+    </w:p>
+    <w:p>
+      <w:pPr>
+        <w:pStyle w:val="Heading2"/>
+      </w:pPr>
+      <w:r>
+        <w:t>Calculation</w:t>
+      </w:r>
+    </w:p>
+    <w:p>
+      <w:pPr>
+        <w:rPr>
+          <w:rFonts w:ascii="Times New Roman" w:eastAsiaTheme="minorEastAsia" w:hAnsi="Times New Roman" w:cs="Times New Roman"/>
+          <w:sz w:val="28"/>
+          <w:szCs w:val="28"/>
+        </w:rPr>
+      </w:pPr>
+      <m:oMath>
+        <m:r>
+          <w:rPr>
+            <w:rFonts w:ascii="Cambria Math" w:hAnsi="Cambria Math" w:cs="Times New Roman"/>
+            <w:sz w:val="28"/>
+            <w:szCs w:val="28"/>
+          </w:rPr>
+          <m:t>+DI</m:t>
+        </m:r>
+        <m:r>
+          <w:rPr>
+            <w:rFonts w:ascii="Cambria Math" w:hAnsi="Cambria Math" w:cs="Times New Roman"/>
+            <w:sz w:val="28"/>
+            <w:szCs w:val="28"/>
+          </w:rPr>
+          <m:t>=</m:t>
+        </m:r>
+        <m:f>
+          <m:fPr>
+            <m:ctrlPr>
+              <w:rPr>
+                <w:rFonts w:ascii="Cambria Math" w:hAnsi="Cambria Math" w:cs="Times New Roman"/>
+                <w:sz w:val="28"/>
+                <w:szCs w:val="28"/>
+              </w:rPr>
+            </m:ctrlPr>
+          </m:fPr>
+          <m:num>
+            <m:r>
+              <m:rPr>
+                <m:sty m:val="p"/>
+              </m:rPr>
+              <w:rPr>
+                <w:rFonts w:ascii="Cambria Math" w:hAnsi="Cambria Math" w:cs="Times New Roman"/>
+                <w:sz w:val="28"/>
+                <w:szCs w:val="28"/>
+              </w:rPr>
+              <m:t>ATR Smoothed </m:t>
+            </m:r>
+            <m:r>
+              <m:rPr>
+                <m:sty m:val="p"/>
+              </m:rPr>
+              <w:rPr>
+                <w:rFonts w:ascii="Cambria Math" w:hAnsi="Times New Roman" w:cs="Times New Roman"/>
+                <w:sz w:val="28"/>
+                <w:szCs w:val="28"/>
+              </w:rPr>
+              <m:t>+DM</m:t>
+            </m:r>
+          </m:num>
+          <m:den>
+            <m:r>
+              <w:rPr>
+                <w:rFonts w:ascii="Cambria Math" w:hAnsi="Cambria Math" w:cs="Times New Roman"/>
+                <w:sz w:val="28"/>
+                <w:szCs w:val="28"/>
+              </w:rPr>
+              <m:t>ATR</m:t>
+            </m:r>
+          </m:den>
+        </m:f>
+        <m:r>
+          <w:rPr>
+            <w:rFonts w:ascii="Cambria Math" w:hAnsi="Cambria Math" w:cs="Times New Roman"/>
+            <w:sz w:val="28"/>
+            <w:szCs w:val="28"/>
+          </w:rPr>
+          <m:t>*100</m:t>
+        </m:r>
+      </m:oMath>
+      <w:r>
+        <w:rPr>
+          <w:rFonts w:ascii="Times New Roman" w:hAnsi="Times New Roman" w:cs="Times New Roman"/>
+          <w:sz w:val="28"/>
+          <w:szCs w:val="28"/>
+        </w:rPr>
+        <w:t> </w:t>
+      </w:r>
+      <w:r>
+        <w:rPr>
+          <w:rFonts w:ascii="Times New Roman" w:eastAsiaTheme="minorEastAsia" w:hAnsi="Times New Roman" w:cs="Times New Roman"/>
+          <w:sz w:val="28"/>
+          <w:szCs w:val="28"/>
+        </w:rPr>
+        <w:t xml:space="preserve"> </w:t>
+      </w:r>
+    </w:p>
+    <w:p>
+      <w:pPr>
+        <w:rPr>
+          <w:rFonts w:ascii="Times New Roman" w:eastAsiaTheme="minorEastAsia" w:hAnsi="Times New Roman" w:cs="Times New Roman"/>
+          <w:sz w:val="28"/>
+          <w:szCs w:val="28"/>
+        </w:rPr>
+      </w:pPr>
+    </w:p>
+    <w:p>
+      <w:pPr>
+        <w:rPr>
+          <w:rFonts w:ascii="Times New Roman" w:eastAsiaTheme="minorEastAsia" w:hAnsi="Times New Roman" w:cs="Times New Roman"/>
+          <w:sz w:val="28"/>
+          <w:szCs w:val="28"/>
+        </w:rPr>
+      </w:pPr>
+      <m:oMathPara>
+        <m:oMathParaPr>
+          <m:jc m:val="left"/>
+        </m:oMathParaPr>
+        <m:oMath>
+          <m:r>
+            <w:rPr>
+              <w:rFonts w:ascii="Cambria Math" w:hAnsi="Cambria Math" w:cs="Times New Roman"/>
+              <w:sz w:val="28"/>
+              <w:szCs w:val="28"/>
+            </w:rPr>
+            <m:t>-DI</m:t>
+          </m:r>
+          <m:r>
+            <w:rPr>
+              <w:rFonts w:ascii="Cambria Math" w:hAnsi="Cambria Math" w:cs="Times New Roman"/>
+              <w:sz w:val="28"/>
+              <w:szCs w:val="28"/>
+            </w:rPr>
+            <m:t>=</m:t>
+          </m:r>
+          <m:f>
+            <m:fPr>
+              <m:ctrlPr>
+                <w:rPr>
+                  <w:rFonts w:ascii="Cambria Math" w:hAnsi="Cambria Math" w:cs="Times New Roman"/>
+                  <w:sz w:val="28"/>
+                  <w:szCs w:val="28"/>
+                </w:rPr>
+              </m:ctrlPr>
+            </m:fPr>
+            <m:num>
+              <m:r>
+                <w:rPr>
+                  <w:rFonts w:ascii="Cambria Math" w:hAnsi="Cambria Math" w:cs="Times New Roman"/>
+                  <w:sz w:val="28"/>
+                  <w:szCs w:val="28"/>
+                </w:rPr>
+                <m:t>ATR Smoothed-DM</m:t>
+              </m:r>
+            </m:num>
+            <m:den>
+              <m:r>
+                <w:rPr>
+                  <w:rFonts w:ascii="Cambria Math" w:hAnsi="Cambria Math" w:cs="Times New Roman"/>
+                  <w:sz w:val="28"/>
+                  <w:szCs w:val="28"/>
+                </w:rPr>
+                <m:t>ATR</m:t>
+              </m:r>
+            </m:den>
+          </m:f>
+          <m:r>
+            <w:rPr>
+              <w:rFonts w:ascii="Cambria Math" w:hAnsi="Cambria Math" w:cs="Times New Roman"/>
+              <w:sz w:val="28"/>
+              <w:szCs w:val="28"/>
+            </w:rPr>
+            <m:t>*10</m:t>
+          </m:r>
+          <m:r>
+            <w:rPr>
+              <w:rFonts w:ascii="Cambria Math" w:hAnsi="Cambria Math" w:cs="Times New Roman"/>
+              <w:sz w:val="28"/>
+              <w:szCs w:val="28"/>
+            </w:rPr>
+            <m:t>0</m:t>
+          </m:r>
+        </m:oMath>
+      </m:oMathPara>
+    </w:p>
+    <w:p>
+      <w:pPr>
+        <w:rPr>
+          <w:rFonts w:ascii="Times New Roman" w:eastAsiaTheme="minorEastAsia" w:hAnsi="Times New Roman" w:cs="Times New Roman"/>
+          <w:sz w:val="28"/>
+          <w:szCs w:val="28"/>
+        </w:rPr>
+      </w:pPr>
+      <w:r>
+        <w:rPr>
+          <w:rFonts w:ascii="Times New Roman" w:eastAsiaTheme="minorEastAsia" w:hAnsi="Times New Roman" w:cs="Times New Roman"/>
+          <w:sz w:val="28"/>
+          <w:szCs w:val="28"/>
+        </w:rPr>
+        <w:drawing>
+          <wp:anchor distT="0" distB="0" distL="114300" distR="114300" simplePos="0" relativeHeight="251671552" behindDoc="1" locked="0" layoutInCell="1" allowOverlap="1" wp14:anchorId="398C4F57" wp14:editId="5DFE381E">
+            <wp:simplePos x="0" y="0"/>
+            <wp:positionH relativeFrom="column">
+              <wp:posOffset>121920</wp:posOffset>
+            </wp:positionH>
+            <wp:positionV relativeFrom="paragraph">
+              <wp:posOffset>4445</wp:posOffset>
+            </wp:positionV>
+            <wp:extent cx="5502117" cy="4122777"/>
+            <wp:effectExtent l="0" t="0" r="3810" b="0"/>
+            <wp:wrapNone/>
+            <wp:docPr id="877808942" name="Picture 1"/>
+            <wp:cNvGraphicFramePr>
+              <a:graphicFrameLocks xmlns:a="http://schemas.openxmlformats.org/drawingml/2006/main" noChangeAspect="1"/>
+            </wp:cNvGraphicFramePr>
+            <a:graphic xmlns:a="http://schemas.openxmlformats.org/drawingml/2006/main">
+              <a:graphicData uri="http://schemas.openxmlformats.org/drawingml/2006/picture">
+                <pic:pic xmlns:pic="http://schemas.openxmlformats.org/drawingml/2006/picture">
+                  <pic:nvPicPr>
+                    <pic:cNvPr id="877808942" name=""/>
+                    <pic:cNvPicPr/>
+                  </pic:nvPicPr>
+                  <pic:blipFill>
+                    <a:blip r:embed="rId33">
+                      <a:extLst>
+                        <a:ext uri="{28A0092B-C50C-407E-A947-70E740481C1C}">
+                          <a14:useLocalDpi xmlns:a14="http://schemas.microsoft.com/office/drawing/2010/main" val="0"/>
+                        </a:ext>
+                      </a:extLst>
+                    </a:blip>
+                    <a:stretch>
+                      <a:fillRect/>
+                    </a:stretch>
+                  </pic:blipFill>
+                  <pic:spPr>
+                    <a:xfrm>
+                      <a:off x="0" y="0"/>
+                      <a:ext cx="5502117" cy="4122777"/>
+                    </a:xfrm>
+                    <a:prstGeom prst="rect">
+                      <a:avLst/>
+                    </a:prstGeom>
+                  </pic:spPr>
+                </pic:pic>
+              </a:graphicData>
+            </a:graphic>
+          </wp:anchor>
+        </w:drawing>
+      </w:r>
+    </w:p>
+    <w:p>
+      <w:pPr>
+        <w:rPr>
+          <w:rFonts w:ascii="Times New Roman" w:eastAsiaTheme="minorEastAsia" w:hAnsi="Times New Roman" w:cs="Times New Roman"/>
+          <w:sz w:val="28"/>
+          <w:szCs w:val="28"/>
+        </w:rPr>
+      </w:pPr>
+    </w:p>
+    <w:p>
+      <w:pPr>
+        <w:rPr>
+          <w:rFonts w:ascii="Times New Roman" w:eastAsiaTheme="minorEastAsia" w:hAnsi="Times New Roman" w:cs="Times New Roman"/>
+          <w:sz w:val="28"/>
+          <w:szCs w:val="28"/>
+        </w:rPr>
+      </w:pPr>
+    </w:p>
+    <w:p>
+      <w:pPr>
+        <w:rPr>
+          <w:rFonts w:ascii="Times New Roman" w:eastAsiaTheme="minorEastAsia" w:hAnsi="Times New Roman" w:cs="Times New Roman"/>
+          <w:sz w:val="28"/>
+          <w:szCs w:val="28"/>
+        </w:rPr>
+      </w:pPr>
+    </w:p>
+    <w:p>
+      <w:pPr>
+        <w:rPr>
+          <w:rFonts w:ascii="Times New Roman" w:eastAsiaTheme="minorEastAsia" w:hAnsi="Times New Roman" w:cs="Times New Roman"/>
+          <w:sz w:val="28"/>
+          <w:szCs w:val="28"/>
+        </w:rPr>
+      </w:pPr>
+    </w:p>
+    <w:p>
+      <w:pPr>
+        <w:rPr>
+          <w:rFonts w:ascii="Times New Roman" w:eastAsiaTheme="minorEastAsia" w:hAnsi="Times New Roman" w:cs="Times New Roman"/>
+          <w:sz w:val="28"/>
+          <w:szCs w:val="28"/>
+        </w:rPr>
+      </w:pPr>
+    </w:p>
+    <w:p>
+      <w:pPr>
+        <w:rPr>
+          <w:rFonts w:ascii="Times New Roman" w:eastAsiaTheme="minorEastAsia" w:hAnsi="Times New Roman" w:cs="Times New Roman"/>
+          <w:sz w:val="28"/>
+          <w:szCs w:val="28"/>
+        </w:rPr>
+      </w:pPr>
+    </w:p>
+    <w:p>
+      <w:pPr>
+        <w:rPr>
+          <w:rFonts w:ascii="Times New Roman" w:eastAsiaTheme="minorEastAsia" w:hAnsi="Times New Roman" w:cs="Times New Roman"/>
+          <w:sz w:val="28"/>
+          <w:szCs w:val="28"/>
+        </w:rPr>
+      </w:pPr>
+    </w:p>
+    <w:p>
+      <w:pPr>
+        <w:rPr>
+          <w:rFonts w:ascii="Times New Roman" w:eastAsiaTheme="minorEastAsia" w:hAnsi="Times New Roman" w:cs="Times New Roman"/>
+          <w:sz w:val="28"/>
+          <w:szCs w:val="28"/>
+        </w:rPr>
+      </w:pPr>
+    </w:p>
+    <w:p>
+      <w:pPr>
+        <w:rPr>
+          <w:rFonts w:ascii="Times New Roman" w:eastAsiaTheme="minorEastAsia" w:hAnsi="Times New Roman" w:cs="Times New Roman"/>
+          <w:sz w:val="28"/>
+          <w:szCs w:val="28"/>
+        </w:rPr>
+      </w:pPr>
+    </w:p>
+    <w:p>
+      <w:pPr>
+        <w:rPr>
+          <w:rFonts w:ascii="Times New Roman" w:eastAsiaTheme="minorEastAsia" w:hAnsi="Times New Roman" w:cs="Times New Roman"/>
+          <w:sz w:val="28"/>
+          <w:szCs w:val="28"/>
+        </w:rPr>
+      </w:pPr>
+    </w:p>
+    <w:p>
+      <w:pPr>
+        <w:rPr>
+          <w:rFonts w:ascii="Times New Roman" w:eastAsiaTheme="minorEastAsia" w:hAnsi="Times New Roman" w:cs="Times New Roman"/>
+          <w:sz w:val="28"/>
+          <w:szCs w:val="28"/>
+        </w:rPr>
+      </w:pPr>
+    </w:p>
+    <w:p>
+      <w:pPr>
+        <w:rPr>
+          <w:rFonts w:ascii="Times New Roman" w:eastAsiaTheme="minorEastAsia" w:hAnsi="Times New Roman" w:cs="Times New Roman"/>
+          <w:sz w:val="28"/>
+          <w:szCs w:val="28"/>
+        </w:rPr>
+      </w:pPr>
+    </w:p>
+    <w:p>
+      <w:pPr>
+        <w:rPr>
+          <w:rFonts w:ascii="Times New Roman" w:eastAsiaTheme="minorEastAsia" w:hAnsi="Times New Roman" w:cs="Times New Roman"/>
           <w:sz w:val="28"/>
           <w:szCs w:val="28"/>
         </w:rPr>
@@ -3144,6 +4895,119 @@
     </w:lvl>
   </w:abstractNum>
   <w:abstractNum w:abstractNumId="1" w15:restartNumberingAfterBreak="0">
+    <w:nsid w:val="45D37485"/>
+    <w:multiLevelType w:val="hybridMultilevel"/>
+    <w:tmpl w:val="0FBCDE32"/>
+    <w:lvl w:ilvl="0" w:tplc="812CE0A8">
+      <w:start w:val="2"/>
+      <w:numFmt w:val="bullet"/>
+      <w:lvlText w:val="-"/>
+      <w:lvlJc w:val="left"/>
+      <w:pPr>
+        <w:ind w:left="720" w:hanging="360"/>
+      </w:pPr>
+      <w:rPr>
+        <w:rFonts w:ascii="Times New Roman" w:eastAsiaTheme="minorHAnsi" w:hAnsi="Times New Roman" w:cs="Times New Roman" w:hint="default"/>
+      </w:rPr>
+    </w:lvl>
+    <w:lvl w:ilvl="1" w:tplc="04090003" w:tentative="1">
+      <w:start w:val="1"/>
+      <w:numFmt w:val="bullet"/>
+      <w:lvlText w:val="o"/>
+      <w:lvlJc w:val="left"/>
+      <w:pPr>
+        <w:ind w:left="1440" w:hanging="360"/>
+      </w:pPr>
+      <w:rPr>
+        <w:rFonts w:ascii="Courier New" w:hAnsi="Courier New" w:cs="Courier New" w:hint="default"/>
+      </w:rPr>
+    </w:lvl>
+    <w:lvl w:ilvl="2" w:tplc="04090005" w:tentative="1">
+      <w:start w:val="1"/>
+      <w:numFmt w:val="bullet"/>
+      <w:lvlText w:val=""/>
+      <w:lvlJc w:val="left"/>
+      <w:pPr>
+        <w:ind w:left="2160" w:hanging="360"/>
+      </w:pPr>
+      <w:rPr>
+        <w:rFonts w:ascii="Wingdings" w:hAnsi="Wingdings" w:hint="default"/>
+      </w:rPr>
+    </w:lvl>
+    <w:lvl w:ilvl="3" w:tplc="04090001" w:tentative="1">
+      <w:start w:val="1"/>
+      <w:numFmt w:val="bullet"/>
+      <w:lvlText w:val=""/>
+      <w:lvlJc w:val="left"/>
+      <w:pPr>
+        <w:ind w:left="2880" w:hanging="360"/>
+      </w:pPr>
+      <w:rPr>
+        <w:rFonts w:ascii="Symbol" w:hAnsi="Symbol" w:hint="default"/>
+      </w:rPr>
+    </w:lvl>
+    <w:lvl w:ilvl="4" w:tplc="04090003" w:tentative="1">
+      <w:start w:val="1"/>
+      <w:numFmt w:val="bullet"/>
+      <w:lvlText w:val="o"/>
+      <w:lvlJc w:val="left"/>
+      <w:pPr>
+        <w:ind w:left="3600" w:hanging="360"/>
+      </w:pPr>
+      <w:rPr>
+        <w:rFonts w:ascii="Courier New" w:hAnsi="Courier New" w:cs="Courier New" w:hint="default"/>
+      </w:rPr>
+    </w:lvl>
+    <w:lvl w:ilvl="5" w:tplc="04090005" w:tentative="1">
+      <w:start w:val="1"/>
+      <w:numFmt w:val="bullet"/>
+      <w:lvlText w:val=""/>
+      <w:lvlJc w:val="left"/>
+      <w:pPr>
+        <w:ind w:left="4320" w:hanging="360"/>
+      </w:pPr>
+      <w:rPr>
+        <w:rFonts w:ascii="Wingdings" w:hAnsi="Wingdings" w:hint="default"/>
+      </w:rPr>
+    </w:lvl>
+    <w:lvl w:ilvl="6" w:tplc="04090001" w:tentative="1">
+      <w:start w:val="1"/>
+      <w:numFmt w:val="bullet"/>
+      <w:lvlText w:val=""/>
+      <w:lvlJc w:val="left"/>
+      <w:pPr>
+        <w:ind w:left="5040" w:hanging="360"/>
+      </w:pPr>
+      <w:rPr>
+        <w:rFonts w:ascii="Symbol" w:hAnsi="Symbol" w:hint="default"/>
+      </w:rPr>
+    </w:lvl>
+    <w:lvl w:ilvl="7" w:tplc="04090003" w:tentative="1">
+      <w:start w:val="1"/>
+      <w:numFmt w:val="bullet"/>
+      <w:lvlText w:val="o"/>
+      <w:lvlJc w:val="left"/>
+      <w:pPr>
+        <w:ind w:left="5760" w:hanging="360"/>
+      </w:pPr>
+      <w:rPr>
+        <w:rFonts w:ascii="Courier New" w:hAnsi="Courier New" w:cs="Courier New" w:hint="default"/>
+      </w:rPr>
+    </w:lvl>
+    <w:lvl w:ilvl="8" w:tplc="04090005" w:tentative="1">
+      <w:start w:val="1"/>
+      <w:numFmt w:val="bullet"/>
+      <w:lvlText w:val=""/>
+      <w:lvlJc w:val="left"/>
+      <w:pPr>
+        <w:ind w:left="6480" w:hanging="360"/>
+      </w:pPr>
+      <w:rPr>
+        <w:rFonts w:ascii="Wingdings" w:hAnsi="Wingdings" w:hint="default"/>
+      </w:rPr>
+    </w:lvl>
+  </w:abstractNum>
+  <w:abstractNum w:abstractNumId="2" w15:restartNumberingAfterBreak="0">
     <w:nsid w:val="47EA1A93"/>
     <w:multiLevelType w:val="multilevel"/>
     <w:tmpl w:val="5EF674B8"/>
@@ -3292,7 +5156,156 @@
       </w:rPr>
     </w:lvl>
   </w:abstractNum>
-  <w:abstractNum w:abstractNumId="2" w15:restartNumberingAfterBreak="0">
+  <w:abstractNum w:abstractNumId="3" w15:restartNumberingAfterBreak="0">
+    <w:nsid w:val="6A8A7D45"/>
+    <w:multiLevelType w:val="multilevel"/>
+    <w:tmpl w:val="2E72109A"/>
+    <w:lvl w:ilvl="0">
+      <w:start w:val="1"/>
+      <w:numFmt w:val="bullet"/>
+      <w:lvlText w:val=""/>
+      <w:lvlJc w:val="left"/>
+      <w:pPr>
+        <w:tabs>
+          <w:tab w:val="num" w:pos="720"/>
+        </w:tabs>
+        <w:ind w:left="720" w:hanging="360"/>
+      </w:pPr>
+      <w:rPr>
+        <w:rFonts w:ascii="Symbol" w:hAnsi="Symbol" w:hint="default"/>
+        <w:sz w:val="20"/>
+      </w:rPr>
+    </w:lvl>
+    <w:lvl w:ilvl="1" w:tentative="1">
+      <w:start w:val="1"/>
+      <w:numFmt w:val="bullet"/>
+      <w:lvlText w:val="o"/>
+      <w:lvlJc w:val="left"/>
+      <w:pPr>
+        <w:tabs>
+          <w:tab w:val="num" w:pos="1440"/>
+        </w:tabs>
+        <w:ind w:left="1440" w:hanging="360"/>
+      </w:pPr>
+      <w:rPr>
+        <w:rFonts w:ascii="Courier New" w:hAnsi="Courier New" w:hint="default"/>
+        <w:sz w:val="20"/>
+      </w:rPr>
+    </w:lvl>
+    <w:lvl w:ilvl="2" w:tentative="1">
+      <w:start w:val="1"/>
+      <w:numFmt w:val="bullet"/>
+      <w:lvlText w:val=""/>
+      <w:lvlJc w:val="left"/>
+      <w:pPr>
+        <w:tabs>
+          <w:tab w:val="num" w:pos="2160"/>
+        </w:tabs>
+        <w:ind w:left="2160" w:hanging="360"/>
+      </w:pPr>
+      <w:rPr>
+        <w:rFonts w:ascii="Wingdings" w:hAnsi="Wingdings" w:hint="default"/>
+        <w:sz w:val="20"/>
+      </w:rPr>
+    </w:lvl>
+    <w:lvl w:ilvl="3" w:tentative="1">
+      <w:start w:val="1"/>
+      <w:numFmt w:val="bullet"/>
+      <w:lvlText w:val=""/>
+      <w:lvlJc w:val="left"/>
+      <w:pPr>
+        <w:tabs>
+          <w:tab w:val="num" w:pos="2880"/>
+        </w:tabs>
+        <w:ind w:left="2880" w:hanging="360"/>
+      </w:pPr>
+      <w:rPr>
+        <w:rFonts w:ascii="Wingdings" w:hAnsi="Wingdings" w:hint="default"/>
+        <w:sz w:val="20"/>
+      </w:rPr>
+    </w:lvl>
+    <w:lvl w:ilvl="4" w:tentative="1">
+      <w:start w:val="1"/>
+      <w:numFmt w:val="bullet"/>
+      <w:lvlText w:val=""/>
+      <w:lvlJc w:val="left"/>
+      <w:pPr>
+        <w:tabs>
+          <w:tab w:val="num" w:pos="3600"/>
+        </w:tabs>
+        <w:ind w:left="3600" w:hanging="360"/>
+      </w:pPr>
+      <w:rPr>
+        <w:rFonts w:ascii="Wingdings" w:hAnsi="Wingdings" w:hint="default"/>
+        <w:sz w:val="20"/>
+      </w:rPr>
+    </w:lvl>
+    <w:lvl w:ilvl="5" w:tentative="1">
+      <w:start w:val="1"/>
+      <w:numFmt w:val="bullet"/>
+      <w:lvlText w:val=""/>
+      <w:lvlJc w:val="left"/>
+      <w:pPr>
+        <w:tabs>
+          <w:tab w:val="num" w:pos="4320"/>
+        </w:tabs>
+        <w:ind w:left="4320" w:hanging="360"/>
+      </w:pPr>
+      <w:rPr>
+        <w:rFonts w:ascii="Wingdings" w:hAnsi="Wingdings" w:hint="default"/>
+        <w:sz w:val="20"/>
+      </w:rPr>
+    </w:lvl>
+    <w:lvl w:ilvl="6" w:tentative="1">
+      <w:start w:val="1"/>
+      <w:numFmt w:val="bullet"/>
+      <w:lvlText w:val=""/>
+      <w:lvlJc w:val="left"/>
+      <w:pPr>
+        <w:tabs>
+          <w:tab w:val="num" w:pos="5040"/>
+        </w:tabs>
+        <w:ind w:left="5040" w:hanging="360"/>
+      </w:pPr>
+      <w:rPr>
+        <w:rFonts w:ascii="Wingdings" w:hAnsi="Wingdings" w:hint="default"/>
+        <w:sz w:val="20"/>
+      </w:rPr>
+    </w:lvl>
+    <w:lvl w:ilvl="7" w:tentative="1">
+      <w:start w:val="1"/>
+      <w:numFmt w:val="bullet"/>
+      <w:lvlText w:val=""/>
+      <w:lvlJc w:val="left"/>
+      <w:pPr>
+        <w:tabs>
+          <w:tab w:val="num" w:pos="5760"/>
+        </w:tabs>
+        <w:ind w:left="5760" w:hanging="360"/>
+      </w:pPr>
+      <w:rPr>
+        <w:rFonts w:ascii="Wingdings" w:hAnsi="Wingdings" w:hint="default"/>
+        <w:sz w:val="20"/>
+      </w:rPr>
+    </w:lvl>
+    <w:lvl w:ilvl="8" w:tentative="1">
+      <w:start w:val="1"/>
+      <w:numFmt w:val="bullet"/>
+      <w:lvlText w:val=""/>
+      <w:lvlJc w:val="left"/>
+      <w:pPr>
+        <w:tabs>
+          <w:tab w:val="num" w:pos="6480"/>
+        </w:tabs>
+        <w:ind w:left="6480" w:hanging="360"/>
+      </w:pPr>
+      <w:rPr>
+        <w:rFonts w:ascii="Wingdings" w:hAnsi="Wingdings" w:hint="default"/>
+        <w:sz w:val="20"/>
+      </w:rPr>
+    </w:lvl>
+  </w:abstractNum>
+  <w:abstractNum w:abstractNumId="4" w15:restartNumberingAfterBreak="0">
     <w:nsid w:val="70D44F24"/>
     <w:multiLevelType w:val="hybridMultilevel"/>
     <w:tmpl w:val="A8BE01A0"/>
@@ -3406,13 +5419,19 @@
     </w:lvl>
   </w:abstractNum>
   <w:num w:numId="1" w16cid:durableId="720716093">
-    <w:abstractNumId w:val="1"/>
+    <w:abstractNumId w:val="2"/>
   </w:num>
   <w:num w:numId="2" w16cid:durableId="1565094768">
-    <w:abstractNumId w:val="2"/>
+    <w:abstractNumId w:val="4"/>
   </w:num>
   <w:num w:numId="3" w16cid:durableId="1553081679">
     <w:abstractNumId w:val="0"/>
+  </w:num>
+  <w:num w:numId="4" w16cid:durableId="1931426500">
+    <w:abstractNumId w:val="1"/>
+  </w:num>
+  <w:num w:numId="5" w16cid:durableId="867908142">
+    <w:abstractNumId w:val="3"/>
   </w:num>
 </w:numbering>
 </file>
@@ -3834,7 +5853,7 @@
     <w:autoRedefine/>
     <w:uiPriority w:val="9"/>
     <w:qFormat/>
-    <w:rsid w:val="00DB2E31"/>
+    <w:rsid w:val="00F5187D"/>
     <w:pPr>
       <w:keepNext/>
       <w:keepLines/>
@@ -4057,7 +6076,7 @@
     <w:basedOn w:val="DefaultParagraphFont"/>
     <w:link w:val="Heading1"/>
     <w:uiPriority w:val="9"/>
-    <w:rsid w:val="00DB2E31"/>
+    <w:rsid w:val="00F5187D"/>
     <w:rPr>
       <w:rFonts w:ascii="Times New Roman" w:eastAsiaTheme="majorEastAsia" w:hAnsi="Times New Roman" w:cstheme="majorBidi"/>
       <w:color w:val="0F4761" w:themeColor="accent1" w:themeShade="BF"/>

</xml_diff>

<commit_message>
Redesign GUI. - Borrow some Component from other. - Prepare to Config Pattern
</commit_message>
<xml_diff>
--- a/Experts/Anhnt/Document/Indicator/Indicator Strategy.docx
+++ b/Experts/Anhnt/Document/Indicator/Indicator Strategy.docx
@@ -2534,6 +2534,7 @@
       <w:r>
         <w:rPr>
           <w:rFonts w:ascii="Times New Roman" w:hAnsi="Times New Roman" w:cs="Times New Roman"/>
+          <w:noProof/>
           <w:sz w:val="28"/>
           <w:szCs w:val="28"/>
         </w:rPr>
@@ -3654,7 +3655,7 @@
           <w:szCs w:val="28"/>
         </w:rPr>
         <w:drawing>
-          <wp:anchor distT="0" distB="0" distL="114300" distR="114300" simplePos="0" relativeHeight="251665408" behindDoc="1" locked="0" layoutInCell="1" allowOverlap="1" wp14:anchorId="10B02EAA" wp14:editId="5974B84C">
+          <wp:anchor distT="0" distB="0" distL="114300" distR="114300" simplePos="0" relativeHeight="251665408" behindDoc="1" locked="0" layoutInCell="1" allowOverlap="1" wp14:anchorId="10B02EAA" wp14:editId="70A34698">
             <wp:simplePos x="0" y="0"/>
             <wp:positionH relativeFrom="column">
               <wp:posOffset>10160</wp:posOffset>
@@ -3801,7 +3802,7 @@
           <w:szCs w:val="28"/>
         </w:rPr>
         <w:drawing>
-          <wp:anchor distT="0" distB="0" distL="114300" distR="114300" simplePos="0" relativeHeight="251666432" behindDoc="1" locked="0" layoutInCell="1" allowOverlap="1" wp14:anchorId="72C51BA0" wp14:editId="106A4F66">
+          <wp:anchor distT="0" distB="0" distL="114300" distR="114300" simplePos="0" relativeHeight="251666432" behindDoc="1" locked="0" layoutInCell="1" allowOverlap="1" wp14:anchorId="72C51BA0" wp14:editId="57AF06C3">
             <wp:simplePos x="0" y="0"/>
             <wp:positionH relativeFrom="column">
               <wp:posOffset>-40640</wp:posOffset>
@@ -4308,15 +4309,7 @@
             <w:sz w:val="28"/>
             <w:szCs w:val="28"/>
           </w:rPr>
-          <m:t>+DI</m:t>
-        </m:r>
-        <m:r>
-          <w:rPr>
-            <w:rFonts w:ascii="Cambria Math" w:hAnsi="Cambria Math" w:cs="Times New Roman"/>
-            <w:sz w:val="28"/>
-            <w:szCs w:val="28"/>
-          </w:rPr>
-          <m:t>=</m:t>
+          <m:t>+DI=</m:t>
         </m:r>
         <m:f>
           <m:fPr>
@@ -4417,15 +4410,7 @@
               <w:sz w:val="28"/>
               <w:szCs w:val="28"/>
             </w:rPr>
-            <m:t>-DI</m:t>
-          </m:r>
-          <m:r>
-            <w:rPr>
-              <w:rFonts w:ascii="Cambria Math" w:hAnsi="Cambria Math" w:cs="Times New Roman"/>
-              <w:sz w:val="28"/>
-              <w:szCs w:val="28"/>
-            </w:rPr>
-            <m:t>=</m:t>
+            <m:t>-DI=</m:t>
           </m:r>
           <m:f>
             <m:fPr>
@@ -4464,15 +4449,7 @@
               <w:sz w:val="28"/>
               <w:szCs w:val="28"/>
             </w:rPr>
-            <m:t>*10</m:t>
-          </m:r>
-          <m:r>
-            <w:rPr>
-              <w:rFonts w:ascii="Cambria Math" w:hAnsi="Cambria Math" w:cs="Times New Roman"/>
-              <w:sz w:val="28"/>
-              <w:szCs w:val="28"/>
-            </w:rPr>
-            <m:t>0</m:t>
+            <m:t>*100</m:t>
           </m:r>
         </m:oMath>
       </m:oMathPara>
@@ -4488,6 +4465,7 @@
       <w:r>
         <w:rPr>
           <w:rFonts w:ascii="Times New Roman" w:eastAsiaTheme="minorEastAsia" w:hAnsi="Times New Roman" w:cs="Times New Roman"/>
+          <w:noProof/>
           <w:sz w:val="28"/>
           <w:szCs w:val="28"/>
         </w:rPr>
@@ -4631,6 +4609,21 @@
           <w:szCs w:val="28"/>
         </w:rPr>
       </w:pPr>
+    </w:p>
+    <w:p>
+      <w:pPr>
+        <w:pStyle w:val="Heading1"/>
+        <w:rPr>
+          <w:rFonts w:eastAsiaTheme="minorEastAsia"/>
+        </w:rPr>
+      </w:pPr>
+      <w:r>
+        <w:rPr>
+          <w:rFonts w:eastAsiaTheme="minorEastAsia"/>
+        </w:rPr>
+        <w:lastRenderedPageBreak/>
+        <w:t>Alligator</w:t>
+      </w:r>
     </w:p>
     <w:p>
       <w:pPr>

</xml_diff>

<commit_message>
Add Feature Sound and CMessage Alert
</commit_message>
<xml_diff>
--- a/Experts/Anhnt/Document/Indicator/Indicator Strategy.docx
+++ b/Experts/Anhnt/Document/Indicator/Indicator Strategy.docx
@@ -221,7 +221,7 @@
     </w:p>
     <w:p>
       <w:pPr>
-        <w:pStyle w:val="Heading2"/>
+        <w:pStyle w:val="Heading1"/>
       </w:pPr>
       <w:r>
         <w:lastRenderedPageBreak/>
@@ -230,7 +230,7 @@
     </w:p>
     <w:p>
       <w:pPr>
-        <w:pStyle w:val="Heading3"/>
+        <w:pStyle w:val="Heading2"/>
       </w:pPr>
       <w:r>
         <w:t xml:space="preserve">MACD </w:t>
@@ -358,6 +358,39 @@
     <w:p/>
     <w:p/>
     <w:p/>
+    <w:p>
+      <w:r>
+        <w:t>Đường EMA 12 sẽ phản ứng nhanh hơn đường EMA 26 khi đường EMA 12 cắt hướng lên thì MACH Line sẽ dương, trend càng lên càng tách biệt thì giá trị MACD sẽ càng tăng.</w:t>
+      </w:r>
+    </w:p>
+    <w:p>
+      <w:pPr>
+        <w:pStyle w:val="Heading2"/>
+      </w:pPr>
+      <w:r>
+        <w:t>MACD Buy</w:t>
+      </w:r>
+      <w:r>
+        <w:t>/Sell</w:t>
+      </w:r>
+    </w:p>
+    <w:p>
+      <w:r>
+        <w:rPr>
+          <w:b/>
+          <w:bCs/>
+        </w:rPr>
+        <w:t>Tín hiệu Buy/Sell chuẩn của MACD là sự giao cắt giữa đường đỏ (Signal) và cột xám (MACD Line)</w:t>
+      </w:r>
+      <w:r>
+        <w:t>, chứ không phải là đợi đường đỏ vượt qua mức 0.</w:t>
+      </w:r>
+    </w:p>
+    <w:p>
+      <w:r>
+        <w:t>Khi đường đỏ hoặc cột xám cắt qua mức 0, đó là tín hiệu xác nhận xu hướng trung hạn đã thay đổi (ở trên 0 là Bullish, ở dưới 0 là Bearish). Nếu đợi cả đường đỏ cắt qua vạch 0 mới vào lệnh thì thường sẽ bị trễ (lag) rất nhiều so với thị trường.</w:t>
+      </w:r>
+    </w:p>
     <w:p/>
     <w:p>
       <w:pPr>
@@ -377,6 +410,7 @@
         <w:pStyle w:val="Heading1"/>
       </w:pPr>
       <w:r>
+        <w:lastRenderedPageBreak/>
         <w:t>Understanding Oscillators</w:t>
       </w:r>
     </w:p>
@@ -841,6 +875,7 @@
           </w:tcPr>
           <w:p>
             <w:r>
+              <w:lastRenderedPageBreak/>
               <w:t>Price bounces off the lower band</w:t>
             </w:r>
           </w:p>
@@ -1000,7 +1035,6 @@
           </w:tcPr>
           <w:p>
             <w:r>
-              <w:lastRenderedPageBreak/>
               <w:t>Price move starting at the upper band and continuing outside it, with increased volume</w:t>
             </w:r>
           </w:p>
@@ -1327,6 +1361,7 @@
           </w:tcPr>
           <w:p>
             <w:r>
+              <w:lastRenderedPageBreak/>
               <w:t>Tightening bands</w:t>
             </w:r>
           </w:p>
@@ -1369,6 +1404,387 @@
     </w:tbl>
     <w:p/>
     <w:p>
+      <w:r>
+        <w:t xml:space="preserve">Bước sang </w:t>
+      </w:r>
+      <w:r>
+        <w:rPr>
+          <w:b/>
+          <w:bCs/>
+        </w:rPr>
+        <w:t>Bollinger Bands (BB)</w:t>
+      </w:r>
+      <w:r>
+        <w:t xml:space="preserve"> thì tư duy trực quan của nó lại cực kỳ thú vị và thực chiến. Nếu cậu nhìn vào tấm ảnh biểu đồ của cậu lúc nãy, cậu cũng đã bật sẵn Bollinger Bands (đường biên trên/dưới màu hồng tím ôm lấy nến) rồi đấy!</w:t>
+      </w:r>
+    </w:p>
+    <w:p>
+      <w:r>
+        <w:t>Về mặt cấu tạo standard, BB gồm 3 đường:</w:t>
+      </w:r>
+    </w:p>
+    <w:p>
+      <w:pPr>
+        <w:numPr>
+          <w:ilvl w:val="0"/>
+          <w:numId w:val="6"/>
+        </w:numPr>
+      </w:pPr>
+      <w:r>
+        <w:rPr>
+          <w:b/>
+          <w:bCs/>
+        </w:rPr>
+        <w:t>Đường giữa (Middle Band):</w:t>
+      </w:r>
+      <w:r>
+        <w:t xml:space="preserve"> Thường là SMA 20 của giá.</w:t>
+      </w:r>
+    </w:p>
+    <w:p>
+      <w:pPr>
+        <w:numPr>
+          <w:ilvl w:val="0"/>
+          <w:numId w:val="6"/>
+        </w:numPr>
+      </w:pPr>
+      <w:r>
+        <w:rPr>
+          <w:b/>
+          <w:bCs/>
+        </w:rPr>
+        <w:t>Đường biên trên (Upper Band):</w:t>
+      </w:r>
+      <w:r>
+        <w:t xml:space="preserve"> Đường giữa + 2 lần độ lệch chuẩn (Standard Deviation).</w:t>
+      </w:r>
+    </w:p>
+    <w:p>
+      <w:pPr>
+        <w:numPr>
+          <w:ilvl w:val="0"/>
+          <w:numId w:val="6"/>
+        </w:numPr>
+      </w:pPr>
+      <w:r>
+        <w:rPr>
+          <w:b/>
+          <w:bCs/>
+        </w:rPr>
+        <w:t>Đường biên dưới (Lower Band):</w:t>
+      </w:r>
+      <w:r>
+        <w:t xml:space="preserve"> Đường giữa - 2 lần độ lệch chuẩn.</w:t>
+      </w:r>
+    </w:p>
+    <w:p>
+      <w:r>
+        <w:t>Các tín hiệu giao dịch cơ bản và kinh điển nhất của Bollinger Bands sẽ xoay quanh các trạng thái sau:</w:t>
+      </w:r>
+    </w:p>
+    <w:p>
+      <w:pPr>
+        <w:pStyle w:val="Heading2"/>
+      </w:pPr>
+      <w:r>
+        <w:t>1. Chiến lược Đánh đảo chiều (Mean Reversion) – Khi thị trường đi ngang (Sideway)</w:t>
+      </w:r>
+    </w:p>
+    <w:p>
+      <w:r>
+        <w:t xml:space="preserve">Bản chất của độ lệch chuẩn trong BB là giá sẽ có xu hướng dao động </w:t>
+      </w:r>
+      <w:r>
+        <w:rPr>
+          <w:b/>
+          <w:bCs/>
+        </w:rPr>
+        <w:t>95% thời gian ở bên trong lòng hai dải băng</w:t>
+      </w:r>
+      <w:r>
+        <w:t>. Do đó, khi thị trường không có trend mạnh, hai biên BB đóng vai trò như các vùng kháng cự/hỗ trợ động cực mạnh:</w:t>
+      </w:r>
+    </w:p>
+    <w:p>
+      <w:pPr>
+        <w:numPr>
+          <w:ilvl w:val="0"/>
+          <w:numId w:val="7"/>
+        </w:numPr>
+      </w:pPr>
+      <w:r>
+        <w:rPr>
+          <w:b/>
+          <w:bCs/>
+        </w:rPr>
+        <w:t>Tín hiệu BÁN (Sell):</w:t>
+      </w:r>
+      <w:r>
+        <w:t xml:space="preserve"> Khi nến tăng mạnh và </w:t>
+      </w:r>
+      <w:r>
+        <w:rPr>
+          <w:b/>
+          <w:bCs/>
+        </w:rPr>
+        <w:t>chạm hoặc đâm thủng ra ngoài biên trên (Upper Band)</w:t>
+      </w:r>
+      <w:r>
+        <w:t>, sau đó xuất hiện nến rút râu hoặc nến đảo chiều quay ngược vào trong vạch biên.</w:t>
+      </w:r>
+    </w:p>
+    <w:p>
+      <w:pPr>
+        <w:numPr>
+          <w:ilvl w:val="0"/>
+          <w:numId w:val="7"/>
+        </w:numPr>
+      </w:pPr>
+      <w:r>
+        <w:rPr>
+          <w:b/>
+          <w:bCs/>
+        </w:rPr>
+        <w:t>Tín hiệu MUA (Buy):</w:t>
+      </w:r>
+      <w:r>
+        <w:t xml:space="preserve"> Khi nến giảm mạnh và </w:t>
+      </w:r>
+      <w:r>
+        <w:rPr>
+          <w:b/>
+          <w:bCs/>
+        </w:rPr>
+        <w:t>chạm hoặc lao ra khỏi biên dưới (Lower Band)</w:t>
+      </w:r>
+      <w:r>
+        <w:t>, sau đó rút râu đi ngược lại vào trong.</w:t>
+      </w:r>
+    </w:p>
+    <w:p>
+      <w:pPr>
+        <w:numPr>
+          <w:ilvl w:val="0"/>
+          <w:numId w:val="7"/>
+        </w:numPr>
+      </w:pPr>
+      <w:r>
+        <w:rPr>
+          <w:b/>
+          <w:bCs/>
+        </w:rPr>
+        <w:t>Mục tiêu chốt lời (TP):</w:t>
+      </w:r>
+      <w:r>
+        <w:t xml:space="preserve"> Thường là đường giữa (Middle Band) hoặc biên đối diện.</w:t>
+      </w:r>
+    </w:p>
+    <w:p>
+      <w:pPr>
+        <w:pStyle w:val="Heading2"/>
+      </w:pPr>
+      <w:r>
+        <w:t>2. Chiến lược Đánh phá vỡ – Nút thắt cổ chai (The Bollinger Squeeze)</w:t>
+      </w:r>
+    </w:p>
+    <w:p>
+      <w:r>
+        <w:t>Đây là tín hiệu săn "bão lớn" cực kỳ được yêu thích.</w:t>
+      </w:r>
+    </w:p>
+    <w:p>
+      <w:pPr>
+        <w:numPr>
+          <w:ilvl w:val="0"/>
+          <w:numId w:val="8"/>
+        </w:numPr>
+      </w:pPr>
+      <w:r>
+        <w:rPr>
+          <w:b/>
+          <w:bCs/>
+        </w:rPr>
+        <w:lastRenderedPageBreak/>
+        <w:t>Trạng thái tích lũy:</w:t>
+      </w:r>
+      <w:r>
+        <w:t xml:space="preserve"> Khi thị trường im ắng, hai đường biên trên và biên dưới sẽ </w:t>
+      </w:r>
+      <w:r>
+        <w:rPr>
+          <w:b/>
+          <w:bCs/>
+        </w:rPr>
+        <w:t>co thắt lại cực kỳ hẹp</w:t>
+      </w:r>
+      <w:r>
+        <w:t>, nhìn giống như một cái cổ chai. Nó báo hiệu thị trường đang nén lực rất mạnh và sắp có một cú bùng nổ biến động (Volatility).</w:t>
+      </w:r>
+    </w:p>
+    <w:p>
+      <w:pPr>
+        <w:numPr>
+          <w:ilvl w:val="0"/>
+          <w:numId w:val="8"/>
+        </w:numPr>
+      </w:pPr>
+      <w:r>
+        <w:rPr>
+          <w:b/>
+          <w:bCs/>
+        </w:rPr>
+        <w:t>Tín hiệu VÀO LỆNH:</w:t>
+      </w:r>
+    </w:p>
+    <w:p>
+      <w:pPr>
+        <w:numPr>
+          <w:ilvl w:val="1"/>
+          <w:numId w:val="8"/>
+        </w:numPr>
+      </w:pPr>
+      <w:r>
+        <w:rPr>
+          <w:b/>
+          <w:bCs/>
+        </w:rPr>
+        <w:t>BUY:</w:t>
+      </w:r>
+      <w:r>
+        <w:t xml:space="preserve"> Nếu một cây nến bất ngờ phá vỡ và </w:t>
+      </w:r>
+      <w:r>
+        <w:rPr>
+          <w:b/>
+          <w:bCs/>
+        </w:rPr>
+        <w:t>đóng cửa nằm hẳn HOÀN TOÀN phía trên biên trên</w:t>
+      </w:r>
+      <w:r>
+        <w:t xml:space="preserve">, đồng thời hai dải băng BB bắt đầu "mở miệng" loe rộng ra hai phía </w:t>
+      </w:r>
+      <m:oMath>
+        <m:r>
+          <w:rPr>
+            <w:rFonts w:ascii="Cambria Math" w:hAnsi="Cambria Math"/>
+          </w:rPr>
+          <m:t>→</m:t>
+        </m:r>
+      </m:oMath>
+      <w:r>
+        <w:t xml:space="preserve"> Vào lệnh Buy để ăn trọn con trend tăng mới.</w:t>
+      </w:r>
+    </w:p>
+    <w:p>
+      <w:pPr>
+        <w:numPr>
+          <w:ilvl w:val="1"/>
+          <w:numId w:val="8"/>
+        </w:numPr>
+      </w:pPr>
+      <w:r>
+        <w:rPr>
+          <w:b/>
+          <w:bCs/>
+        </w:rPr>
+        <w:t>SELL:</w:t>
+      </w:r>
+      <w:r>
+        <w:t xml:space="preserve"> Nếu nến phá vỡ và </w:t>
+      </w:r>
+      <w:r>
+        <w:rPr>
+          <w:b/>
+          <w:bCs/>
+        </w:rPr>
+        <w:t>đóng cửa nằm hẳn dưới biên dưới</w:t>
+      </w:r>
+      <w:r>
+        <w:t xml:space="preserve">, BB loe rộng ra </w:t>
+      </w:r>
+      <m:oMath>
+        <m:r>
+          <w:rPr>
+            <w:rFonts w:ascii="Cambria Math" w:hAnsi="Cambria Math"/>
+          </w:rPr>
+          <m:t>→</m:t>
+        </m:r>
+      </m:oMath>
+      <w:r>
+        <w:t xml:space="preserve"> Vào lệnh Sell theo trend giảm mạnh.</w:t>
+      </w:r>
+    </w:p>
+    <w:p>
+      <w:pPr>
+        <w:pStyle w:val="Heading2"/>
+      </w:pPr>
+      <w:r>
+        <w:t>3. Tín hiệu Tiếp diễn xu hướng với Đường Giữa (Middle Band)</w:t>
+      </w:r>
+    </w:p>
+    <w:p>
+      <w:r>
+        <w:t>Khi thị trường đã hình thành một xu hướng rõ ràng và hai dải BB đang hướng lên hoặc hướng xuống:</w:t>
+      </w:r>
+    </w:p>
+    <w:p>
+      <w:pPr>
+        <w:numPr>
+          <w:ilvl w:val="0"/>
+          <w:numId w:val="9"/>
+        </w:numPr>
+      </w:pPr>
+      <w:r>
+        <w:rPr>
+          <w:b/>
+          <w:bCs/>
+        </w:rPr>
+        <w:t>Trong xu hướng TĂNG:</w:t>
+      </w:r>
+      <w:r>
+        <w:t xml:space="preserve"> Đường giữa (SMA 20) đóng vai trò là một đường hỗ trợ. Mỗi khi giá điều chỉnh giảm về chạm đường giữa rồi bật lên, đó chính là </w:t>
+      </w:r>
+      <w:r>
+        <w:rPr>
+          <w:b/>
+          <w:bCs/>
+        </w:rPr>
+        <w:t>tín hiệu MUA tiếp diễn (Buy Pullback)</w:t>
+      </w:r>
+      <w:r>
+        <w:t>.</w:t>
+      </w:r>
+    </w:p>
+    <w:p>
+      <w:pPr>
+        <w:numPr>
+          <w:ilvl w:val="0"/>
+          <w:numId w:val="9"/>
+        </w:numPr>
+      </w:pPr>
+      <w:r>
+        <w:rPr>
+          <w:b/>
+          <w:bCs/>
+        </w:rPr>
+        <w:t>Trong xu hướng GIẢM:</w:t>
+      </w:r>
+      <w:r>
+        <w:t xml:space="preserve"> Đường giữa đóng vai trò là kháng cự. Giá hồi phục tăng chạm đường giữa rồi quay đầu giảm sẽ cho </w:t>
+      </w:r>
+      <w:r>
+        <w:rPr>
+          <w:b/>
+          <w:bCs/>
+        </w:rPr>
+        <w:t>tín hiệu BÁN tiếp diễn (Sell Pullback)</w:t>
+      </w:r>
+      <w:r>
+        <w:t>.</w:t>
+      </w:r>
+    </w:p>
+    <w:p/>
+    <w:p>
       <w:pPr>
         <w:pStyle w:val="Heading2"/>
       </w:pPr>
@@ -1388,7 +1804,6 @@
         <w:pStyle w:val="Heading1"/>
       </w:pPr>
       <w:r>
-        <w:lastRenderedPageBreak/>
         <w:t>ATR</w:t>
       </w:r>
     </w:p>
@@ -1524,6 +1939,7 @@
     </w:p>
     <w:p>
       <w:r>
+        <w:lastRenderedPageBreak/>
         <w:t>If there is not a previous ATR calculated, you must use:</w:t>
       </w:r>
     </w:p>
@@ -2668,6 +3084,7 @@
           <w:sz w:val="28"/>
           <w:szCs w:val="28"/>
         </w:rPr>
+        <w:lastRenderedPageBreak/>
         <w:t xml:space="preserve">Trong </w:t>
       </w:r>
       <w:r>
@@ -3242,7 +3659,6 @@
         <w:pStyle w:val="Heading2"/>
       </w:pPr>
       <w:r>
-        <w:lastRenderedPageBreak/>
         <w:t xml:space="preserve">Parabolic SAR </w:t>
       </w:r>
       <w:commentRangeStart w:id="0"/>
@@ -3348,6 +3764,7 @@
         </w:numPr>
       </w:pPr>
       <w:r>
+        <w:lastRenderedPageBreak/>
         <w:t xml:space="preserve">Acceleration Factor (AF): Starting at .02, AF increases by .02 each time the extreme point makes a new high. AF can reach a maximum of .20, no matter how long the </w:t>
       </w:r>
       <w:r>
@@ -3655,7 +4072,7 @@
           <w:szCs w:val="28"/>
         </w:rPr>
         <w:drawing>
-          <wp:anchor distT="0" distB="0" distL="114300" distR="114300" simplePos="0" relativeHeight="251665408" behindDoc="1" locked="0" layoutInCell="1" allowOverlap="1" wp14:anchorId="10B02EAA" wp14:editId="70A34698">
+          <wp:anchor distT="0" distB="0" distL="114300" distR="114300" simplePos="0" relativeHeight="251665408" behindDoc="1" locked="0" layoutInCell="1" allowOverlap="1" wp14:anchorId="10B02EAA" wp14:editId="68C2AF63">
             <wp:simplePos x="0" y="0"/>
             <wp:positionH relativeFrom="column">
               <wp:posOffset>10160</wp:posOffset>
@@ -3802,7 +4219,7 @@
           <w:szCs w:val="28"/>
         </w:rPr>
         <w:drawing>
-          <wp:anchor distT="0" distB="0" distL="114300" distR="114300" simplePos="0" relativeHeight="251666432" behindDoc="1" locked="0" layoutInCell="1" allowOverlap="1" wp14:anchorId="72C51BA0" wp14:editId="57AF06C3">
+          <wp:anchor distT="0" distB="0" distL="114300" distR="114300" simplePos="0" relativeHeight="251666432" behindDoc="1" locked="0" layoutInCell="1" allowOverlap="1" wp14:anchorId="72C51BA0" wp14:editId="4BDFEE38">
             <wp:simplePos x="0" y="0"/>
             <wp:positionH relativeFrom="column">
               <wp:posOffset>-40640</wp:posOffset>
@@ -4263,6 +4680,7 @@
           <w:sz w:val="28"/>
           <w:szCs w:val="28"/>
         </w:rPr>
+        <w:lastRenderedPageBreak/>
         <w:t xml:space="preserve">2. </w:t>
       </w:r>
       <w:hyperlink r:id="rId32" w:history="1">
@@ -4621,7 +5039,6 @@
         <w:rPr>
           <w:rFonts w:eastAsiaTheme="minorEastAsia"/>
         </w:rPr>
-        <w:lastRenderedPageBreak/>
         <w:t>Alligator</w:t>
       </w:r>
     </w:p>
@@ -4739,6 +5156,155 @@
 <file path=word/numbering.xml><?xml version="1.0" encoding="utf-8"?>
 <w:numbering xmlns:wpc="http://schemas.microsoft.com/office/word/2010/wordprocessingCanvas" xmlns:cx="http://schemas.microsoft.com/office/drawing/2014/chartex" xmlns:cx1="http://schemas.microsoft.com/office/drawing/2015/9/8/chartex" xmlns:cx2="http://schemas.microsoft.com/office/drawing/2015/10/21/chartex" xmlns:cx3="http://schemas.microsoft.com/office/drawing/2016/5/9/chartex" xmlns:cx4="http://schemas.microsoft.com/office/drawing/2016/5/10/chartex" xmlns:cx5="http://schemas.microsoft.com/office/drawing/2016/5/11/chartex" xmlns:cx6="http://schemas.microsoft.com/office/drawing/2016/5/12/chartex" xmlns:cx7="http://schemas.microsoft.com/office/drawing/2016/5/13/chartex" xmlns:cx8="http://schemas.microsoft.com/office/drawing/2016/5/14/chartex" xmlns:mc="http://schemas.openxmlformats.org/markup-compatibility/2006" xmlns:aink="http://schemas.microsoft.com/office/drawing/2016/ink" xmlns:am3d="http://schemas.microsoft.com/office/drawing/2017/model3d" xmlns:o="urn:schemas-microsoft-com:office:office" xmlns:oel="http://schemas.microsoft.com/office/2019/extlst" xmlns:r="http://schemas.openxmlformats.org/officeDocument/2006/relationships" xmlns:m="http://schemas.openxmlformats.org/officeDocument/2006/math" xmlns:v="urn:schemas-microsoft-com:vml" xmlns:wp14="http://schemas.microsoft.com/office/word/2010/wordprocessingDrawing" xmlns:wp="http://schemas.openxmlformats.org/drawingml/2006/wordprocessingDrawing" xmlns:w10="urn:schemas-microsoft-com:office:word" xmlns:w="http://schemas.openxmlformats.org/wordprocessingml/2006/main" xmlns:w14="http://schemas.microsoft.com/office/word/2010/wordml" xmlns:w15="http://schemas.microsoft.com/office/word/2012/wordml" xmlns:w16cex="http://schemas.microsoft.com/office/word/2018/wordml/cex" xmlns:w16cid="http://schemas.microsoft.com/office/word/2016/wordml/cid" xmlns:w16="http://schemas.microsoft.com/office/word/2018/wordml" xmlns:w16du="http://schemas.microsoft.com/office/word/2023/wordml/word16du" xmlns:w16sdtdh="http://schemas.microsoft.com/office/word/2020/wordml/sdtdatahash" xmlns:w16sdtfl="http://schemas.microsoft.com/office/word/2024/wordml/sdtformatlock" xmlns:w16se="http://schemas.microsoft.com/office/word/2015/wordml/symex" xmlns:wpg="http://schemas.microsoft.com/office/word/2010/wordprocessingGroup" xmlns:wpi="http://schemas.microsoft.com/office/word/2010/wordprocessingInk" xmlns:wne="http://schemas.microsoft.com/office/word/2006/wordml" xmlns:wps="http://schemas.microsoft.com/office/word/2010/wordprocessingShape" mc:Ignorable="w14 w15 w16se w16cid w16 w16cex w16sdtdh w16sdtfl w16du wp14">
   <w:abstractNum w:abstractNumId="0" w15:restartNumberingAfterBreak="0">
+    <w:nsid w:val="04EE3E1D"/>
+    <w:multiLevelType w:val="multilevel"/>
+    <w:tmpl w:val="4E20A216"/>
+    <w:lvl w:ilvl="0">
+      <w:start w:val="1"/>
+      <w:numFmt w:val="bullet"/>
+      <w:lvlText w:val=""/>
+      <w:lvlJc w:val="left"/>
+      <w:pPr>
+        <w:tabs>
+          <w:tab w:val="num" w:pos="720"/>
+        </w:tabs>
+        <w:ind w:left="720" w:hanging="360"/>
+      </w:pPr>
+      <w:rPr>
+        <w:rFonts w:ascii="Symbol" w:hAnsi="Symbol" w:hint="default"/>
+        <w:sz w:val="20"/>
+      </w:rPr>
+    </w:lvl>
+    <w:lvl w:ilvl="1" w:tentative="1">
+      <w:start w:val="1"/>
+      <w:numFmt w:val="bullet"/>
+      <w:lvlText w:val="o"/>
+      <w:lvlJc w:val="left"/>
+      <w:pPr>
+        <w:tabs>
+          <w:tab w:val="num" w:pos="1440"/>
+        </w:tabs>
+        <w:ind w:left="1440" w:hanging="360"/>
+      </w:pPr>
+      <w:rPr>
+        <w:rFonts w:ascii="Courier New" w:hAnsi="Courier New" w:hint="default"/>
+        <w:sz w:val="20"/>
+      </w:rPr>
+    </w:lvl>
+    <w:lvl w:ilvl="2" w:tentative="1">
+      <w:start w:val="1"/>
+      <w:numFmt w:val="bullet"/>
+      <w:lvlText w:val=""/>
+      <w:lvlJc w:val="left"/>
+      <w:pPr>
+        <w:tabs>
+          <w:tab w:val="num" w:pos="2160"/>
+        </w:tabs>
+        <w:ind w:left="2160" w:hanging="360"/>
+      </w:pPr>
+      <w:rPr>
+        <w:rFonts w:ascii="Wingdings" w:hAnsi="Wingdings" w:hint="default"/>
+        <w:sz w:val="20"/>
+      </w:rPr>
+    </w:lvl>
+    <w:lvl w:ilvl="3" w:tentative="1">
+      <w:start w:val="1"/>
+      <w:numFmt w:val="bullet"/>
+      <w:lvlText w:val=""/>
+      <w:lvlJc w:val="left"/>
+      <w:pPr>
+        <w:tabs>
+          <w:tab w:val="num" w:pos="2880"/>
+        </w:tabs>
+        <w:ind w:left="2880" w:hanging="360"/>
+      </w:pPr>
+      <w:rPr>
+        <w:rFonts w:ascii="Wingdings" w:hAnsi="Wingdings" w:hint="default"/>
+        <w:sz w:val="20"/>
+      </w:rPr>
+    </w:lvl>
+    <w:lvl w:ilvl="4" w:tentative="1">
+      <w:start w:val="1"/>
+      <w:numFmt w:val="bullet"/>
+      <w:lvlText w:val=""/>
+      <w:lvlJc w:val="left"/>
+      <w:pPr>
+        <w:tabs>
+          <w:tab w:val="num" w:pos="3600"/>
+        </w:tabs>
+        <w:ind w:left="3600" w:hanging="360"/>
+      </w:pPr>
+      <w:rPr>
+        <w:rFonts w:ascii="Wingdings" w:hAnsi="Wingdings" w:hint="default"/>
+        <w:sz w:val="20"/>
+      </w:rPr>
+    </w:lvl>
+    <w:lvl w:ilvl="5" w:tentative="1">
+      <w:start w:val="1"/>
+      <w:numFmt w:val="bullet"/>
+      <w:lvlText w:val=""/>
+      <w:lvlJc w:val="left"/>
+      <w:pPr>
+        <w:tabs>
+          <w:tab w:val="num" w:pos="4320"/>
+        </w:tabs>
+        <w:ind w:left="4320" w:hanging="360"/>
+      </w:pPr>
+      <w:rPr>
+        <w:rFonts w:ascii="Wingdings" w:hAnsi="Wingdings" w:hint="default"/>
+        <w:sz w:val="20"/>
+      </w:rPr>
+    </w:lvl>
+    <w:lvl w:ilvl="6" w:tentative="1">
+      <w:start w:val="1"/>
+      <w:numFmt w:val="bullet"/>
+      <w:lvlText w:val=""/>
+      <w:lvlJc w:val="left"/>
+      <w:pPr>
+        <w:tabs>
+          <w:tab w:val="num" w:pos="5040"/>
+        </w:tabs>
+        <w:ind w:left="5040" w:hanging="360"/>
+      </w:pPr>
+      <w:rPr>
+        <w:rFonts w:ascii="Wingdings" w:hAnsi="Wingdings" w:hint="default"/>
+        <w:sz w:val="20"/>
+      </w:rPr>
+    </w:lvl>
+    <w:lvl w:ilvl="7" w:tentative="1">
+      <w:start w:val="1"/>
+      <w:numFmt w:val="bullet"/>
+      <w:lvlText w:val=""/>
+      <w:lvlJc w:val="left"/>
+      <w:pPr>
+        <w:tabs>
+          <w:tab w:val="num" w:pos="5760"/>
+        </w:tabs>
+        <w:ind w:left="5760" w:hanging="360"/>
+      </w:pPr>
+      <w:rPr>
+        <w:rFonts w:ascii="Wingdings" w:hAnsi="Wingdings" w:hint="default"/>
+        <w:sz w:val="20"/>
+      </w:rPr>
+    </w:lvl>
+    <w:lvl w:ilvl="8" w:tentative="1">
+      <w:start w:val="1"/>
+      <w:numFmt w:val="bullet"/>
+      <w:lvlText w:val=""/>
+      <w:lvlJc w:val="left"/>
+      <w:pPr>
+        <w:tabs>
+          <w:tab w:val="num" w:pos="6480"/>
+        </w:tabs>
+        <w:ind w:left="6480" w:hanging="360"/>
+      </w:pPr>
+      <w:rPr>
+        <w:rFonts w:ascii="Wingdings" w:hAnsi="Wingdings" w:hint="default"/>
+        <w:sz w:val="20"/>
+      </w:rPr>
+    </w:lvl>
+  </w:abstractNum>
+  <w:abstractNum w:abstractNumId="1" w15:restartNumberingAfterBreak="0">
     <w:nsid w:val="14930C21"/>
     <w:multiLevelType w:val="multilevel"/>
     <w:tmpl w:val="DD2C5B3E"/>
@@ -4887,7 +5453,156 @@
       </w:rPr>
     </w:lvl>
   </w:abstractNum>
-  <w:abstractNum w:abstractNumId="1" w15:restartNumberingAfterBreak="0">
+  <w:abstractNum w:abstractNumId="2" w15:restartNumberingAfterBreak="0">
+    <w:nsid w:val="2BF51C92"/>
+    <w:multiLevelType w:val="multilevel"/>
+    <w:tmpl w:val="8F5C50C8"/>
+    <w:lvl w:ilvl="0">
+      <w:start w:val="1"/>
+      <w:numFmt w:val="bullet"/>
+      <w:lvlText w:val=""/>
+      <w:lvlJc w:val="left"/>
+      <w:pPr>
+        <w:tabs>
+          <w:tab w:val="num" w:pos="720"/>
+        </w:tabs>
+        <w:ind w:left="720" w:hanging="360"/>
+      </w:pPr>
+      <w:rPr>
+        <w:rFonts w:ascii="Symbol" w:hAnsi="Symbol" w:hint="default"/>
+        <w:sz w:val="20"/>
+      </w:rPr>
+    </w:lvl>
+    <w:lvl w:ilvl="1" w:tentative="1">
+      <w:start w:val="1"/>
+      <w:numFmt w:val="bullet"/>
+      <w:lvlText w:val="o"/>
+      <w:lvlJc w:val="left"/>
+      <w:pPr>
+        <w:tabs>
+          <w:tab w:val="num" w:pos="1440"/>
+        </w:tabs>
+        <w:ind w:left="1440" w:hanging="360"/>
+      </w:pPr>
+      <w:rPr>
+        <w:rFonts w:ascii="Courier New" w:hAnsi="Courier New" w:hint="default"/>
+        <w:sz w:val="20"/>
+      </w:rPr>
+    </w:lvl>
+    <w:lvl w:ilvl="2" w:tentative="1">
+      <w:start w:val="1"/>
+      <w:numFmt w:val="bullet"/>
+      <w:lvlText w:val=""/>
+      <w:lvlJc w:val="left"/>
+      <w:pPr>
+        <w:tabs>
+          <w:tab w:val="num" w:pos="2160"/>
+        </w:tabs>
+        <w:ind w:left="2160" w:hanging="360"/>
+      </w:pPr>
+      <w:rPr>
+        <w:rFonts w:ascii="Wingdings" w:hAnsi="Wingdings" w:hint="default"/>
+        <w:sz w:val="20"/>
+      </w:rPr>
+    </w:lvl>
+    <w:lvl w:ilvl="3" w:tentative="1">
+      <w:start w:val="1"/>
+      <w:numFmt w:val="bullet"/>
+      <w:lvlText w:val=""/>
+      <w:lvlJc w:val="left"/>
+      <w:pPr>
+        <w:tabs>
+          <w:tab w:val="num" w:pos="2880"/>
+        </w:tabs>
+        <w:ind w:left="2880" w:hanging="360"/>
+      </w:pPr>
+      <w:rPr>
+        <w:rFonts w:ascii="Wingdings" w:hAnsi="Wingdings" w:hint="default"/>
+        <w:sz w:val="20"/>
+      </w:rPr>
+    </w:lvl>
+    <w:lvl w:ilvl="4" w:tentative="1">
+      <w:start w:val="1"/>
+      <w:numFmt w:val="bullet"/>
+      <w:lvlText w:val=""/>
+      <w:lvlJc w:val="left"/>
+      <w:pPr>
+        <w:tabs>
+          <w:tab w:val="num" w:pos="3600"/>
+        </w:tabs>
+        <w:ind w:left="3600" w:hanging="360"/>
+      </w:pPr>
+      <w:rPr>
+        <w:rFonts w:ascii="Wingdings" w:hAnsi="Wingdings" w:hint="default"/>
+        <w:sz w:val="20"/>
+      </w:rPr>
+    </w:lvl>
+    <w:lvl w:ilvl="5" w:tentative="1">
+      <w:start w:val="1"/>
+      <w:numFmt w:val="bullet"/>
+      <w:lvlText w:val=""/>
+      <w:lvlJc w:val="left"/>
+      <w:pPr>
+        <w:tabs>
+          <w:tab w:val="num" w:pos="4320"/>
+        </w:tabs>
+        <w:ind w:left="4320" w:hanging="360"/>
+      </w:pPr>
+      <w:rPr>
+        <w:rFonts w:ascii="Wingdings" w:hAnsi="Wingdings" w:hint="default"/>
+        <w:sz w:val="20"/>
+      </w:rPr>
+    </w:lvl>
+    <w:lvl w:ilvl="6" w:tentative="1">
+      <w:start w:val="1"/>
+      <w:numFmt w:val="bullet"/>
+      <w:lvlText w:val=""/>
+      <w:lvlJc w:val="left"/>
+      <w:pPr>
+        <w:tabs>
+          <w:tab w:val="num" w:pos="5040"/>
+        </w:tabs>
+        <w:ind w:left="5040" w:hanging="360"/>
+      </w:pPr>
+      <w:rPr>
+        <w:rFonts w:ascii="Wingdings" w:hAnsi="Wingdings" w:hint="default"/>
+        <w:sz w:val="20"/>
+      </w:rPr>
+    </w:lvl>
+    <w:lvl w:ilvl="7" w:tentative="1">
+      <w:start w:val="1"/>
+      <w:numFmt w:val="bullet"/>
+      <w:lvlText w:val=""/>
+      <w:lvlJc w:val="left"/>
+      <w:pPr>
+        <w:tabs>
+          <w:tab w:val="num" w:pos="5760"/>
+        </w:tabs>
+        <w:ind w:left="5760" w:hanging="360"/>
+      </w:pPr>
+      <w:rPr>
+        <w:rFonts w:ascii="Wingdings" w:hAnsi="Wingdings" w:hint="default"/>
+        <w:sz w:val="20"/>
+      </w:rPr>
+    </w:lvl>
+    <w:lvl w:ilvl="8" w:tentative="1">
+      <w:start w:val="1"/>
+      <w:numFmt w:val="bullet"/>
+      <w:lvlText w:val=""/>
+      <w:lvlJc w:val="left"/>
+      <w:pPr>
+        <w:tabs>
+          <w:tab w:val="num" w:pos="6480"/>
+        </w:tabs>
+        <w:ind w:left="6480" w:hanging="360"/>
+      </w:pPr>
+      <w:rPr>
+        <w:rFonts w:ascii="Wingdings" w:hAnsi="Wingdings" w:hint="default"/>
+        <w:sz w:val="20"/>
+      </w:rPr>
+    </w:lvl>
+  </w:abstractNum>
+  <w:abstractNum w:abstractNumId="3" w15:restartNumberingAfterBreak="0">
     <w:nsid w:val="45D37485"/>
     <w:multiLevelType w:val="hybridMultilevel"/>
     <w:tmpl w:val="0FBCDE32"/>
@@ -5000,7 +5715,7 @@
       </w:rPr>
     </w:lvl>
   </w:abstractNum>
-  <w:abstractNum w:abstractNumId="2" w15:restartNumberingAfterBreak="0">
+  <w:abstractNum w:abstractNumId="4" w15:restartNumberingAfterBreak="0">
     <w:nsid w:val="47EA1A93"/>
     <w:multiLevelType w:val="multilevel"/>
     <w:tmpl w:val="5EF674B8"/>
@@ -5149,7 +5864,7 @@
       </w:rPr>
     </w:lvl>
   </w:abstractNum>
-  <w:abstractNum w:abstractNumId="3" w15:restartNumberingAfterBreak="0">
+  <w:abstractNum w:abstractNumId="5" w15:restartNumberingAfterBreak="0">
     <w:nsid w:val="6A8A7D45"/>
     <w:multiLevelType w:val="multilevel"/>
     <w:tmpl w:val="2E72109A"/>
@@ -5298,7 +6013,156 @@
       </w:rPr>
     </w:lvl>
   </w:abstractNum>
-  <w:abstractNum w:abstractNumId="4" w15:restartNumberingAfterBreak="0">
+  <w:abstractNum w:abstractNumId="6" w15:restartNumberingAfterBreak="0">
+    <w:nsid w:val="70890C93"/>
+    <w:multiLevelType w:val="multilevel"/>
+    <w:tmpl w:val="2D381E6C"/>
+    <w:lvl w:ilvl="0">
+      <w:start w:val="1"/>
+      <w:numFmt w:val="bullet"/>
+      <w:lvlText w:val=""/>
+      <w:lvlJc w:val="left"/>
+      <w:pPr>
+        <w:tabs>
+          <w:tab w:val="num" w:pos="720"/>
+        </w:tabs>
+        <w:ind w:left="720" w:hanging="360"/>
+      </w:pPr>
+      <w:rPr>
+        <w:rFonts w:ascii="Symbol" w:hAnsi="Symbol" w:hint="default"/>
+        <w:sz w:val="20"/>
+      </w:rPr>
+    </w:lvl>
+    <w:lvl w:ilvl="1">
+      <w:start w:val="1"/>
+      <w:numFmt w:val="bullet"/>
+      <w:lvlText w:val="o"/>
+      <w:lvlJc w:val="left"/>
+      <w:pPr>
+        <w:tabs>
+          <w:tab w:val="num" w:pos="1440"/>
+        </w:tabs>
+        <w:ind w:left="1440" w:hanging="360"/>
+      </w:pPr>
+      <w:rPr>
+        <w:rFonts w:ascii="Courier New" w:hAnsi="Courier New" w:hint="default"/>
+        <w:sz w:val="20"/>
+      </w:rPr>
+    </w:lvl>
+    <w:lvl w:ilvl="2" w:tentative="1">
+      <w:start w:val="1"/>
+      <w:numFmt w:val="bullet"/>
+      <w:lvlText w:val=""/>
+      <w:lvlJc w:val="left"/>
+      <w:pPr>
+        <w:tabs>
+          <w:tab w:val="num" w:pos="2160"/>
+        </w:tabs>
+        <w:ind w:left="2160" w:hanging="360"/>
+      </w:pPr>
+      <w:rPr>
+        <w:rFonts w:ascii="Wingdings" w:hAnsi="Wingdings" w:hint="default"/>
+        <w:sz w:val="20"/>
+      </w:rPr>
+    </w:lvl>
+    <w:lvl w:ilvl="3" w:tentative="1">
+      <w:start w:val="1"/>
+      <w:numFmt w:val="bullet"/>
+      <w:lvlText w:val=""/>
+      <w:lvlJc w:val="left"/>
+      <w:pPr>
+        <w:tabs>
+          <w:tab w:val="num" w:pos="2880"/>
+        </w:tabs>
+        <w:ind w:left="2880" w:hanging="360"/>
+      </w:pPr>
+      <w:rPr>
+        <w:rFonts w:ascii="Wingdings" w:hAnsi="Wingdings" w:hint="default"/>
+        <w:sz w:val="20"/>
+      </w:rPr>
+    </w:lvl>
+    <w:lvl w:ilvl="4" w:tentative="1">
+      <w:start w:val="1"/>
+      <w:numFmt w:val="bullet"/>
+      <w:lvlText w:val=""/>
+      <w:lvlJc w:val="left"/>
+      <w:pPr>
+        <w:tabs>
+          <w:tab w:val="num" w:pos="3600"/>
+        </w:tabs>
+        <w:ind w:left="3600" w:hanging="360"/>
+      </w:pPr>
+      <w:rPr>
+        <w:rFonts w:ascii="Wingdings" w:hAnsi="Wingdings" w:hint="default"/>
+        <w:sz w:val="20"/>
+      </w:rPr>
+    </w:lvl>
+    <w:lvl w:ilvl="5" w:tentative="1">
+      <w:start w:val="1"/>
+      <w:numFmt w:val="bullet"/>
+      <w:lvlText w:val=""/>
+      <w:lvlJc w:val="left"/>
+      <w:pPr>
+        <w:tabs>
+          <w:tab w:val="num" w:pos="4320"/>
+        </w:tabs>
+        <w:ind w:left="4320" w:hanging="360"/>
+      </w:pPr>
+      <w:rPr>
+        <w:rFonts w:ascii="Wingdings" w:hAnsi="Wingdings" w:hint="default"/>
+        <w:sz w:val="20"/>
+      </w:rPr>
+    </w:lvl>
+    <w:lvl w:ilvl="6" w:tentative="1">
+      <w:start w:val="1"/>
+      <w:numFmt w:val="bullet"/>
+      <w:lvlText w:val=""/>
+      <w:lvlJc w:val="left"/>
+      <w:pPr>
+        <w:tabs>
+          <w:tab w:val="num" w:pos="5040"/>
+        </w:tabs>
+        <w:ind w:left="5040" w:hanging="360"/>
+      </w:pPr>
+      <w:rPr>
+        <w:rFonts w:ascii="Wingdings" w:hAnsi="Wingdings" w:hint="default"/>
+        <w:sz w:val="20"/>
+      </w:rPr>
+    </w:lvl>
+    <w:lvl w:ilvl="7" w:tentative="1">
+      <w:start w:val="1"/>
+      <w:numFmt w:val="bullet"/>
+      <w:lvlText w:val=""/>
+      <w:lvlJc w:val="left"/>
+      <w:pPr>
+        <w:tabs>
+          <w:tab w:val="num" w:pos="5760"/>
+        </w:tabs>
+        <w:ind w:left="5760" w:hanging="360"/>
+      </w:pPr>
+      <w:rPr>
+        <w:rFonts w:ascii="Wingdings" w:hAnsi="Wingdings" w:hint="default"/>
+        <w:sz w:val="20"/>
+      </w:rPr>
+    </w:lvl>
+    <w:lvl w:ilvl="8" w:tentative="1">
+      <w:start w:val="1"/>
+      <w:numFmt w:val="bullet"/>
+      <w:lvlText w:val=""/>
+      <w:lvlJc w:val="left"/>
+      <w:pPr>
+        <w:tabs>
+          <w:tab w:val="num" w:pos="6480"/>
+        </w:tabs>
+        <w:ind w:left="6480" w:hanging="360"/>
+      </w:pPr>
+      <w:rPr>
+        <w:rFonts w:ascii="Wingdings" w:hAnsi="Wingdings" w:hint="default"/>
+        <w:sz w:val="20"/>
+      </w:rPr>
+    </w:lvl>
+  </w:abstractNum>
+  <w:abstractNum w:abstractNumId="7" w15:restartNumberingAfterBreak="0">
     <w:nsid w:val="70D44F24"/>
     <w:multiLevelType w:val="hybridMultilevel"/>
     <w:tmpl w:val="A8BE01A0"/>
@@ -5411,20 +6275,181 @@
       </w:rPr>
     </w:lvl>
   </w:abstractNum>
+  <w:abstractNum w:abstractNumId="8" w15:restartNumberingAfterBreak="0">
+    <w:nsid w:val="7A5F58A8"/>
+    <w:multiLevelType w:val="multilevel"/>
+    <w:tmpl w:val="E59C42FE"/>
+    <w:lvl w:ilvl="0">
+      <w:start w:val="1"/>
+      <w:numFmt w:val="bullet"/>
+      <w:lvlText w:val=""/>
+      <w:lvlJc w:val="left"/>
+      <w:pPr>
+        <w:tabs>
+          <w:tab w:val="num" w:pos="720"/>
+        </w:tabs>
+        <w:ind w:left="720" w:hanging="360"/>
+      </w:pPr>
+      <w:rPr>
+        <w:rFonts w:ascii="Symbol" w:hAnsi="Symbol" w:hint="default"/>
+        <w:sz w:val="20"/>
+      </w:rPr>
+    </w:lvl>
+    <w:lvl w:ilvl="1" w:tentative="1">
+      <w:start w:val="1"/>
+      <w:numFmt w:val="bullet"/>
+      <w:lvlText w:val="o"/>
+      <w:lvlJc w:val="left"/>
+      <w:pPr>
+        <w:tabs>
+          <w:tab w:val="num" w:pos="1440"/>
+        </w:tabs>
+        <w:ind w:left="1440" w:hanging="360"/>
+      </w:pPr>
+      <w:rPr>
+        <w:rFonts w:ascii="Courier New" w:hAnsi="Courier New" w:hint="default"/>
+        <w:sz w:val="20"/>
+      </w:rPr>
+    </w:lvl>
+    <w:lvl w:ilvl="2" w:tentative="1">
+      <w:start w:val="1"/>
+      <w:numFmt w:val="bullet"/>
+      <w:lvlText w:val=""/>
+      <w:lvlJc w:val="left"/>
+      <w:pPr>
+        <w:tabs>
+          <w:tab w:val="num" w:pos="2160"/>
+        </w:tabs>
+        <w:ind w:left="2160" w:hanging="360"/>
+      </w:pPr>
+      <w:rPr>
+        <w:rFonts w:ascii="Wingdings" w:hAnsi="Wingdings" w:hint="default"/>
+        <w:sz w:val="20"/>
+      </w:rPr>
+    </w:lvl>
+    <w:lvl w:ilvl="3" w:tentative="1">
+      <w:start w:val="1"/>
+      <w:numFmt w:val="bullet"/>
+      <w:lvlText w:val=""/>
+      <w:lvlJc w:val="left"/>
+      <w:pPr>
+        <w:tabs>
+          <w:tab w:val="num" w:pos="2880"/>
+        </w:tabs>
+        <w:ind w:left="2880" w:hanging="360"/>
+      </w:pPr>
+      <w:rPr>
+        <w:rFonts w:ascii="Wingdings" w:hAnsi="Wingdings" w:hint="default"/>
+        <w:sz w:val="20"/>
+      </w:rPr>
+    </w:lvl>
+    <w:lvl w:ilvl="4" w:tentative="1">
+      <w:start w:val="1"/>
+      <w:numFmt w:val="bullet"/>
+      <w:lvlText w:val=""/>
+      <w:lvlJc w:val="left"/>
+      <w:pPr>
+        <w:tabs>
+          <w:tab w:val="num" w:pos="3600"/>
+        </w:tabs>
+        <w:ind w:left="3600" w:hanging="360"/>
+      </w:pPr>
+      <w:rPr>
+        <w:rFonts w:ascii="Wingdings" w:hAnsi="Wingdings" w:hint="default"/>
+        <w:sz w:val="20"/>
+      </w:rPr>
+    </w:lvl>
+    <w:lvl w:ilvl="5" w:tentative="1">
+      <w:start w:val="1"/>
+      <w:numFmt w:val="bullet"/>
+      <w:lvlText w:val=""/>
+      <w:lvlJc w:val="left"/>
+      <w:pPr>
+        <w:tabs>
+          <w:tab w:val="num" w:pos="4320"/>
+        </w:tabs>
+        <w:ind w:left="4320" w:hanging="360"/>
+      </w:pPr>
+      <w:rPr>
+        <w:rFonts w:ascii="Wingdings" w:hAnsi="Wingdings" w:hint="default"/>
+        <w:sz w:val="20"/>
+      </w:rPr>
+    </w:lvl>
+    <w:lvl w:ilvl="6" w:tentative="1">
+      <w:start w:val="1"/>
+      <w:numFmt w:val="bullet"/>
+      <w:lvlText w:val=""/>
+      <w:lvlJc w:val="left"/>
+      <w:pPr>
+        <w:tabs>
+          <w:tab w:val="num" w:pos="5040"/>
+        </w:tabs>
+        <w:ind w:left="5040" w:hanging="360"/>
+      </w:pPr>
+      <w:rPr>
+        <w:rFonts w:ascii="Wingdings" w:hAnsi="Wingdings" w:hint="default"/>
+        <w:sz w:val="20"/>
+      </w:rPr>
+    </w:lvl>
+    <w:lvl w:ilvl="7" w:tentative="1">
+      <w:start w:val="1"/>
+      <w:numFmt w:val="bullet"/>
+      <w:lvlText w:val=""/>
+      <w:lvlJc w:val="left"/>
+      <w:pPr>
+        <w:tabs>
+          <w:tab w:val="num" w:pos="5760"/>
+        </w:tabs>
+        <w:ind w:left="5760" w:hanging="360"/>
+      </w:pPr>
+      <w:rPr>
+        <w:rFonts w:ascii="Wingdings" w:hAnsi="Wingdings" w:hint="default"/>
+        <w:sz w:val="20"/>
+      </w:rPr>
+    </w:lvl>
+    <w:lvl w:ilvl="8" w:tentative="1">
+      <w:start w:val="1"/>
+      <w:numFmt w:val="bullet"/>
+      <w:lvlText w:val=""/>
+      <w:lvlJc w:val="left"/>
+      <w:pPr>
+        <w:tabs>
+          <w:tab w:val="num" w:pos="6480"/>
+        </w:tabs>
+        <w:ind w:left="6480" w:hanging="360"/>
+      </w:pPr>
+      <w:rPr>
+        <w:rFonts w:ascii="Wingdings" w:hAnsi="Wingdings" w:hint="default"/>
+        <w:sz w:val="20"/>
+      </w:rPr>
+    </w:lvl>
+  </w:abstractNum>
   <w:num w:numId="1" w16cid:durableId="720716093">
-    <w:abstractNumId w:val="2"/>
+    <w:abstractNumId w:val="4"/>
   </w:num>
   <w:num w:numId="2" w16cid:durableId="1565094768">
-    <w:abstractNumId w:val="4"/>
+    <w:abstractNumId w:val="7"/>
   </w:num>
   <w:num w:numId="3" w16cid:durableId="1553081679">
+    <w:abstractNumId w:val="1"/>
+  </w:num>
+  <w:num w:numId="4" w16cid:durableId="1931426500">
+    <w:abstractNumId w:val="3"/>
+  </w:num>
+  <w:num w:numId="5" w16cid:durableId="867908142">
+    <w:abstractNumId w:val="5"/>
+  </w:num>
+  <w:num w:numId="6" w16cid:durableId="1192494456">
     <w:abstractNumId w:val="0"/>
   </w:num>
-  <w:num w:numId="4" w16cid:durableId="1931426500">
-    <w:abstractNumId w:val="1"/>
+  <w:num w:numId="7" w16cid:durableId="1049501997">
+    <w:abstractNumId w:val="8"/>
   </w:num>
-  <w:num w:numId="5" w16cid:durableId="867908142">
-    <w:abstractNumId w:val="3"/>
+  <w:num w:numId="8" w16cid:durableId="1334062879">
+    <w:abstractNumId w:val="6"/>
+  </w:num>
+  <w:num w:numId="9" w16cid:durableId="1246109169">
+    <w:abstractNumId w:val="2"/>
   </w:num>
 </w:numbering>
 </file>

</xml_diff>

<commit_message>
Reorgazine project after add feature on tab Position
</commit_message>
<xml_diff>
--- a/Experts/Anhnt/Document/Indicator/Indicator Strategy.docx
+++ b/Experts/Anhnt/Document/Indicator/Indicator Strategy.docx
@@ -210,7 +210,884 @@
     </w:p>
     <w:p>
       <w:pPr>
+        <w:pStyle w:val="Heading1"/>
+      </w:pPr>
+      <w:r>
+        <w:t>AMA</w:t>
+      </w:r>
+    </w:p>
+    <w:p>
+      <w:pPr>
         <w:pStyle w:val="Heading2"/>
+      </w:pPr>
+      <w:r>
+        <w:t>Bước 1: Tính Tỷ lệ Hiệu quả (Efficiency Ratio - ER)</w:t>
+      </w:r>
+    </w:p>
+    <w:p>
+      <w:r>
+        <w:t>ER dùng để đo lường mức độ biến động (nhiễu) của thị trường. Giá trị ER sẽ nằm trong khoảng từ 0 đến 1.</w:t>
+      </w:r>
+    </w:p>
+    <w:p>
+      <w:pPr>
+        <w:numPr>
+          <w:ilvl w:val="0"/>
+          <w:numId w:val="10"/>
+        </w:numPr>
+      </w:pPr>
+      <w:r>
+        <w:lastRenderedPageBreak/>
+        <w:t>Nếu thị trường đi xu hướng mạnh và thẳng đứng, ER tiến gần về 1.</w:t>
+      </w:r>
+    </w:p>
+    <w:p>
+      <w:pPr>
+        <w:numPr>
+          <w:ilvl w:val="0"/>
+          <w:numId w:val="10"/>
+        </w:numPr>
+      </w:pPr>
+      <w:r>
+        <w:t>Nếu thị trường đi ngang, răng cưa và nhiễu nhiều, ER tiến gần về 0.</w:t>
+      </w:r>
+    </w:p>
+    <w:p>
+      <w:r>
+        <w:t xml:space="preserve">Thông thường, chu kỳ mặc định được chọn là </w:t>
+      </w:r>
+      <m:oMath>
+        <m:r>
+          <w:rPr>
+            <w:rFonts w:ascii="Cambria Math" w:hAnsi="Cambria Math"/>
+          </w:rPr>
+          <m:t>n=10</m:t>
+        </m:r>
+      </m:oMath>
+      <w:r>
+        <w:t>.</w:t>
+      </w:r>
+    </w:p>
+    <w:p>
+      <m:oMathPara>
+        <m:oMath>
+          <m:r>
+            <w:rPr>
+              <w:rFonts w:ascii="Cambria Math" w:hAnsi="Cambria Math"/>
+            </w:rPr>
+            <m:t>ER=</m:t>
+          </m:r>
+          <m:f>
+            <m:fPr>
+              <m:ctrlPr>
+                <w:rPr>
+                  <w:rFonts w:ascii="Cambria Math" w:hAnsi="Cambria Math"/>
+                </w:rPr>
+              </m:ctrlPr>
+            </m:fPr>
+            <m:num>
+              <m:r>
+                <w:rPr>
+                  <w:rFonts w:ascii="Cambria Math" w:hAnsi="Cambria Math"/>
+                </w:rPr>
+                <m:t>|</m:t>
+              </m:r>
+              <m:r>
+                <m:rPr>
+                  <m:nor/>
+                </m:rPr>
+                <m:t>Giá hiện tại</m:t>
+              </m:r>
+              <m:r>
+                <w:rPr>
+                  <w:rFonts w:ascii="Cambria Math" w:hAnsi="Cambria Math"/>
+                </w:rPr>
+                <m:t>-</m:t>
+              </m:r>
+              <m:r>
+                <m:rPr>
+                  <m:nor/>
+                </m:rPr>
+                <m:t>Giá của </m:t>
+              </m:r>
+              <m:r>
+                <w:rPr>
+                  <w:rFonts w:ascii="Cambria Math" w:hAnsi="Cambria Math"/>
+                </w:rPr>
+                <m:t>n</m:t>
+              </m:r>
+              <m:r>
+                <m:rPr>
+                  <m:nor/>
+                </m:rPr>
+                <m:t> phiên trước</m:t>
+              </m:r>
+              <m:r>
+                <w:rPr>
+                  <w:rFonts w:ascii="Cambria Math" w:hAnsi="Cambria Math"/>
+                </w:rPr>
+                <m:t>|</m:t>
+              </m:r>
+            </m:num>
+            <m:den>
+              <m:nary>
+                <m:naryPr>
+                  <m:chr m:val="∑"/>
+                  <m:limLoc m:val="undOvr"/>
+                  <m:ctrlPr>
+                    <w:rPr>
+                      <w:rFonts w:ascii="Cambria Math" w:hAnsi="Cambria Math"/>
+                    </w:rPr>
+                  </m:ctrlPr>
+                </m:naryPr>
+                <m:sub>
+                  <m:r>
+                    <w:rPr>
+                      <w:rFonts w:ascii="Cambria Math" w:hAnsi="Cambria Math"/>
+                    </w:rPr>
+                    <m:t>i=0</m:t>
+                  </m:r>
+                </m:sub>
+                <m:sup>
+                  <m:r>
+                    <w:rPr>
+                      <w:rFonts w:ascii="Cambria Math" w:hAnsi="Cambria Math"/>
+                    </w:rPr>
+                    <m:t>n-1</m:t>
+                  </m:r>
+                </m:sup>
+                <m:e>
+                  <m:r>
+                    <w:rPr>
+                      <w:rFonts w:ascii="Cambria Math" w:hAnsi="Cambria Math"/>
+                    </w:rPr>
+                    <m:t>|</m:t>
+                  </m:r>
+                </m:e>
+              </m:nary>
+              <m:sSub>
+                <m:sSubPr>
+                  <m:ctrlPr>
+                    <w:rPr>
+                      <w:rFonts w:ascii="Cambria Math" w:hAnsi="Cambria Math"/>
+                    </w:rPr>
+                  </m:ctrlPr>
+                </m:sSubPr>
+                <m:e>
+                  <m:r>
+                    <m:rPr>
+                      <m:nor/>
+                    </m:rPr>
+                    <m:t>Giá</m:t>
+                  </m:r>
+                </m:e>
+                <m:sub>
+                  <m:r>
+                    <w:rPr>
+                      <w:rFonts w:ascii="Cambria Math" w:hAnsi="Cambria Math"/>
+                    </w:rPr>
+                    <m:t>i</m:t>
+                  </m:r>
+                </m:sub>
+              </m:sSub>
+              <m:r>
+                <w:rPr>
+                  <w:rFonts w:ascii="Cambria Math" w:hAnsi="Cambria Math"/>
+                </w:rPr>
+                <m:t>-</m:t>
+              </m:r>
+              <m:sSub>
+                <m:sSubPr>
+                  <m:ctrlPr>
+                    <w:rPr>
+                      <w:rFonts w:ascii="Cambria Math" w:hAnsi="Cambria Math"/>
+                    </w:rPr>
+                  </m:ctrlPr>
+                </m:sSubPr>
+                <m:e>
+                  <m:r>
+                    <m:rPr>
+                      <m:nor/>
+                    </m:rPr>
+                    <m:t>Giá</m:t>
+                  </m:r>
+                </m:e>
+                <m:sub>
+                  <m:r>
+                    <w:rPr>
+                      <w:rFonts w:ascii="Cambria Math" w:hAnsi="Cambria Math"/>
+                    </w:rPr>
+                    <m:t>i+1</m:t>
+                  </m:r>
+                </m:sub>
+              </m:sSub>
+              <m:r>
+                <w:rPr>
+                  <w:rFonts w:ascii="Cambria Math" w:hAnsi="Cambria Math"/>
+                </w:rPr>
+                <m:t>|</m:t>
+              </m:r>
+            </m:den>
+          </m:f>
+        </m:oMath>
+      </m:oMathPara>
+    </w:p>
+    <w:p>
+      <w:pPr>
+        <w:numPr>
+          <w:ilvl w:val="0"/>
+          <w:numId w:val="11"/>
+        </w:numPr>
+      </w:pPr>
+      <w:r>
+        <w:rPr>
+          <w:b/>
+          <w:bCs/>
+        </w:rPr>
+        <w:t>Tử số:</w:t>
+      </w:r>
+      <w:r>
+        <w:t xml:space="preserve"> Biến động ròng (khoảng cách tuyệt đối từ đầu chu kỳ đến cuối chu kỳ).</w:t>
+      </w:r>
+    </w:p>
+    <w:p>
+      <w:pPr>
+        <w:numPr>
+          <w:ilvl w:val="0"/>
+          <w:numId w:val="11"/>
+        </w:numPr>
+      </w:pPr>
+      <w:r>
+        <w:rPr>
+          <w:b/>
+          <w:bCs/>
+        </w:rPr>
+        <w:t>Mẫu số:</w:t>
+      </w:r>
+      <w:r>
+        <w:t xml:space="preserve"> Tổng toàn bộ các biến động tuyệt đối từng phiên trong chu kỳ (độ biến động tích lũy).</w:t>
+      </w:r>
+    </w:p>
+    <w:p>
+      <w:pPr>
+        <w:pStyle w:val="Heading2"/>
+      </w:pPr>
+      <w:r>
+        <w:t>Bước 2: Tính Hệ số làm mượt (Smoothing Constant - SC)</w:t>
+      </w:r>
+    </w:p>
+    <w:p>
+      <w:r>
+        <w:t>Hệ số này quyết định tốc độ phản ứng của AMA. Nó được điều chỉnh dựa trên ER và giới hạn bởi hai hệ số làm mượt khác: một cái rất nhanh (tương đương EMA 2 phiên) và một cái rất chậm (tương đương EMA 30 phiên).</w:t>
+      </w:r>
+    </w:p>
+    <w:p>
+      <w:pPr>
+        <w:numPr>
+          <w:ilvl w:val="0"/>
+          <w:numId w:val="12"/>
+        </w:numPr>
+      </w:pPr>
+      <m:oMath>
+        <m:r>
+          <w:rPr>
+            <w:rFonts w:ascii="Cambria Math" w:hAnsi="Cambria Math"/>
+          </w:rPr>
+          <m:t>S</m:t>
+        </m:r>
+        <m:sSub>
+          <m:sSubPr>
+            <m:ctrlPr>
+              <w:rPr>
+                <w:rFonts w:ascii="Cambria Math" w:hAnsi="Cambria Math"/>
+              </w:rPr>
+            </m:ctrlPr>
+          </m:sSubPr>
+          <m:e>
+            <m:r>
+              <w:rPr>
+                <w:rFonts w:ascii="Cambria Math" w:hAnsi="Cambria Math"/>
+              </w:rPr>
+              <m:t>C</m:t>
+            </m:r>
+          </m:e>
+          <m:sub>
+            <m:r>
+              <m:rPr>
+                <m:nor/>
+              </m:rPr>
+              <m:t>nhanh</m:t>
+            </m:r>
+          </m:sub>
+        </m:sSub>
+        <m:r>
+          <w:rPr>
+            <w:rFonts w:ascii="Cambria Math" w:hAnsi="Cambria Math"/>
+          </w:rPr>
+          <m:t>=</m:t>
+        </m:r>
+        <m:f>
+          <m:fPr>
+            <m:ctrlPr>
+              <w:rPr>
+                <w:rFonts w:ascii="Cambria Math" w:hAnsi="Cambria Math"/>
+              </w:rPr>
+            </m:ctrlPr>
+          </m:fPr>
+          <m:num>
+            <m:r>
+              <w:rPr>
+                <w:rFonts w:ascii="Cambria Math" w:hAnsi="Cambria Math"/>
+              </w:rPr>
+              <m:t>2</m:t>
+            </m:r>
+          </m:num>
+          <m:den>
+            <m:r>
+              <w:rPr>
+                <w:rFonts w:ascii="Cambria Math" w:hAnsi="Cambria Math"/>
+              </w:rPr>
+              <m:t>2+1</m:t>
+            </m:r>
+          </m:den>
+        </m:f>
+        <m:r>
+          <w:rPr>
+            <w:rFonts w:ascii="Cambria Math" w:hAnsi="Cambria Math"/>
+          </w:rPr>
+          <m:t>=0.6667</m:t>
+        </m:r>
+      </m:oMath>
+    </w:p>
+    <w:p>
+      <w:pPr>
+        <w:numPr>
+          <w:ilvl w:val="0"/>
+          <w:numId w:val="12"/>
+        </w:numPr>
+      </w:pPr>
+      <m:oMath>
+        <m:r>
+          <w:rPr>
+            <w:rFonts w:ascii="Cambria Math" w:hAnsi="Cambria Math"/>
+          </w:rPr>
+          <m:t>S</m:t>
+        </m:r>
+        <m:sSub>
+          <m:sSubPr>
+            <m:ctrlPr>
+              <w:rPr>
+                <w:rFonts w:ascii="Cambria Math" w:hAnsi="Cambria Math"/>
+              </w:rPr>
+            </m:ctrlPr>
+          </m:sSubPr>
+          <m:e>
+            <m:r>
+              <w:rPr>
+                <w:rFonts w:ascii="Cambria Math" w:hAnsi="Cambria Math"/>
+              </w:rPr>
+              <m:t>C</m:t>
+            </m:r>
+          </m:e>
+          <m:sub>
+            <m:r>
+              <m:rPr>
+                <m:nor/>
+              </m:rPr>
+              <m:t>chậm</m:t>
+            </m:r>
+          </m:sub>
+        </m:sSub>
+        <m:r>
+          <w:rPr>
+            <w:rFonts w:ascii="Cambria Math" w:hAnsi="Cambria Math"/>
+          </w:rPr>
+          <m:t>=</m:t>
+        </m:r>
+        <m:f>
+          <m:fPr>
+            <m:ctrlPr>
+              <w:rPr>
+                <w:rFonts w:ascii="Cambria Math" w:hAnsi="Cambria Math"/>
+              </w:rPr>
+            </m:ctrlPr>
+          </m:fPr>
+          <m:num>
+            <m:r>
+              <w:rPr>
+                <w:rFonts w:ascii="Cambria Math" w:hAnsi="Cambria Math"/>
+              </w:rPr>
+              <m:t>2</m:t>
+            </m:r>
+          </m:num>
+          <m:den>
+            <m:r>
+              <w:rPr>
+                <w:rFonts w:ascii="Cambria Math" w:hAnsi="Cambria Math"/>
+              </w:rPr>
+              <m:t>30+1</m:t>
+            </m:r>
+          </m:den>
+        </m:f>
+        <m:r>
+          <w:rPr>
+            <w:rFonts w:ascii="Cambria Math" w:hAnsi="Cambria Math"/>
+          </w:rPr>
+          <m:t>=0.0645</m:t>
+        </m:r>
+      </m:oMath>
+    </w:p>
+    <w:p>
+      <w:r>
+        <w:t>Công thức tính hệ số làm mượt thích ứng:</w:t>
+      </w:r>
+    </w:p>
+    <w:p>
+      <m:oMathPara>
+        <m:oMath>
+          <m:r>
+            <w:rPr>
+              <w:rFonts w:ascii="Cambria Math" w:hAnsi="Cambria Math"/>
+            </w:rPr>
+            <m:t>SC=</m:t>
+          </m:r>
+          <m:sSup>
+            <m:sSupPr>
+              <m:ctrlPr>
+                <w:rPr>
+                  <w:rFonts w:ascii="Cambria Math" w:hAnsi="Cambria Math"/>
+                </w:rPr>
+              </m:ctrlPr>
+            </m:sSupPr>
+            <m:e>
+              <m:d>
+                <m:dPr>
+                  <m:ctrlPr>
+                    <w:rPr>
+                      <w:rFonts w:ascii="Cambria Math" w:hAnsi="Cambria Math"/>
+                    </w:rPr>
+                  </m:ctrlPr>
+                </m:dPr>
+                <m:e>
+                  <m:r>
+                    <w:rPr>
+                      <w:rFonts w:ascii="Cambria Math" w:hAnsi="Cambria Math"/>
+                    </w:rPr>
+                    <m:t>ER×</m:t>
+                  </m:r>
+                  <m:d>
+                    <m:dPr>
+                      <m:ctrlPr>
+                        <w:rPr>
+                          <w:rFonts w:ascii="Cambria Math" w:hAnsi="Cambria Math"/>
+                        </w:rPr>
+                      </m:ctrlPr>
+                    </m:dPr>
+                    <m:e>
+                      <m:r>
+                        <w:rPr>
+                          <w:rFonts w:ascii="Cambria Math" w:hAnsi="Cambria Math"/>
+                        </w:rPr>
+                        <m:t>S</m:t>
+                      </m:r>
+                      <m:sSub>
+                        <m:sSubPr>
+                          <m:ctrlPr>
+                            <w:rPr>
+                              <w:rFonts w:ascii="Cambria Math" w:hAnsi="Cambria Math"/>
+                            </w:rPr>
+                          </m:ctrlPr>
+                        </m:sSubPr>
+                        <m:e>
+                          <m:r>
+                            <w:rPr>
+                              <w:rFonts w:ascii="Cambria Math" w:hAnsi="Cambria Math"/>
+                            </w:rPr>
+                            <m:t>C</m:t>
+                          </m:r>
+                        </m:e>
+                        <m:sub>
+                          <m:r>
+                            <m:rPr>
+                              <m:nor/>
+                            </m:rPr>
+                            <m:t>nhanh</m:t>
+                          </m:r>
+                        </m:sub>
+                      </m:sSub>
+                      <m:r>
+                        <w:rPr>
+                          <w:rFonts w:ascii="Cambria Math" w:hAnsi="Cambria Math"/>
+                        </w:rPr>
+                        <m:t>-S</m:t>
+                      </m:r>
+                      <m:sSub>
+                        <m:sSubPr>
+                          <m:ctrlPr>
+                            <w:rPr>
+                              <w:rFonts w:ascii="Cambria Math" w:hAnsi="Cambria Math"/>
+                            </w:rPr>
+                          </m:ctrlPr>
+                        </m:sSubPr>
+                        <m:e>
+                          <m:r>
+                            <w:rPr>
+                              <w:rFonts w:ascii="Cambria Math" w:hAnsi="Cambria Math"/>
+                            </w:rPr>
+                            <m:t>C</m:t>
+                          </m:r>
+                        </m:e>
+                        <m:sub>
+                          <m:r>
+                            <m:rPr>
+                              <m:nor/>
+                            </m:rPr>
+                            <m:t>chậm</m:t>
+                          </m:r>
+                        </m:sub>
+                      </m:sSub>
+                    </m:e>
+                  </m:d>
+                  <m:r>
+                    <w:rPr>
+                      <w:rFonts w:ascii="Cambria Math" w:hAnsi="Cambria Math"/>
+                    </w:rPr>
+                    <m:t>+S</m:t>
+                  </m:r>
+                  <m:sSub>
+                    <m:sSubPr>
+                      <m:ctrlPr>
+                        <w:rPr>
+                          <w:rFonts w:ascii="Cambria Math" w:hAnsi="Cambria Math"/>
+                        </w:rPr>
+                      </m:ctrlPr>
+                    </m:sSubPr>
+                    <m:e>
+                      <m:r>
+                        <w:rPr>
+                          <w:rFonts w:ascii="Cambria Math" w:hAnsi="Cambria Math"/>
+                        </w:rPr>
+                        <m:t>C</m:t>
+                      </m:r>
+                    </m:e>
+                    <m:sub>
+                      <m:r>
+                        <m:rPr>
+                          <m:nor/>
+                        </m:rPr>
+                        <m:t>chậm</m:t>
+                      </m:r>
+                    </m:sub>
+                  </m:sSub>
+                </m:e>
+              </m:d>
+            </m:e>
+            <m:sup>
+              <m:r>
+                <w:rPr>
+                  <w:rFonts w:ascii="Cambria Math" w:hAnsi="Cambria Math"/>
+                </w:rPr>
+                <m:t>2</m:t>
+              </m:r>
+            </m:sup>
+          </m:sSup>
+        </m:oMath>
+      </m:oMathPara>
+    </w:p>
+    <w:p>
+      <w:r>
+        <w:rPr>
+          <w:i/>
+          <w:iCs/>
+        </w:rPr>
+        <w:t>(Việc bình phương kết quả giúp AMA nhạy hơn hẳn khi có xu hướng mạnh và cực kỳ phẳng lặng khi thị trường nhiễu).</w:t>
+      </w:r>
+    </w:p>
+    <w:p>
+      <w:pPr>
+        <w:pStyle w:val="Heading2"/>
+      </w:pPr>
+      <w:r>
+        <w:t>Bước 3: Tính giá trị AMA</w:t>
+      </w:r>
+    </w:p>
+    <w:p>
+      <w:r>
+        <w:t xml:space="preserve">Khi đã có hệ số </w:t>
+      </w:r>
+      <m:oMath>
+        <m:r>
+          <w:rPr>
+            <w:rFonts w:ascii="Cambria Math" w:hAnsi="Cambria Math"/>
+          </w:rPr>
+          <m:t>SC</m:t>
+        </m:r>
+      </m:oMath>
+      <w:r>
+        <w:t xml:space="preserve"> của phiên hiện tại, cậu tính AMA tương tự như cách tính đường EMA thông thường:</w:t>
+      </w:r>
+    </w:p>
+    <w:p>
+      <m:oMathPara>
+        <m:oMath>
+          <m:r>
+            <w:rPr>
+              <w:rFonts w:ascii="Cambria Math" w:hAnsi="Cambria Math"/>
+            </w:rPr>
+            <m:t>AM</m:t>
+          </m:r>
+          <m:sSub>
+            <m:sSubPr>
+              <m:ctrlPr>
+                <w:rPr>
+                  <w:rFonts w:ascii="Cambria Math" w:hAnsi="Cambria Math"/>
+                </w:rPr>
+              </m:ctrlPr>
+            </m:sSubPr>
+            <m:e>
+              <m:r>
+                <w:rPr>
+                  <w:rFonts w:ascii="Cambria Math" w:hAnsi="Cambria Math"/>
+                </w:rPr>
+                <m:t>A</m:t>
+              </m:r>
+            </m:e>
+            <m:sub>
+              <m:r>
+                <m:rPr>
+                  <m:nor/>
+                </m:rPr>
+                <m:t>hiện tại</m:t>
+              </m:r>
+            </m:sub>
+          </m:sSub>
+          <m:r>
+            <w:rPr>
+              <w:rFonts w:ascii="Cambria Math" w:hAnsi="Cambria Math"/>
+            </w:rPr>
+            <m:t>=AM</m:t>
+          </m:r>
+          <m:sSub>
+            <m:sSubPr>
+              <m:ctrlPr>
+                <w:rPr>
+                  <w:rFonts w:ascii="Cambria Math" w:hAnsi="Cambria Math"/>
+                </w:rPr>
+              </m:ctrlPr>
+            </m:sSubPr>
+            <m:e>
+              <m:r>
+                <w:rPr>
+                  <w:rFonts w:ascii="Cambria Math" w:hAnsi="Cambria Math"/>
+                </w:rPr>
+                <m:t>A</m:t>
+              </m:r>
+            </m:e>
+            <m:sub>
+              <m:r>
+                <m:rPr>
+                  <m:nor/>
+                </m:rPr>
+                <m:t>trước</m:t>
+              </m:r>
+            </m:sub>
+          </m:sSub>
+          <m:r>
+            <w:rPr>
+              <w:rFonts w:ascii="Cambria Math" w:hAnsi="Cambria Math"/>
+            </w:rPr>
+            <m:t>+SC×</m:t>
+          </m:r>
+          <m:d>
+            <m:dPr>
+              <m:ctrlPr>
+                <w:rPr>
+                  <w:rFonts w:ascii="Cambria Math" w:hAnsi="Cambria Math"/>
+                </w:rPr>
+              </m:ctrlPr>
+            </m:dPr>
+            <m:e>
+              <m:r>
+                <m:rPr>
+                  <m:nor/>
+                </m:rPr>
+                <m:t>Giá hiện tại</m:t>
+              </m:r>
+              <m:r>
+                <w:rPr>
+                  <w:rFonts w:ascii="Cambria Math" w:hAnsi="Cambria Math"/>
+                </w:rPr>
+                <m:t>-AM</m:t>
+              </m:r>
+              <m:sSub>
+                <m:sSubPr>
+                  <m:ctrlPr>
+                    <w:rPr>
+                      <w:rFonts w:ascii="Cambria Math" w:hAnsi="Cambria Math"/>
+                    </w:rPr>
+                  </m:ctrlPr>
+                </m:sSubPr>
+                <m:e>
+                  <m:r>
+                    <w:rPr>
+                      <w:rFonts w:ascii="Cambria Math" w:hAnsi="Cambria Math"/>
+                    </w:rPr>
+                    <m:t>A</m:t>
+                  </m:r>
+                </m:e>
+                <m:sub>
+                  <m:r>
+                    <m:rPr>
+                      <m:nor/>
+                    </m:rPr>
+                    <m:t>trước</m:t>
+                  </m:r>
+                </m:sub>
+              </m:sSub>
+            </m:e>
+          </m:d>
+        </m:oMath>
+      </m:oMathPara>
+    </w:p>
+    <w:p>
+      <w:pPr>
+        <w:pStyle w:val="Heading2"/>
+      </w:pPr>
+      <w:r>
+        <w:t>Tóm tắt logic hoạt động:</w:t>
+      </w:r>
+    </w:p>
+    <w:p>
+      <w:pPr>
+        <w:numPr>
+          <w:ilvl w:val="0"/>
+          <w:numId w:val="13"/>
+        </w:numPr>
+      </w:pPr>
+      <w:r>
+        <w:rPr>
+          <w:b/>
+          <w:bCs/>
+        </w:rPr>
+        <w:t xml:space="preserve">Khi thị trường có xu hướng mạnh (ER cao </w:t>
+      </w:r>
+      <m:oMath>
+        <m:r>
+          <w:rPr>
+            <w:rFonts w:ascii="Cambria Math" w:hAnsi="Cambria Math"/>
+          </w:rPr>
+          <m:t>→</m:t>
+        </m:r>
+      </m:oMath>
+      <w:r>
+        <w:rPr>
+          <w:b/>
+          <w:bCs/>
+        </w:rPr>
+        <w:t xml:space="preserve"> SC lớn):</w:t>
+      </w:r>
+      <w:r>
+        <w:t xml:space="preserve"> AMA sẽ bám rất sát đường giá, phản ứng nhanh như một đường EMA ngắn hạn.</w:t>
+      </w:r>
+    </w:p>
+    <w:p>
+      <w:pPr>
+        <w:numPr>
+          <w:ilvl w:val="0"/>
+          <w:numId w:val="13"/>
+        </w:numPr>
+      </w:pPr>
+      <w:r>
+        <w:rPr>
+          <w:b/>
+          <w:bCs/>
+        </w:rPr>
+        <w:t xml:space="preserve">Khi thị trường đi ngang/nhiễu (ER thấp </w:t>
+      </w:r>
+      <m:oMath>
+        <m:r>
+          <w:rPr>
+            <w:rFonts w:ascii="Cambria Math" w:hAnsi="Cambria Math"/>
+          </w:rPr>
+          <m:t>→</m:t>
+        </m:r>
+      </m:oMath>
+      <w:r>
+        <w:rPr>
+          <w:b/>
+          <w:bCs/>
+        </w:rPr>
+        <w:t xml:space="preserve"> SC nhỏ):</w:t>
+      </w:r>
+      <w:r>
+        <w:t xml:space="preserve"> AMA sẽ gần như đi ngang, bỏ qua các biến động nhỏ để tránh tín hiệu nhiễu (sideways).</w:t>
+      </w:r>
+    </w:p>
+    <w:p>
+      <w:pPr>
+        <w:pStyle w:val="Heading2"/>
+      </w:pPr>
+      <w:r>
+        <w:lastRenderedPageBreak/>
+        <w:t>Ý nghĩa của việc đổi Period từ 10 thành 26</w:t>
+      </w:r>
+    </w:p>
+    <w:p>
+      <w:r>
+        <w:t xml:space="preserve">Khi cậu tăng chu kỳ tính </w:t>
+      </w:r>
+      <w:r>
+        <w:rPr>
+          <w:b/>
+          <w:bCs/>
+        </w:rPr>
+        <w:t>Efficiency Ratio (ER)</w:t>
+      </w:r>
+      <w:r>
+        <w:t xml:space="preserve"> lên 26 (ví dụ ứng với 26 nến của khung M15 hoặc H1):</w:t>
+      </w:r>
+    </w:p>
+    <w:p>
+      <w:pPr>
+        <w:numPr>
+          <w:ilvl w:val="0"/>
+          <w:numId w:val="14"/>
+        </w:numPr>
+      </w:pPr>
+      <w:r>
+        <w:rPr>
+          <w:b/>
+          <w:bCs/>
+        </w:rPr>
+        <w:t>Lọc nhiễu tốt hơn:</w:t>
+      </w:r>
+      <w:r>
+        <w:t xml:space="preserve"> Tử số và mẫu số của công thức ER giờ sẽ tính toán dựa trên khoảng cách của một chu kỳ dài hơn. Nó giúp đường AMA mượt mà hơn, triệt tiêu bớt các pha "giật cục" ngắn hạn của thị trường crypto hay Forex.</w:t>
+      </w:r>
+    </w:p>
+    <w:p>
+      <w:pPr>
+        <w:numPr>
+          <w:ilvl w:val="0"/>
+          <w:numId w:val="14"/>
+        </w:numPr>
+      </w:pPr>
+      <w:r>
+        <w:rPr>
+          <w:b/>
+          <w:bCs/>
+        </w:rPr>
+        <w:t>Độ trễ tăng lên một chút:</w:t>
+      </w:r>
+      <w:r>
+        <w:t xml:space="preserve"> Đổi lại, vì chu kỳ dài hơn nên khi thị trường bắt đầu đảo chiều hoặc bứt phá (breakout), đường AMA cấu hình 26 sẽ mất nhiều thời gian hơn một chút để nhận diện và tăng tốc bám theo giá so với cấu hình 10.</w:t>
+      </w:r>
+    </w:p>
+    <w:p/>
+    <w:p/>
+    <w:p/>
+    <w:p>
+      <w:pPr>
         <w:sectPr>
           <w:pgSz w:w="12240" w:h="15840"/>
           <w:pgMar w:top="1440" w:right="1440" w:bottom="1440" w:left="1440" w:header="708" w:footer="708" w:gutter="0"/>
@@ -388,9 +1265,78 @@
     </w:p>
     <w:p>
       <w:r>
+        <w:rPr>
+          <w:noProof/>
+        </w:rPr>
+        <w:lastRenderedPageBreak/>
+        <w:drawing>
+          <wp:inline distT="0" distB="0" distL="0" distR="0" wp14:anchorId="26ECCDF1" wp14:editId="012E7F76">
+            <wp:extent cx="5943600" cy="2382520"/>
+            <wp:effectExtent l="0" t="0" r="0" b="0"/>
+            <wp:docPr id="1485087591" name="Picture 1"/>
+            <wp:cNvGraphicFramePr>
+              <a:graphicFrameLocks xmlns:a="http://schemas.openxmlformats.org/drawingml/2006/main" noChangeAspect="1"/>
+            </wp:cNvGraphicFramePr>
+            <a:graphic xmlns:a="http://schemas.openxmlformats.org/drawingml/2006/main">
+              <a:graphicData uri="http://schemas.openxmlformats.org/drawingml/2006/picture">
+                <pic:pic xmlns:pic="http://schemas.openxmlformats.org/drawingml/2006/picture">
+                  <pic:nvPicPr>
+                    <pic:cNvPr id="1485087591" name=""/>
+                    <pic:cNvPicPr/>
+                  </pic:nvPicPr>
+                  <pic:blipFill>
+                    <a:blip r:embed="rId10"/>
+                    <a:stretch>
+                      <a:fillRect/>
+                    </a:stretch>
+                  </pic:blipFill>
+                  <pic:spPr>
+                    <a:xfrm>
+                      <a:off x="0" y="0"/>
+                      <a:ext cx="5943600" cy="2382520"/>
+                    </a:xfrm>
+                    <a:prstGeom prst="rect">
+                      <a:avLst/>
+                    </a:prstGeom>
+                  </pic:spPr>
+                </pic:pic>
+              </a:graphicData>
+            </a:graphic>
+          </wp:inline>
+        </w:drawing>
+      </w:r>
+    </w:p>
+    <w:p>
+      <w:r>
         <w:t>Khi đường đỏ hoặc cột xám cắt qua mức 0, đó là tín hiệu xác nhận xu hướng trung hạn đã thay đổi (ở trên 0 là Bullish, ở dưới 0 là Bearish). Nếu đợi cả đường đỏ cắt qua vạch 0 mới vào lệnh thì thường sẽ bị trễ (lag) rất nhiều so với thị trường.</w:t>
       </w:r>
     </w:p>
+    <w:p>
+      <w:pPr>
+        <w:pStyle w:val="Heading2"/>
+      </w:pPr>
+      <w:r>
+        <w:t>Reference</w:t>
+      </w:r>
+    </w:p>
+    <w:p>
+      <w:r>
+        <w:t xml:space="preserve">1. </w:t>
+      </w:r>
+    </w:p>
+    <w:p>
+      <w:pPr>
+        <w:pStyle w:val="Heading1"/>
+      </w:pPr>
+      <w:r>
+        <w:t>Understanding Oscillators</w:t>
+      </w:r>
+    </w:p>
+    <w:p>
+      <w:r>
+        <w:t>Oscillators are typically used in conjunction with other technical analysis indicators to make trading decisions. Oscillators are most useful when there's no clear trend, like when a stock trades sideways. The most common oscillators are the:</w:t>
+      </w:r>
+    </w:p>
     <w:p/>
     <w:p>
       <w:pPr>
@@ -406,35 +1352,7 @@
       </w:r>
     </w:p>
     <w:p>
-      <w:pPr>
-        <w:pStyle w:val="Heading1"/>
-      </w:pPr>
-      <w:r>
-        <w:lastRenderedPageBreak/>
-        <w:t>Understanding Oscillators</w:t>
-      </w:r>
-    </w:p>
-    <w:p>
-      <w:r>
-        <w:t>Oscillators are typically used in conjunction with other technical analysis indicators to make trading decisions. Oscillators are most useful when there's no clear trend, like when a stock trades sideways. The most common oscillators are the:</w:t>
-      </w:r>
-    </w:p>
-    <w:p/>
-    <w:p>
-      <w:pPr>
-        <w:pStyle w:val="Heading2"/>
-      </w:pPr>
-      <w:r>
-        <w:t>Reference</w:t>
-      </w:r>
-    </w:p>
-    <w:p>
-      <w:r>
-        <w:t xml:space="preserve">1. </w:t>
-      </w:r>
-    </w:p>
-    <w:p>
-      <w:hyperlink r:id="rId10" w:history="1">
+      <w:hyperlink r:id="rId11" w:history="1">
         <w:r>
           <w:rPr>
             <w:rStyle w:val="Hyperlink"/>
@@ -444,7 +1362,7 @@
       </w:hyperlink>
     </w:p>
     <w:p>
-      <w:hyperlink r:id="rId11" w:history="1">
+      <w:hyperlink r:id="rId12" w:history="1">
         <w:r>
           <w:rPr>
             <w:rStyle w:val="Hyperlink"/>
@@ -454,7 +1372,7 @@
       </w:hyperlink>
     </w:p>
     <w:p>
-      <w:hyperlink r:id="rId12" w:history="1">
+      <w:hyperlink r:id="rId13" w:history="1">
         <w:r>
           <w:rPr>
             <w:rStyle w:val="Hyperlink"/>
@@ -464,7 +1382,7 @@
       </w:hyperlink>
     </w:p>
     <w:p>
-      <w:hyperlink r:id="rId13" w:history="1">
+      <w:hyperlink r:id="rId14" w:history="1">
         <w:r>
           <w:rPr>
             <w:rStyle w:val="Hyperlink"/>
@@ -480,6 +1398,7 @@
         <w:pStyle w:val="Heading1"/>
       </w:pPr>
       <w:r>
+        <w:lastRenderedPageBreak/>
         <w:t>Bollinger Bands</w:t>
       </w:r>
     </w:p>
@@ -875,7 +1794,6 @@
           </w:tcPr>
           <w:p>
             <w:r>
-              <w:lastRenderedPageBreak/>
               <w:t>Price bounces off the lower band</w:t>
             </w:r>
           </w:p>
@@ -1141,6 +2059,7 @@
           </w:tcPr>
           <w:p>
             <w:r>
+              <w:lastRenderedPageBreak/>
               <w:t>Widening bands after a squeeze</w:t>
             </w:r>
           </w:p>
@@ -1230,7 +2149,7 @@
             <w:r>
               <w:t>Adjust risk management; consider </w:t>
             </w:r>
-            <w:hyperlink r:id="rId14" w:history="1">
+            <w:hyperlink r:id="rId15" w:history="1">
               <w:r>
                 <w:rPr>
                   <w:rStyle w:val="Hyperlink"/>
@@ -1361,7 +2280,6 @@
           </w:tcPr>
           <w:p>
             <w:r>
-              <w:lastRenderedPageBreak/>
               <w:t>Tightening bands</w:t>
             </w:r>
           </w:p>
@@ -1487,6 +2405,7 @@
         <w:pStyle w:val="Heading2"/>
       </w:pPr>
       <w:r>
+        <w:lastRenderedPageBreak/>
         <w:t>1. Chiến lược Đánh đảo chiều (Mean Reversion) – Khi thị trường đi ngang (Sideway)</w:t>
       </w:r>
     </w:p>
@@ -1604,7 +2523,6 @@
           <w:b/>
           <w:bCs/>
         </w:rPr>
-        <w:lastRenderedPageBreak/>
         <w:t>Trạng thái tích lũy:</w:t>
       </w:r>
       <w:r>
@@ -1789,6 +2707,7 @@
         <w:pStyle w:val="Heading2"/>
       </w:pPr>
       <w:r>
+        <w:lastRenderedPageBreak/>
         <w:t>Reference</w:t>
       </w:r>
     </w:p>
@@ -1939,7 +2858,6 @@
     </w:p>
     <w:p>
       <w:r>
-        <w:lastRenderedPageBreak/>
         <w:t>If there is not a previous ATR calculated, you must use:</w:t>
       </w:r>
     </w:p>
@@ -2978,7 +3896,7 @@
                     <pic:cNvPicPr/>
                   </pic:nvPicPr>
                   <pic:blipFill>
-                    <a:blip r:embed="rId15">
+                    <a:blip r:embed="rId16">
                       <a:extLst>
                         <a:ext uri="{28A0092B-C50C-407E-A947-70E740481C1C}">
                           <a14:useLocalDpi xmlns:a14="http://schemas.microsoft.com/office/drawing/2010/main" val="0"/>
@@ -3084,7 +4002,6 @@
           <w:sz w:val="28"/>
           <w:szCs w:val="28"/>
         </w:rPr>
-        <w:lastRenderedPageBreak/>
         <w:t xml:space="preserve">Trong </w:t>
       </w:r>
       <w:r>
@@ -3204,6 +4121,7 @@
         <w:pStyle w:val="Heading2"/>
       </w:pPr>
       <w:r>
+        <w:lastRenderedPageBreak/>
         <w:t>Uses</w:t>
       </w:r>
     </w:p>
@@ -3246,7 +4164,7 @@
                     <pic:cNvPicPr/>
                   </pic:nvPicPr>
                   <pic:blipFill>
-                    <a:blip r:embed="rId16">
+                    <a:blip r:embed="rId17">
                       <a:extLst>
                         <a:ext uri="{28A0092B-C50C-407E-A947-70E740481C1C}">
                           <a14:useLocalDpi xmlns:a14="http://schemas.microsoft.com/office/drawing/2010/main" val="0"/>
@@ -3475,7 +4393,7 @@
         </w:rPr>
         <w:t xml:space="preserve">1. </w:t>
       </w:r>
-      <w:hyperlink r:id="rId17" w:history="1">
+      <w:hyperlink r:id="rId18" w:history="1">
         <w:r>
           <w:rPr>
             <w:rStyle w:val="Hyperlink"/>
@@ -3502,6 +4420,7 @@
         <w:pStyle w:val="Heading1"/>
       </w:pPr>
       <w:r>
+        <w:lastRenderedPageBreak/>
         <w:t>Parabolic SAR</w:t>
       </w:r>
     </w:p>
@@ -3555,7 +4474,7 @@
                     <pic:cNvPicPr/>
                   </pic:nvPicPr>
                   <pic:blipFill>
-                    <a:blip r:embed="rId18">
+                    <a:blip r:embed="rId19">
                       <a:extLst>
                         <a:ext uri="{28A0092B-C50C-407E-A947-70E740481C1C}">
                           <a14:useLocalDpi xmlns:a14="http://schemas.microsoft.com/office/drawing/2010/main" val="0"/>
@@ -3708,7 +4627,7 @@
                     <pic:cNvPicPr/>
                   </pic:nvPicPr>
                   <pic:blipFill>
-                    <a:blip r:embed="rId23">
+                    <a:blip r:embed="rId24">
                       <a:extLst>
                         <a:ext uri="{28A0092B-C50C-407E-A947-70E740481C1C}">
                           <a14:useLocalDpi xmlns:a14="http://schemas.microsoft.com/office/drawing/2010/main" val="0"/>
@@ -3764,7 +4683,6 @@
         </w:numPr>
       </w:pPr>
       <w:r>
-        <w:lastRenderedPageBreak/>
         <w:t xml:space="preserve">Acceleration Factor (AF): Starting at .02, AF increases by .02 each time the extreme point makes a new high. AF can reach a maximum of .20, no matter how long the </w:t>
       </w:r>
       <w:r>
@@ -3806,7 +4724,7 @@
                     <pic:cNvPicPr/>
                   </pic:nvPicPr>
                   <pic:blipFill>
-                    <a:blip r:embed="rId24">
+                    <a:blip r:embed="rId25">
                       <a:extLst>
                         <a:ext uri="{28A0092B-C50C-407E-A947-70E740481C1C}">
                           <a14:useLocalDpi xmlns:a14="http://schemas.microsoft.com/office/drawing/2010/main" val="0"/>
@@ -3914,6 +4832,7 @@
         <w:pStyle w:val="Heading3"/>
       </w:pPr>
       <w:r>
+        <w:lastRenderedPageBreak/>
         <w:t>Falling SAR</w:t>
       </w:r>
     </w:p>
@@ -3956,7 +4875,7 @@
                     <pic:cNvPicPr/>
                   </pic:nvPicPr>
                   <pic:blipFill>
-                    <a:blip r:embed="rId25">
+                    <a:blip r:embed="rId26">
                       <a:extLst>
                         <a:ext uri="{28A0092B-C50C-407E-A947-70E740481C1C}">
                           <a14:useLocalDpi xmlns:a14="http://schemas.microsoft.com/office/drawing/2010/main" val="0"/>
@@ -4072,7 +4991,7 @@
           <w:szCs w:val="28"/>
         </w:rPr>
         <w:drawing>
-          <wp:anchor distT="0" distB="0" distL="114300" distR="114300" simplePos="0" relativeHeight="251665408" behindDoc="1" locked="0" layoutInCell="1" allowOverlap="1" wp14:anchorId="10B02EAA" wp14:editId="68C2AF63">
+          <wp:anchor distT="0" distB="0" distL="114300" distR="114300" simplePos="0" relativeHeight="251665408" behindDoc="1" locked="0" layoutInCell="1" allowOverlap="1" wp14:anchorId="10B02EAA" wp14:editId="7F3F9641">
             <wp:simplePos x="0" y="0"/>
             <wp:positionH relativeFrom="column">
               <wp:posOffset>10160</wp:posOffset>
@@ -4095,7 +5014,7 @@
                     <pic:cNvPicPr/>
                   </pic:nvPicPr>
                   <pic:blipFill>
-                    <a:blip r:embed="rId26" cstate="print">
+                    <a:blip r:embed="rId27" cstate="print">
                       <a:extLst>
                         <a:ext uri="{28A0092B-C50C-407E-A947-70E740481C1C}">
                           <a14:useLocalDpi xmlns:a14="http://schemas.microsoft.com/office/drawing/2010/main" val="0"/>
@@ -4219,7 +5138,7 @@
           <w:szCs w:val="28"/>
         </w:rPr>
         <w:drawing>
-          <wp:anchor distT="0" distB="0" distL="114300" distR="114300" simplePos="0" relativeHeight="251666432" behindDoc="1" locked="0" layoutInCell="1" allowOverlap="1" wp14:anchorId="72C51BA0" wp14:editId="4BDFEE38">
+          <wp:anchor distT="0" distB="0" distL="114300" distR="114300" simplePos="0" relativeHeight="251666432" behindDoc="1" locked="0" layoutInCell="1" allowOverlap="1" wp14:anchorId="72C51BA0" wp14:editId="77BBEB52">
             <wp:simplePos x="0" y="0"/>
             <wp:positionH relativeFrom="column">
               <wp:posOffset>-40640</wp:posOffset>
@@ -4242,7 +5161,7 @@
                     <pic:cNvPicPr/>
                   </pic:nvPicPr>
                   <pic:blipFill>
-                    <a:blip r:embed="rId27" cstate="print">
+                    <a:blip r:embed="rId28" cstate="print">
                       <a:extLst>
                         <a:ext uri="{28A0092B-C50C-407E-A947-70E740481C1C}">
                           <a14:useLocalDpi xmlns:a14="http://schemas.microsoft.com/office/drawing/2010/main" val="0"/>
@@ -4407,6 +5326,7 @@
           <w:sz w:val="28"/>
           <w:szCs w:val="28"/>
         </w:rPr>
+        <w:lastRenderedPageBreak/>
         <w:t>Đ</w:t>
       </w:r>
       <w:r>
@@ -4487,7 +5407,7 @@
         </w:rPr>
         <w:t xml:space="preserve">1. </w:t>
       </w:r>
-      <w:hyperlink r:id="rId28" w:history="1">
+      <w:hyperlink r:id="rId29" w:history="1">
         <w:r>
           <w:rPr>
             <w:rStyle w:val="Hyperlink"/>
@@ -4516,7 +5436,7 @@
         </w:rPr>
         <w:t xml:space="preserve">2. </w:t>
       </w:r>
-      <w:hyperlink r:id="rId29" w:history="1">
+      <w:hyperlink r:id="rId30" w:history="1">
         <w:r>
           <w:rPr>
             <w:rStyle w:val="Hyperlink"/>
@@ -4545,7 +5465,7 @@
         </w:rPr>
         <w:t xml:space="preserve">3. </w:t>
       </w:r>
-      <w:hyperlink r:id="rId30" w:history="1">
+      <w:hyperlink r:id="rId31" w:history="1">
         <w:r>
           <w:rPr>
             <w:rStyle w:val="Hyperlink"/>
@@ -4653,7 +5573,7 @@
         </w:rPr>
         <w:t xml:space="preserve">1. </w:t>
       </w:r>
-      <w:hyperlink r:id="rId31" w:history="1">
+      <w:hyperlink r:id="rId32" w:history="1">
         <w:r>
           <w:rPr>
             <w:rStyle w:val="Hyperlink"/>
@@ -4680,10 +5600,9 @@
           <w:sz w:val="28"/>
           <w:szCs w:val="28"/>
         </w:rPr>
-        <w:lastRenderedPageBreak/>
         <w:t xml:space="preserve">2. </w:t>
       </w:r>
-      <w:hyperlink r:id="rId32" w:history="1">
+      <w:hyperlink r:id="rId33" w:history="1">
         <w:r>
           <w:rPr>
             <w:rStyle w:val="Hyperlink"/>
@@ -4828,6 +5747,7 @@
               <w:sz w:val="28"/>
               <w:szCs w:val="28"/>
             </w:rPr>
+            <w:lastRenderedPageBreak/>
             <m:t>-DI=</m:t>
           </m:r>
           <m:f>
@@ -4911,7 +5831,7 @@
                     <pic:cNvPicPr/>
                   </pic:nvPicPr>
                   <pic:blipFill>
-                    <a:blip r:embed="rId33">
+                    <a:blip r:embed="rId34">
                       <a:extLst>
                         <a:ext uri="{28A0092B-C50C-407E-A947-70E740481C1C}">
                           <a14:useLocalDpi xmlns:a14="http://schemas.microsoft.com/office/drawing/2010/main" val="0"/>
@@ -5305,6 +6225,155 @@
     </w:lvl>
   </w:abstractNum>
   <w:abstractNum w:abstractNumId="1" w15:restartNumberingAfterBreak="0">
+    <w:nsid w:val="0D3D179B"/>
+    <w:multiLevelType w:val="multilevel"/>
+    <w:tmpl w:val="9E9E97D2"/>
+    <w:lvl w:ilvl="0">
+      <w:start w:val="1"/>
+      <w:numFmt w:val="bullet"/>
+      <w:lvlText w:val=""/>
+      <w:lvlJc w:val="left"/>
+      <w:pPr>
+        <w:tabs>
+          <w:tab w:val="num" w:pos="720"/>
+        </w:tabs>
+        <w:ind w:left="720" w:hanging="360"/>
+      </w:pPr>
+      <w:rPr>
+        <w:rFonts w:ascii="Symbol" w:hAnsi="Symbol" w:hint="default"/>
+        <w:sz w:val="20"/>
+      </w:rPr>
+    </w:lvl>
+    <w:lvl w:ilvl="1" w:tentative="1">
+      <w:start w:val="1"/>
+      <w:numFmt w:val="bullet"/>
+      <w:lvlText w:val="o"/>
+      <w:lvlJc w:val="left"/>
+      <w:pPr>
+        <w:tabs>
+          <w:tab w:val="num" w:pos="1440"/>
+        </w:tabs>
+        <w:ind w:left="1440" w:hanging="360"/>
+      </w:pPr>
+      <w:rPr>
+        <w:rFonts w:ascii="Courier New" w:hAnsi="Courier New" w:hint="default"/>
+        <w:sz w:val="20"/>
+      </w:rPr>
+    </w:lvl>
+    <w:lvl w:ilvl="2" w:tentative="1">
+      <w:start w:val="1"/>
+      <w:numFmt w:val="bullet"/>
+      <w:lvlText w:val=""/>
+      <w:lvlJc w:val="left"/>
+      <w:pPr>
+        <w:tabs>
+          <w:tab w:val="num" w:pos="2160"/>
+        </w:tabs>
+        <w:ind w:left="2160" w:hanging="360"/>
+      </w:pPr>
+      <w:rPr>
+        <w:rFonts w:ascii="Wingdings" w:hAnsi="Wingdings" w:hint="default"/>
+        <w:sz w:val="20"/>
+      </w:rPr>
+    </w:lvl>
+    <w:lvl w:ilvl="3" w:tentative="1">
+      <w:start w:val="1"/>
+      <w:numFmt w:val="bullet"/>
+      <w:lvlText w:val=""/>
+      <w:lvlJc w:val="left"/>
+      <w:pPr>
+        <w:tabs>
+          <w:tab w:val="num" w:pos="2880"/>
+        </w:tabs>
+        <w:ind w:left="2880" w:hanging="360"/>
+      </w:pPr>
+      <w:rPr>
+        <w:rFonts w:ascii="Wingdings" w:hAnsi="Wingdings" w:hint="default"/>
+        <w:sz w:val="20"/>
+      </w:rPr>
+    </w:lvl>
+    <w:lvl w:ilvl="4" w:tentative="1">
+      <w:start w:val="1"/>
+      <w:numFmt w:val="bullet"/>
+      <w:lvlText w:val=""/>
+      <w:lvlJc w:val="left"/>
+      <w:pPr>
+        <w:tabs>
+          <w:tab w:val="num" w:pos="3600"/>
+        </w:tabs>
+        <w:ind w:left="3600" w:hanging="360"/>
+      </w:pPr>
+      <w:rPr>
+        <w:rFonts w:ascii="Wingdings" w:hAnsi="Wingdings" w:hint="default"/>
+        <w:sz w:val="20"/>
+      </w:rPr>
+    </w:lvl>
+    <w:lvl w:ilvl="5" w:tentative="1">
+      <w:start w:val="1"/>
+      <w:numFmt w:val="bullet"/>
+      <w:lvlText w:val=""/>
+      <w:lvlJc w:val="left"/>
+      <w:pPr>
+        <w:tabs>
+          <w:tab w:val="num" w:pos="4320"/>
+        </w:tabs>
+        <w:ind w:left="4320" w:hanging="360"/>
+      </w:pPr>
+      <w:rPr>
+        <w:rFonts w:ascii="Wingdings" w:hAnsi="Wingdings" w:hint="default"/>
+        <w:sz w:val="20"/>
+      </w:rPr>
+    </w:lvl>
+    <w:lvl w:ilvl="6" w:tentative="1">
+      <w:start w:val="1"/>
+      <w:numFmt w:val="bullet"/>
+      <w:lvlText w:val=""/>
+      <w:lvlJc w:val="left"/>
+      <w:pPr>
+        <w:tabs>
+          <w:tab w:val="num" w:pos="5040"/>
+        </w:tabs>
+        <w:ind w:left="5040" w:hanging="360"/>
+      </w:pPr>
+      <w:rPr>
+        <w:rFonts w:ascii="Wingdings" w:hAnsi="Wingdings" w:hint="default"/>
+        <w:sz w:val="20"/>
+      </w:rPr>
+    </w:lvl>
+    <w:lvl w:ilvl="7" w:tentative="1">
+      <w:start w:val="1"/>
+      <w:numFmt w:val="bullet"/>
+      <w:lvlText w:val=""/>
+      <w:lvlJc w:val="left"/>
+      <w:pPr>
+        <w:tabs>
+          <w:tab w:val="num" w:pos="5760"/>
+        </w:tabs>
+        <w:ind w:left="5760" w:hanging="360"/>
+      </w:pPr>
+      <w:rPr>
+        <w:rFonts w:ascii="Wingdings" w:hAnsi="Wingdings" w:hint="default"/>
+        <w:sz w:val="20"/>
+      </w:rPr>
+    </w:lvl>
+    <w:lvl w:ilvl="8" w:tentative="1">
+      <w:start w:val="1"/>
+      <w:numFmt w:val="bullet"/>
+      <w:lvlText w:val=""/>
+      <w:lvlJc w:val="left"/>
+      <w:pPr>
+        <w:tabs>
+          <w:tab w:val="num" w:pos="6480"/>
+        </w:tabs>
+        <w:ind w:left="6480" w:hanging="360"/>
+      </w:pPr>
+      <w:rPr>
+        <w:rFonts w:ascii="Wingdings" w:hAnsi="Wingdings" w:hint="default"/>
+        <w:sz w:val="20"/>
+      </w:rPr>
+    </w:lvl>
+  </w:abstractNum>
+  <w:abstractNum w:abstractNumId="2" w15:restartNumberingAfterBreak="0">
     <w:nsid w:val="14930C21"/>
     <w:multiLevelType w:val="multilevel"/>
     <w:tmpl w:val="DD2C5B3E"/>
@@ -5453,7 +6522,156 @@
       </w:rPr>
     </w:lvl>
   </w:abstractNum>
-  <w:abstractNum w:abstractNumId="2" w15:restartNumberingAfterBreak="0">
+  <w:abstractNum w:abstractNumId="3" w15:restartNumberingAfterBreak="0">
+    <w:nsid w:val="2A33172F"/>
+    <w:multiLevelType w:val="multilevel"/>
+    <w:tmpl w:val="4EE4063A"/>
+    <w:lvl w:ilvl="0">
+      <w:start w:val="1"/>
+      <w:numFmt w:val="bullet"/>
+      <w:lvlText w:val=""/>
+      <w:lvlJc w:val="left"/>
+      <w:pPr>
+        <w:tabs>
+          <w:tab w:val="num" w:pos="720"/>
+        </w:tabs>
+        <w:ind w:left="720" w:hanging="360"/>
+      </w:pPr>
+      <w:rPr>
+        <w:rFonts w:ascii="Symbol" w:hAnsi="Symbol" w:hint="default"/>
+        <w:sz w:val="20"/>
+      </w:rPr>
+    </w:lvl>
+    <w:lvl w:ilvl="1" w:tentative="1">
+      <w:start w:val="1"/>
+      <w:numFmt w:val="bullet"/>
+      <w:lvlText w:val="o"/>
+      <w:lvlJc w:val="left"/>
+      <w:pPr>
+        <w:tabs>
+          <w:tab w:val="num" w:pos="1440"/>
+        </w:tabs>
+        <w:ind w:left="1440" w:hanging="360"/>
+      </w:pPr>
+      <w:rPr>
+        <w:rFonts w:ascii="Courier New" w:hAnsi="Courier New" w:hint="default"/>
+        <w:sz w:val="20"/>
+      </w:rPr>
+    </w:lvl>
+    <w:lvl w:ilvl="2" w:tentative="1">
+      <w:start w:val="1"/>
+      <w:numFmt w:val="bullet"/>
+      <w:lvlText w:val=""/>
+      <w:lvlJc w:val="left"/>
+      <w:pPr>
+        <w:tabs>
+          <w:tab w:val="num" w:pos="2160"/>
+        </w:tabs>
+        <w:ind w:left="2160" w:hanging="360"/>
+      </w:pPr>
+      <w:rPr>
+        <w:rFonts w:ascii="Wingdings" w:hAnsi="Wingdings" w:hint="default"/>
+        <w:sz w:val="20"/>
+      </w:rPr>
+    </w:lvl>
+    <w:lvl w:ilvl="3" w:tentative="1">
+      <w:start w:val="1"/>
+      <w:numFmt w:val="bullet"/>
+      <w:lvlText w:val=""/>
+      <w:lvlJc w:val="left"/>
+      <w:pPr>
+        <w:tabs>
+          <w:tab w:val="num" w:pos="2880"/>
+        </w:tabs>
+        <w:ind w:left="2880" w:hanging="360"/>
+      </w:pPr>
+      <w:rPr>
+        <w:rFonts w:ascii="Wingdings" w:hAnsi="Wingdings" w:hint="default"/>
+        <w:sz w:val="20"/>
+      </w:rPr>
+    </w:lvl>
+    <w:lvl w:ilvl="4" w:tentative="1">
+      <w:start w:val="1"/>
+      <w:numFmt w:val="bullet"/>
+      <w:lvlText w:val=""/>
+      <w:lvlJc w:val="left"/>
+      <w:pPr>
+        <w:tabs>
+          <w:tab w:val="num" w:pos="3600"/>
+        </w:tabs>
+        <w:ind w:left="3600" w:hanging="360"/>
+      </w:pPr>
+      <w:rPr>
+        <w:rFonts w:ascii="Wingdings" w:hAnsi="Wingdings" w:hint="default"/>
+        <w:sz w:val="20"/>
+      </w:rPr>
+    </w:lvl>
+    <w:lvl w:ilvl="5" w:tentative="1">
+      <w:start w:val="1"/>
+      <w:numFmt w:val="bullet"/>
+      <w:lvlText w:val=""/>
+      <w:lvlJc w:val="left"/>
+      <w:pPr>
+        <w:tabs>
+          <w:tab w:val="num" w:pos="4320"/>
+        </w:tabs>
+        <w:ind w:left="4320" w:hanging="360"/>
+      </w:pPr>
+      <w:rPr>
+        <w:rFonts w:ascii="Wingdings" w:hAnsi="Wingdings" w:hint="default"/>
+        <w:sz w:val="20"/>
+      </w:rPr>
+    </w:lvl>
+    <w:lvl w:ilvl="6" w:tentative="1">
+      <w:start w:val="1"/>
+      <w:numFmt w:val="bullet"/>
+      <w:lvlText w:val=""/>
+      <w:lvlJc w:val="left"/>
+      <w:pPr>
+        <w:tabs>
+          <w:tab w:val="num" w:pos="5040"/>
+        </w:tabs>
+        <w:ind w:left="5040" w:hanging="360"/>
+      </w:pPr>
+      <w:rPr>
+        <w:rFonts w:ascii="Wingdings" w:hAnsi="Wingdings" w:hint="default"/>
+        <w:sz w:val="20"/>
+      </w:rPr>
+    </w:lvl>
+    <w:lvl w:ilvl="7" w:tentative="1">
+      <w:start w:val="1"/>
+      <w:numFmt w:val="bullet"/>
+      <w:lvlText w:val=""/>
+      <w:lvlJc w:val="left"/>
+      <w:pPr>
+        <w:tabs>
+          <w:tab w:val="num" w:pos="5760"/>
+        </w:tabs>
+        <w:ind w:left="5760" w:hanging="360"/>
+      </w:pPr>
+      <w:rPr>
+        <w:rFonts w:ascii="Wingdings" w:hAnsi="Wingdings" w:hint="default"/>
+        <w:sz w:val="20"/>
+      </w:rPr>
+    </w:lvl>
+    <w:lvl w:ilvl="8" w:tentative="1">
+      <w:start w:val="1"/>
+      <w:numFmt w:val="bullet"/>
+      <w:lvlText w:val=""/>
+      <w:lvlJc w:val="left"/>
+      <w:pPr>
+        <w:tabs>
+          <w:tab w:val="num" w:pos="6480"/>
+        </w:tabs>
+        <w:ind w:left="6480" w:hanging="360"/>
+      </w:pPr>
+      <w:rPr>
+        <w:rFonts w:ascii="Wingdings" w:hAnsi="Wingdings" w:hint="default"/>
+        <w:sz w:val="20"/>
+      </w:rPr>
+    </w:lvl>
+  </w:abstractNum>
+  <w:abstractNum w:abstractNumId="4" w15:restartNumberingAfterBreak="0">
     <w:nsid w:val="2BF51C92"/>
     <w:multiLevelType w:val="multilevel"/>
     <w:tmpl w:val="8F5C50C8"/>
@@ -5602,7 +6820,305 @@
       </w:rPr>
     </w:lvl>
   </w:abstractNum>
-  <w:abstractNum w:abstractNumId="3" w15:restartNumberingAfterBreak="0">
+  <w:abstractNum w:abstractNumId="5" w15:restartNumberingAfterBreak="0">
+    <w:nsid w:val="3962211C"/>
+    <w:multiLevelType w:val="multilevel"/>
+    <w:tmpl w:val="D3EA50B2"/>
+    <w:lvl w:ilvl="0">
+      <w:start w:val="1"/>
+      <w:numFmt w:val="bullet"/>
+      <w:lvlText w:val=""/>
+      <w:lvlJc w:val="left"/>
+      <w:pPr>
+        <w:tabs>
+          <w:tab w:val="num" w:pos="720"/>
+        </w:tabs>
+        <w:ind w:left="720" w:hanging="360"/>
+      </w:pPr>
+      <w:rPr>
+        <w:rFonts w:ascii="Symbol" w:hAnsi="Symbol" w:hint="default"/>
+        <w:sz w:val="20"/>
+      </w:rPr>
+    </w:lvl>
+    <w:lvl w:ilvl="1" w:tentative="1">
+      <w:start w:val="1"/>
+      <w:numFmt w:val="bullet"/>
+      <w:lvlText w:val="o"/>
+      <w:lvlJc w:val="left"/>
+      <w:pPr>
+        <w:tabs>
+          <w:tab w:val="num" w:pos="1440"/>
+        </w:tabs>
+        <w:ind w:left="1440" w:hanging="360"/>
+      </w:pPr>
+      <w:rPr>
+        <w:rFonts w:ascii="Courier New" w:hAnsi="Courier New" w:hint="default"/>
+        <w:sz w:val="20"/>
+      </w:rPr>
+    </w:lvl>
+    <w:lvl w:ilvl="2" w:tentative="1">
+      <w:start w:val="1"/>
+      <w:numFmt w:val="bullet"/>
+      <w:lvlText w:val=""/>
+      <w:lvlJc w:val="left"/>
+      <w:pPr>
+        <w:tabs>
+          <w:tab w:val="num" w:pos="2160"/>
+        </w:tabs>
+        <w:ind w:left="2160" w:hanging="360"/>
+      </w:pPr>
+      <w:rPr>
+        <w:rFonts w:ascii="Wingdings" w:hAnsi="Wingdings" w:hint="default"/>
+        <w:sz w:val="20"/>
+      </w:rPr>
+    </w:lvl>
+    <w:lvl w:ilvl="3" w:tentative="1">
+      <w:start w:val="1"/>
+      <w:numFmt w:val="bullet"/>
+      <w:lvlText w:val=""/>
+      <w:lvlJc w:val="left"/>
+      <w:pPr>
+        <w:tabs>
+          <w:tab w:val="num" w:pos="2880"/>
+        </w:tabs>
+        <w:ind w:left="2880" w:hanging="360"/>
+      </w:pPr>
+      <w:rPr>
+        <w:rFonts w:ascii="Wingdings" w:hAnsi="Wingdings" w:hint="default"/>
+        <w:sz w:val="20"/>
+      </w:rPr>
+    </w:lvl>
+    <w:lvl w:ilvl="4" w:tentative="1">
+      <w:start w:val="1"/>
+      <w:numFmt w:val="bullet"/>
+      <w:lvlText w:val=""/>
+      <w:lvlJc w:val="left"/>
+      <w:pPr>
+        <w:tabs>
+          <w:tab w:val="num" w:pos="3600"/>
+        </w:tabs>
+        <w:ind w:left="3600" w:hanging="360"/>
+      </w:pPr>
+      <w:rPr>
+        <w:rFonts w:ascii="Wingdings" w:hAnsi="Wingdings" w:hint="default"/>
+        <w:sz w:val="20"/>
+      </w:rPr>
+    </w:lvl>
+    <w:lvl w:ilvl="5" w:tentative="1">
+      <w:start w:val="1"/>
+      <w:numFmt w:val="bullet"/>
+      <w:lvlText w:val=""/>
+      <w:lvlJc w:val="left"/>
+      <w:pPr>
+        <w:tabs>
+          <w:tab w:val="num" w:pos="4320"/>
+        </w:tabs>
+        <w:ind w:left="4320" w:hanging="360"/>
+      </w:pPr>
+      <w:rPr>
+        <w:rFonts w:ascii="Wingdings" w:hAnsi="Wingdings" w:hint="default"/>
+        <w:sz w:val="20"/>
+      </w:rPr>
+    </w:lvl>
+    <w:lvl w:ilvl="6" w:tentative="1">
+      <w:start w:val="1"/>
+      <w:numFmt w:val="bullet"/>
+      <w:lvlText w:val=""/>
+      <w:lvlJc w:val="left"/>
+      <w:pPr>
+        <w:tabs>
+          <w:tab w:val="num" w:pos="5040"/>
+        </w:tabs>
+        <w:ind w:left="5040" w:hanging="360"/>
+      </w:pPr>
+      <w:rPr>
+        <w:rFonts w:ascii="Wingdings" w:hAnsi="Wingdings" w:hint="default"/>
+        <w:sz w:val="20"/>
+      </w:rPr>
+    </w:lvl>
+    <w:lvl w:ilvl="7" w:tentative="1">
+      <w:start w:val="1"/>
+      <w:numFmt w:val="bullet"/>
+      <w:lvlText w:val=""/>
+      <w:lvlJc w:val="left"/>
+      <w:pPr>
+        <w:tabs>
+          <w:tab w:val="num" w:pos="5760"/>
+        </w:tabs>
+        <w:ind w:left="5760" w:hanging="360"/>
+      </w:pPr>
+      <w:rPr>
+        <w:rFonts w:ascii="Wingdings" w:hAnsi="Wingdings" w:hint="default"/>
+        <w:sz w:val="20"/>
+      </w:rPr>
+    </w:lvl>
+    <w:lvl w:ilvl="8" w:tentative="1">
+      <w:start w:val="1"/>
+      <w:numFmt w:val="bullet"/>
+      <w:lvlText w:val=""/>
+      <w:lvlJc w:val="left"/>
+      <w:pPr>
+        <w:tabs>
+          <w:tab w:val="num" w:pos="6480"/>
+        </w:tabs>
+        <w:ind w:left="6480" w:hanging="360"/>
+      </w:pPr>
+      <w:rPr>
+        <w:rFonts w:ascii="Wingdings" w:hAnsi="Wingdings" w:hint="default"/>
+        <w:sz w:val="20"/>
+      </w:rPr>
+    </w:lvl>
+  </w:abstractNum>
+  <w:abstractNum w:abstractNumId="6" w15:restartNumberingAfterBreak="0">
+    <w:nsid w:val="3E1A2BFE"/>
+    <w:multiLevelType w:val="multilevel"/>
+    <w:tmpl w:val="EDDC9F64"/>
+    <w:lvl w:ilvl="0">
+      <w:start w:val="1"/>
+      <w:numFmt w:val="bullet"/>
+      <w:lvlText w:val=""/>
+      <w:lvlJc w:val="left"/>
+      <w:pPr>
+        <w:tabs>
+          <w:tab w:val="num" w:pos="720"/>
+        </w:tabs>
+        <w:ind w:left="720" w:hanging="360"/>
+      </w:pPr>
+      <w:rPr>
+        <w:rFonts w:ascii="Symbol" w:hAnsi="Symbol" w:hint="default"/>
+        <w:sz w:val="20"/>
+      </w:rPr>
+    </w:lvl>
+    <w:lvl w:ilvl="1" w:tentative="1">
+      <w:start w:val="1"/>
+      <w:numFmt w:val="bullet"/>
+      <w:lvlText w:val="o"/>
+      <w:lvlJc w:val="left"/>
+      <w:pPr>
+        <w:tabs>
+          <w:tab w:val="num" w:pos="1440"/>
+        </w:tabs>
+        <w:ind w:left="1440" w:hanging="360"/>
+      </w:pPr>
+      <w:rPr>
+        <w:rFonts w:ascii="Courier New" w:hAnsi="Courier New" w:hint="default"/>
+        <w:sz w:val="20"/>
+      </w:rPr>
+    </w:lvl>
+    <w:lvl w:ilvl="2" w:tentative="1">
+      <w:start w:val="1"/>
+      <w:numFmt w:val="bullet"/>
+      <w:lvlText w:val=""/>
+      <w:lvlJc w:val="left"/>
+      <w:pPr>
+        <w:tabs>
+          <w:tab w:val="num" w:pos="2160"/>
+        </w:tabs>
+        <w:ind w:left="2160" w:hanging="360"/>
+      </w:pPr>
+      <w:rPr>
+        <w:rFonts w:ascii="Wingdings" w:hAnsi="Wingdings" w:hint="default"/>
+        <w:sz w:val="20"/>
+      </w:rPr>
+    </w:lvl>
+    <w:lvl w:ilvl="3" w:tentative="1">
+      <w:start w:val="1"/>
+      <w:numFmt w:val="bullet"/>
+      <w:lvlText w:val=""/>
+      <w:lvlJc w:val="left"/>
+      <w:pPr>
+        <w:tabs>
+          <w:tab w:val="num" w:pos="2880"/>
+        </w:tabs>
+        <w:ind w:left="2880" w:hanging="360"/>
+      </w:pPr>
+      <w:rPr>
+        <w:rFonts w:ascii="Wingdings" w:hAnsi="Wingdings" w:hint="default"/>
+        <w:sz w:val="20"/>
+      </w:rPr>
+    </w:lvl>
+    <w:lvl w:ilvl="4" w:tentative="1">
+      <w:start w:val="1"/>
+      <w:numFmt w:val="bullet"/>
+      <w:lvlText w:val=""/>
+      <w:lvlJc w:val="left"/>
+      <w:pPr>
+        <w:tabs>
+          <w:tab w:val="num" w:pos="3600"/>
+        </w:tabs>
+        <w:ind w:left="3600" w:hanging="360"/>
+      </w:pPr>
+      <w:rPr>
+        <w:rFonts w:ascii="Wingdings" w:hAnsi="Wingdings" w:hint="default"/>
+        <w:sz w:val="20"/>
+      </w:rPr>
+    </w:lvl>
+    <w:lvl w:ilvl="5" w:tentative="1">
+      <w:start w:val="1"/>
+      <w:numFmt w:val="bullet"/>
+      <w:lvlText w:val=""/>
+      <w:lvlJc w:val="left"/>
+      <w:pPr>
+        <w:tabs>
+          <w:tab w:val="num" w:pos="4320"/>
+        </w:tabs>
+        <w:ind w:left="4320" w:hanging="360"/>
+      </w:pPr>
+      <w:rPr>
+        <w:rFonts w:ascii="Wingdings" w:hAnsi="Wingdings" w:hint="default"/>
+        <w:sz w:val="20"/>
+      </w:rPr>
+    </w:lvl>
+    <w:lvl w:ilvl="6" w:tentative="1">
+      <w:start w:val="1"/>
+      <w:numFmt w:val="bullet"/>
+      <w:lvlText w:val=""/>
+      <w:lvlJc w:val="left"/>
+      <w:pPr>
+        <w:tabs>
+          <w:tab w:val="num" w:pos="5040"/>
+        </w:tabs>
+        <w:ind w:left="5040" w:hanging="360"/>
+      </w:pPr>
+      <w:rPr>
+        <w:rFonts w:ascii="Wingdings" w:hAnsi="Wingdings" w:hint="default"/>
+        <w:sz w:val="20"/>
+      </w:rPr>
+    </w:lvl>
+    <w:lvl w:ilvl="7" w:tentative="1">
+      <w:start w:val="1"/>
+      <w:numFmt w:val="bullet"/>
+      <w:lvlText w:val=""/>
+      <w:lvlJc w:val="left"/>
+      <w:pPr>
+        <w:tabs>
+          <w:tab w:val="num" w:pos="5760"/>
+        </w:tabs>
+        <w:ind w:left="5760" w:hanging="360"/>
+      </w:pPr>
+      <w:rPr>
+        <w:rFonts w:ascii="Wingdings" w:hAnsi="Wingdings" w:hint="default"/>
+        <w:sz w:val="20"/>
+      </w:rPr>
+    </w:lvl>
+    <w:lvl w:ilvl="8" w:tentative="1">
+      <w:start w:val="1"/>
+      <w:numFmt w:val="bullet"/>
+      <w:lvlText w:val=""/>
+      <w:lvlJc w:val="left"/>
+      <w:pPr>
+        <w:tabs>
+          <w:tab w:val="num" w:pos="6480"/>
+        </w:tabs>
+        <w:ind w:left="6480" w:hanging="360"/>
+      </w:pPr>
+      <w:rPr>
+        <w:rFonts w:ascii="Wingdings" w:hAnsi="Wingdings" w:hint="default"/>
+        <w:sz w:val="20"/>
+      </w:rPr>
+    </w:lvl>
+  </w:abstractNum>
+  <w:abstractNum w:abstractNumId="7" w15:restartNumberingAfterBreak="0">
     <w:nsid w:val="45D37485"/>
     <w:multiLevelType w:val="hybridMultilevel"/>
     <w:tmpl w:val="0FBCDE32"/>
@@ -5715,7 +7231,7 @@
       </w:rPr>
     </w:lvl>
   </w:abstractNum>
-  <w:abstractNum w:abstractNumId="4" w15:restartNumberingAfterBreak="0">
+  <w:abstractNum w:abstractNumId="8" w15:restartNumberingAfterBreak="0">
     <w:nsid w:val="47EA1A93"/>
     <w:multiLevelType w:val="multilevel"/>
     <w:tmpl w:val="5EF674B8"/>
@@ -5864,7 +7380,156 @@
       </w:rPr>
     </w:lvl>
   </w:abstractNum>
-  <w:abstractNum w:abstractNumId="5" w15:restartNumberingAfterBreak="0">
+  <w:abstractNum w:abstractNumId="9" w15:restartNumberingAfterBreak="0">
+    <w:nsid w:val="66523318"/>
+    <w:multiLevelType w:val="multilevel"/>
+    <w:tmpl w:val="B34C1012"/>
+    <w:lvl w:ilvl="0">
+      <w:start w:val="1"/>
+      <w:numFmt w:val="bullet"/>
+      <w:lvlText w:val=""/>
+      <w:lvlJc w:val="left"/>
+      <w:pPr>
+        <w:tabs>
+          <w:tab w:val="num" w:pos="720"/>
+        </w:tabs>
+        <w:ind w:left="720" w:hanging="360"/>
+      </w:pPr>
+      <w:rPr>
+        <w:rFonts w:ascii="Symbol" w:hAnsi="Symbol" w:hint="default"/>
+        <w:sz w:val="20"/>
+      </w:rPr>
+    </w:lvl>
+    <w:lvl w:ilvl="1" w:tentative="1">
+      <w:start w:val="1"/>
+      <w:numFmt w:val="bullet"/>
+      <w:lvlText w:val="o"/>
+      <w:lvlJc w:val="left"/>
+      <w:pPr>
+        <w:tabs>
+          <w:tab w:val="num" w:pos="1440"/>
+        </w:tabs>
+        <w:ind w:left="1440" w:hanging="360"/>
+      </w:pPr>
+      <w:rPr>
+        <w:rFonts w:ascii="Courier New" w:hAnsi="Courier New" w:hint="default"/>
+        <w:sz w:val="20"/>
+      </w:rPr>
+    </w:lvl>
+    <w:lvl w:ilvl="2" w:tentative="1">
+      <w:start w:val="1"/>
+      <w:numFmt w:val="bullet"/>
+      <w:lvlText w:val=""/>
+      <w:lvlJc w:val="left"/>
+      <w:pPr>
+        <w:tabs>
+          <w:tab w:val="num" w:pos="2160"/>
+        </w:tabs>
+        <w:ind w:left="2160" w:hanging="360"/>
+      </w:pPr>
+      <w:rPr>
+        <w:rFonts w:ascii="Wingdings" w:hAnsi="Wingdings" w:hint="default"/>
+        <w:sz w:val="20"/>
+      </w:rPr>
+    </w:lvl>
+    <w:lvl w:ilvl="3" w:tentative="1">
+      <w:start w:val="1"/>
+      <w:numFmt w:val="bullet"/>
+      <w:lvlText w:val=""/>
+      <w:lvlJc w:val="left"/>
+      <w:pPr>
+        <w:tabs>
+          <w:tab w:val="num" w:pos="2880"/>
+        </w:tabs>
+        <w:ind w:left="2880" w:hanging="360"/>
+      </w:pPr>
+      <w:rPr>
+        <w:rFonts w:ascii="Wingdings" w:hAnsi="Wingdings" w:hint="default"/>
+        <w:sz w:val="20"/>
+      </w:rPr>
+    </w:lvl>
+    <w:lvl w:ilvl="4" w:tentative="1">
+      <w:start w:val="1"/>
+      <w:numFmt w:val="bullet"/>
+      <w:lvlText w:val=""/>
+      <w:lvlJc w:val="left"/>
+      <w:pPr>
+        <w:tabs>
+          <w:tab w:val="num" w:pos="3600"/>
+        </w:tabs>
+        <w:ind w:left="3600" w:hanging="360"/>
+      </w:pPr>
+      <w:rPr>
+        <w:rFonts w:ascii="Wingdings" w:hAnsi="Wingdings" w:hint="default"/>
+        <w:sz w:val="20"/>
+      </w:rPr>
+    </w:lvl>
+    <w:lvl w:ilvl="5" w:tentative="1">
+      <w:start w:val="1"/>
+      <w:numFmt w:val="bullet"/>
+      <w:lvlText w:val=""/>
+      <w:lvlJc w:val="left"/>
+      <w:pPr>
+        <w:tabs>
+          <w:tab w:val="num" w:pos="4320"/>
+        </w:tabs>
+        <w:ind w:left="4320" w:hanging="360"/>
+      </w:pPr>
+      <w:rPr>
+        <w:rFonts w:ascii="Wingdings" w:hAnsi="Wingdings" w:hint="default"/>
+        <w:sz w:val="20"/>
+      </w:rPr>
+    </w:lvl>
+    <w:lvl w:ilvl="6" w:tentative="1">
+      <w:start w:val="1"/>
+      <w:numFmt w:val="bullet"/>
+      <w:lvlText w:val=""/>
+      <w:lvlJc w:val="left"/>
+      <w:pPr>
+        <w:tabs>
+          <w:tab w:val="num" w:pos="5040"/>
+        </w:tabs>
+        <w:ind w:left="5040" w:hanging="360"/>
+      </w:pPr>
+      <w:rPr>
+        <w:rFonts w:ascii="Wingdings" w:hAnsi="Wingdings" w:hint="default"/>
+        <w:sz w:val="20"/>
+      </w:rPr>
+    </w:lvl>
+    <w:lvl w:ilvl="7" w:tentative="1">
+      <w:start w:val="1"/>
+      <w:numFmt w:val="bullet"/>
+      <w:lvlText w:val=""/>
+      <w:lvlJc w:val="left"/>
+      <w:pPr>
+        <w:tabs>
+          <w:tab w:val="num" w:pos="5760"/>
+        </w:tabs>
+        <w:ind w:left="5760" w:hanging="360"/>
+      </w:pPr>
+      <w:rPr>
+        <w:rFonts w:ascii="Wingdings" w:hAnsi="Wingdings" w:hint="default"/>
+        <w:sz w:val="20"/>
+      </w:rPr>
+    </w:lvl>
+    <w:lvl w:ilvl="8" w:tentative="1">
+      <w:start w:val="1"/>
+      <w:numFmt w:val="bullet"/>
+      <w:lvlText w:val=""/>
+      <w:lvlJc w:val="left"/>
+      <w:pPr>
+        <w:tabs>
+          <w:tab w:val="num" w:pos="6480"/>
+        </w:tabs>
+        <w:ind w:left="6480" w:hanging="360"/>
+      </w:pPr>
+      <w:rPr>
+        <w:rFonts w:ascii="Wingdings" w:hAnsi="Wingdings" w:hint="default"/>
+        <w:sz w:val="20"/>
+      </w:rPr>
+    </w:lvl>
+  </w:abstractNum>
+  <w:abstractNum w:abstractNumId="10" w15:restartNumberingAfterBreak="0">
     <w:nsid w:val="6A8A7D45"/>
     <w:multiLevelType w:val="multilevel"/>
     <w:tmpl w:val="2E72109A"/>
@@ -6013,7 +7678,7 @@
       </w:rPr>
     </w:lvl>
   </w:abstractNum>
-  <w:abstractNum w:abstractNumId="6" w15:restartNumberingAfterBreak="0">
+  <w:abstractNum w:abstractNumId="11" w15:restartNumberingAfterBreak="0">
     <w:nsid w:val="70890C93"/>
     <w:multiLevelType w:val="multilevel"/>
     <w:tmpl w:val="2D381E6C"/>
@@ -6162,7 +7827,7 @@
       </w:rPr>
     </w:lvl>
   </w:abstractNum>
-  <w:abstractNum w:abstractNumId="7" w15:restartNumberingAfterBreak="0">
+  <w:abstractNum w:abstractNumId="12" w15:restartNumberingAfterBreak="0">
     <w:nsid w:val="70D44F24"/>
     <w:multiLevelType w:val="hybridMultilevel"/>
     <w:tmpl w:val="A8BE01A0"/>
@@ -6275,7 +7940,7 @@
       </w:rPr>
     </w:lvl>
   </w:abstractNum>
-  <w:abstractNum w:abstractNumId="8" w15:restartNumberingAfterBreak="0">
+  <w:abstractNum w:abstractNumId="13" w15:restartNumberingAfterBreak="0">
     <w:nsid w:val="7A5F58A8"/>
     <w:multiLevelType w:val="multilevel"/>
     <w:tmpl w:val="E59C42FE"/>
@@ -6425,31 +8090,46 @@
     </w:lvl>
   </w:abstractNum>
   <w:num w:numId="1" w16cid:durableId="720716093">
-    <w:abstractNumId w:val="4"/>
+    <w:abstractNumId w:val="8"/>
   </w:num>
   <w:num w:numId="2" w16cid:durableId="1565094768">
+    <w:abstractNumId w:val="12"/>
+  </w:num>
+  <w:num w:numId="3" w16cid:durableId="1553081679">
+    <w:abstractNumId w:val="2"/>
+  </w:num>
+  <w:num w:numId="4" w16cid:durableId="1931426500">
     <w:abstractNumId w:val="7"/>
   </w:num>
-  <w:num w:numId="3" w16cid:durableId="1553081679">
-    <w:abstractNumId w:val="1"/>
-  </w:num>
-  <w:num w:numId="4" w16cid:durableId="1931426500">
-    <w:abstractNumId w:val="3"/>
-  </w:num>
   <w:num w:numId="5" w16cid:durableId="867908142">
-    <w:abstractNumId w:val="5"/>
+    <w:abstractNumId w:val="10"/>
   </w:num>
   <w:num w:numId="6" w16cid:durableId="1192494456">
     <w:abstractNumId w:val="0"/>
   </w:num>
   <w:num w:numId="7" w16cid:durableId="1049501997">
-    <w:abstractNumId w:val="8"/>
+    <w:abstractNumId w:val="13"/>
   </w:num>
   <w:num w:numId="8" w16cid:durableId="1334062879">
+    <w:abstractNumId w:val="11"/>
+  </w:num>
+  <w:num w:numId="9" w16cid:durableId="1246109169">
+    <w:abstractNumId w:val="4"/>
+  </w:num>
+  <w:num w:numId="10" w16cid:durableId="2143571026">
+    <w:abstractNumId w:val="1"/>
+  </w:num>
+  <w:num w:numId="11" w16cid:durableId="1783574041">
+    <w:abstractNumId w:val="9"/>
+  </w:num>
+  <w:num w:numId="12" w16cid:durableId="544870176">
     <w:abstractNumId w:val="6"/>
   </w:num>
-  <w:num w:numId="9" w16cid:durableId="1246109169">
-    <w:abstractNumId w:val="2"/>
+  <w:num w:numId="13" w16cid:durableId="541140269">
+    <w:abstractNumId w:val="3"/>
+  </w:num>
+  <w:num w:numId="14" w16cid:durableId="715354879">
+    <w:abstractNumId w:val="5"/>
   </w:num>
 </w:numbering>
 </file>

</xml_diff>